<commit_message>
Update FromTheFarm Planning & Design.docx
Completed Section 7
</commit_message>
<xml_diff>
--- a/Documentation/FromTheFarm Planning & Design.docx
+++ b/Documentation/FromTheFarm Planning & Design.docx
@@ -397,10 +397,7 @@
         </w:numPr>
       </w:pPr>
       <w:r>
-        <w:t>The API must run the matching algorithm centrally rather than on-device, because a match can only be evaluated against the full, current set of listings and demand requests across all users — no single device has visibility into anyone else's data. Matching is triggered whenever a new listing or demand request is created or updated, and results are persisted so the feed does not need to be recomputed on every read</w:t>
-      </w:r>
-      <w:r>
-        <w:t>.</w:t>
+        <w:t>The API must run the matching algorithm centrally rather than on-device, because a match can only be evaluated against the full, current set of listings and demand requests across all users — no single device has visibility into anyone else's data. Matching is triggered whenever a new listing or demand request is created or updated, and results are persisted so the feed does not need to be recomputed on every read.</w:t>
       </w:r>
     </w:p>
     <w:p/>
@@ -944,31 +941,13 @@
         <w:pStyle w:val="Heading2"/>
       </w:pPr>
       <w:r>
-        <w:t>5.1</w:t>
-      </w:r>
-      <w:r>
-        <w:t xml:space="preserve">. </w:t>
-      </w:r>
-      <w:r>
-        <w:t>Structural plan</w:t>
+        <w:t xml:space="preserve">5.1. Structural plan</w:t>
       </w:r>
     </w:p>
     <w:p>
       <w:r>
         <w:lastRenderedPageBreak/>
-        <w:t>The custom REST API is the single source of truth for all shared data in FromTheFarm: farmer and buyer profiles, produce listings, demand requests, and the matches generated between them. It is responsible for all server-side validation, for running the matching algorithm across the full dataset (a calculation that cannot be performed reliably on a single device, since no device has visibility into other users' listings or demand), for gating contact information until a match is confirmed, and for reconciling records created offline once a device reconnects. The Android app itself never writes directly to the database</w:t>
-      </w:r>
-      <w:r>
-        <w:t xml:space="preserve">, as </w:t>
-      </w:r>
-      <w:r>
-        <w:t>every write passes through the API</w:t>
-      </w:r>
-      <w:r>
-        <w:t>. W</w:t>
-      </w:r>
-      <w:r>
-        <w:t>hich is also responsible for triggering push notifications via Firebase Cloud Messaging whenever a new match is found.</w:t>
+        <w:t xml:space="preserve">The custom REST API is the single source of truth for all shared data in FromTheFarm: farmer and buyer profiles, produce listings, demand requests, and the matches generated between them. It is responsible for all server-side validation, for running the matching algorithm across the full dataset (a calculation that cannot be performed reliably on a single device, since no device has visibility into other users' listings or demand), for gating contact information until a match is confirmed, and for reconciling records created offline once a device reconnects. The Android app itself never writes directly to the database, as every write passes through the API. Which is also responsible for triggering push notifications via Firebase Cloud Messaging whenever a new match is found.</w:t>
       </w:r>
     </w:p>
     <w:p/>
@@ -977,36 +956,12 @@
         <w:pStyle w:val="Heading2"/>
       </w:pPr>
       <w:r>
-        <w:t>5.2</w:t>
-      </w:r>
-      <w:r>
-        <w:t xml:space="preserve">. </w:t>
-      </w:r>
-      <w:r>
-        <w:t>Development stack and hosting</w:t>
-      </w:r>
-    </w:p>
-    <w:p>
-      <w:r>
-        <w:t xml:space="preserve">The API is built using ASP.NET Core Web API (C#), hosted on Azure App Service using Azure for Students. Data is stored in Azure Cosmos DB, a NoSQL document database, chosen over a relational store because the app's core entities </w:t>
-      </w:r>
-      <w:r>
-        <w:t>(</w:t>
-      </w:r>
-      <w:r>
-        <w:t>listings, demand requests, and the matches between them</w:t>
-      </w:r>
-      <w:r>
-        <w:t xml:space="preserve">) </w:t>
-      </w:r>
-      <w:r>
-        <w:t xml:space="preserve">read naturally as self-contained JSON documents rather than normalised relational rows, and because Cosmos DB directly satisfies the NoSQL requirement specified for the final </w:t>
-      </w:r>
-      <w:r>
-        <w:t>stages of development</w:t>
-      </w:r>
-      <w:r>
-        <w:t>, avoiding a later migration. Authentication is handled by Firebase Authentication using Google Sign-In; the API validates the Firebase-issued ID token on every request rather than managing credentials itself.</w:t>
+        <w:t xml:space="preserve">5.2. Development stack and hosting</w:t>
+      </w:r>
+    </w:p>
+    <w:p>
+      <w:r>
+        <w:t xml:space="preserve">The API is built using ASP.NET Core Web API (C#), hosted on Azure App Service using Azure for Students. Data is stored in Azure Cosmos DB, a NoSQL document database, chosen over a relational store because the app's core entities (listings, demand requests, and the matches between them) read naturally as self-contained JSON documents rather than normalised relational rows, and because Cosmos DB directly satisfies the NoSQL requirement specified for the final stages of development, avoiding a later migration. Authentication is handled by Firebase Authentication using Google Sign-In; the API validates the Firebase-issued ID token on every request rather than managing credentials itself.</w:t>
       </w:r>
     </w:p>
     <w:p/>
@@ -1015,13 +970,7 @@
         <w:pStyle w:val="Heading2"/>
       </w:pPr>
       <w:r>
-        <w:t>5.3</w:t>
-      </w:r>
-      <w:r>
-        <w:t xml:space="preserve">. </w:t>
-      </w:r>
-      <w:r>
-        <w:t>Endpoint specification</w:t>
+        <w:t xml:space="preserve">5.3. Endpoint specification</w:t>
       </w:r>
     </w:p>
     <w:p>
@@ -1036,13 +985,7 @@
         <w:t>/api/v1</w:t>
       </w:r>
       <w:r>
-        <w:t xml:space="preserve"> and exchange JSON. Every request (aside from the initial session exchange) requires a valid Firebase ID token in the Authorization header, from which the API derives the calling user's identity</w:t>
-      </w:r>
-      <w:r>
-        <w:t>. N</w:t>
-      </w:r>
-      <w:r>
-        <w:t>o endpoint accepts another user's ID as a path parameter, to prevent one user querying another's private data.</w:t>
+        <w:t xml:space="preserve"> and exchange JSON. Every request (aside from the initial session exchange) requires a valid Firebase ID token in the Authorization header, from which the API derives the calling user's identity. No endpoint accepts another user's ID as a path parameter, to prevent one user querying another's private data.</w:t>
       </w:r>
     </w:p>
     <w:p/>
@@ -1103,10 +1046,7 @@
         <w:t>deviceLanguage</w:t>
       </w:r>
       <w:r>
-        <w:t xml:space="preserve"> (String, optional — used only if no profile exists yet)</w:t>
-      </w:r>
-      <w:r>
-        <w:t>.</w:t>
+        <w:t xml:space="preserve"> (String, optional — used only if no profile exists yet).</w:t>
       </w:r>
     </w:p>
     <w:p>
@@ -1188,10 +1128,7 @@
         <w:t>searchRadiusKm</w:t>
       </w:r>
       <w:r>
-        <w:t xml:space="preserve"> (Integer)</w:t>
-      </w:r>
-      <w:r>
-        <w:t>.</w:t>
+        <w:t xml:space="preserve"> (Integer).</w:t>
       </w:r>
     </w:p>
     <w:p>
@@ -1317,10 +1254,7 @@
         <w:t>createdAt</w:t>
       </w:r>
       <w:r>
-        <w:t xml:space="preserve"> (DateTime)</w:t>
-      </w:r>
-      <w:r>
-        <w:t>.</w:t>
+        <w:t xml:space="preserve"> (DateTime).</w:t>
       </w:r>
     </w:p>
     <w:p>
@@ -1382,7 +1316,7 @@
         <w:t>searchRadiusKm</w:t>
       </w:r>
       <w:r>
-        <w:t xml:space="preserve"> (Integer, 1–100), </w:t>
+        <w:t xml:space="preserve"> (Integer, 1–50), </w:t>
       </w:r>
       <w:r>
         <w:rPr>
@@ -1421,14 +1355,7 @@
           <w:b/>
           <w:bCs/>
         </w:rPr>
-        <w:t>GET /users/me</w:t>
-      </w:r>
-      <w:r>
-        <w:rPr>
-          <w:b/>
-          <w:bCs/>
-        </w:rPr>
-        <w:t>.</w:t>
+        <w:t>GET /users/me.</w:t>
       </w:r>
     </w:p>
     <w:p>
@@ -1475,10 +1402,7 @@
       </w:pPr>
       <w:r>
         <w:lastRenderedPageBreak/>
-        <w:t>Request Body</w:t>
-      </w:r>
-      <w:r>
-        <w:t xml:space="preserve">: </w:t>
+        <w:t xml:space="preserve">Request Body: </w:t>
       </w:r>
       <w:r>
         <w:rPr>
@@ -1724,10 +1648,7 @@
         </w:numPr>
       </w:pPr>
       <w:r>
-        <w:t>Response (201 Created): full listing object</w:t>
-      </w:r>
-      <w:r>
-        <w:t>.</w:t>
+        <w:t>Response (201 Created): full listing object.</w:t>
       </w:r>
     </w:p>
     <w:p>
@@ -1823,10 +1744,7 @@
         </w:numPr>
       </w:pPr>
       <w:r>
-        <w:t>Request Body</w:t>
-      </w:r>
-      <w:r>
-        <w:t xml:space="preserve">: </w:t>
+        <w:t xml:space="preserve">Request Body: </w:t>
       </w:r>
       <w:r>
         <w:rPr>
@@ -1948,10 +1866,7 @@
         <w:t>createdAt</w:t>
       </w:r>
       <w:r>
-        <w:t xml:space="preserve"> (DateTime)</w:t>
-      </w:r>
-      <w:r>
-        <w:t>.</w:t>
+        <w:t xml:space="preserve"> (DateTime).</w:t>
       </w:r>
     </w:p>
     <w:p>
@@ -2043,10 +1958,7 @@
         <w:t>location</w:t>
       </w:r>
       <w:r>
-        <w:t xml:space="preserve"> (Double latitude/longitude, required)</w:t>
-      </w:r>
-      <w:r>
-        <w:t>.</w:t>
+        <w:t xml:space="preserve"> (Double latitude/longitude, required).</w:t>
       </w:r>
     </w:p>
     <w:p>
@@ -2058,10 +1970,7 @@
         </w:numPr>
       </w:pPr>
       <w:r>
-        <w:t>Response (201 Created): full demand object</w:t>
-      </w:r>
-      <w:r>
-        <w:t>.</w:t>
+        <w:t>Response (201 Created): full demand object.</w:t>
       </w:r>
     </w:p>
     <w:p>
@@ -2069,13 +1978,7 @@
         <w:pStyle w:val="Heading4"/>
       </w:pPr>
       <w:r>
-        <w:t>PUT /demands/{id}</w:t>
-      </w:r>
-      <w:r>
-        <w:t xml:space="preserve"> </w:t>
-      </w:r>
-      <w:r>
-        <w:t>and DELETE /demands/{id}</w:t>
+        <w:t xml:space="preserve">PUT /demands/{id} and DELETE /demands/{id}</w:t>
       </w:r>
     </w:p>
     <w:p>
@@ -2119,19 +2022,7 @@
         </w:numPr>
       </w:pPr>
       <w:r>
-        <w:t>Purpose: Returns the ranked match feed for the authenticated user</w:t>
-      </w:r>
-      <w:r>
-        <w:t>.</w:t>
-      </w:r>
-      <w:r>
-        <w:t xml:space="preserve"> </w:t>
-      </w:r>
-      <w:r>
-        <w:t>A</w:t>
-      </w:r>
-      <w:r>
-        <w:t xml:space="preserve"> farmer sees demand matches for their listings, a buyer sees listing matches for their demand requests. The user is identified from the authentication token rather than a path parameter, a deliberate refinement over a userId-in-URL approach, since accepting another user's ID in the path would allow one user to view another's private match feed. </w:t>
+        <w:t xml:space="preserve">Purpose: Returns the ranked match feed for the authenticated user. A farmer sees demand matches for their listings, a buyer sees listing matches for their demand requests. The user is identified from the authentication token rather than a path parameter, a deliberate refinement over a userId-in-URL approach, since accepting another user's ID in the path would allow one user to view another's private match feed. </w:t>
       </w:r>
     </w:p>
     <w:p>
@@ -2223,10 +2114,7 @@
         <w:t>status</w:t>
       </w:r>
       <w:r>
-        <w:t xml:space="preserve"> (String: "Suggested", "Confirmed", "Completed")</w:t>
-      </w:r>
-      <w:r>
-        <w:t>.</w:t>
+        <w:t xml:space="preserve"> (String: "Suggested", "Confirmed", "Completed").</w:t>
       </w:r>
     </w:p>
     <w:p>
@@ -2439,10 +2327,7 @@
     </w:p>
     <w:p>
       <w:r>
-        <w:t>Request Body</w:t>
-      </w:r>
-      <w:r>
-        <w:t xml:space="preserve">: </w:t>
+        <w:t xml:space="preserve">Request Body: </w:t>
       </w:r>
       <w:r>
         <w:rPr>
@@ -2497,10 +2382,7 @@
         <w:t>listingIds</w:t>
       </w:r>
       <w:r>
-        <w:t xml:space="preserve"> (array of Guid)</w:t>
-      </w:r>
-      <w:r>
-        <w:t>.</w:t>
+        <w:t xml:space="preserve"> (array of Guid).</w:t>
       </w:r>
     </w:p>
     <w:p/>
@@ -2659,37 +2541,7 @@
           <w:sz w:val="18"/>
           <w:szCs w:val="18"/>
         </w:rPr>
-        <w:t>Figure</w:t>
-      </w:r>
-      <w:r>
-        <w:rPr>
-          <w:i/>
-          <w:iCs/>
-          <w:color w:val="666666"/>
-          <w:sz w:val="18"/>
-          <w:szCs w:val="18"/>
-        </w:rPr>
-        <w:t xml:space="preserve"> 3</w:t>
-      </w:r>
-      <w:r>
-        <w:rPr>
-          <w:i/>
-          <w:iCs/>
-          <w:color w:val="666666"/>
-          <w:sz w:val="18"/>
-          <w:szCs w:val="18"/>
-        </w:rPr>
-        <w:t xml:space="preserve"> — </w:t>
-      </w:r>
-      <w:r>
-        <w:rPr>
-          <w:i/>
-          <w:iCs/>
-          <w:color w:val="666666"/>
-          <w:sz w:val="18"/>
-          <w:szCs w:val="18"/>
-        </w:rPr>
-        <w:t>FromTheFarm System Architecture</w:t>
+        <w:t xml:space="preserve">Figure 3 — FromTheFarm System Architecture</w:t>
       </w:r>
     </w:p>
     <w:p>
@@ -2768,27 +2620,45 @@
           <w:sz w:val="18"/>
           <w:szCs w:val="18"/>
         </w:rPr>
-        <w:t xml:space="preserve">Figure 3 — FromTheFarm </w:t>
-      </w:r>
+        <w:t xml:space="preserve">Figure 3 — FromTheFarm Sequence Diagram</w:t>
+      </w:r>
+    </w:p>
+    <w:p>
+      <w:pPr>
+        <w:pStyle w:val="Heading1"/>
+        <w:spacing w:before="340" w:after="140"/>
+      </w:pPr>
+      <w:r>
+        <w:t>7. Data Models and Schema Definitions</w:t>
+      </w:r>
+    </w:p>
+    <w:p>
+      <w:r>
+        <w:t xml:space="preserve">The application persists five entities, each as its own Cosmos DB container: Users, Listings, Demands, Matches, and Ratings. Because Cosmos DB is a NoSQL document store, there's no concept of foreign keys or joining across containers — documents are read whole. If one document needs data that technically belongs to another container, that data gets copied in at write time instead of looked up later. Partition keys are listed under each heading below. Every field also has an explicit type, so both the API and the client can validate against the same schema. All of this is taken directly from the REST API's endpoint specification in Section 5.3.</w:t>
+      </w:r>
+    </w:p>
+    <w:p>
+      <w:pPr>
+        <w:pStyle w:val="Heading2"/>
+        <w:spacing w:before="240" w:after="110"/>
+      </w:pPr>
+      <w:r>
+        <w:t>7.1 Users</w:t>
+      </w:r>
+    </w:p>
+    <w:p>
+      <w:pPr>
+        <w:spacing w:after="120"/>
+      </w:pPr>
       <w:r>
         <w:rPr>
           <w:i/>
           <w:iCs/>
-          <w:color w:val="666666"/>
-          <w:sz w:val="18"/>
-          <w:szCs w:val="18"/>
-        </w:rPr>
-        <w:t>Sequence Diagram</w:t>
-      </w:r>
-    </w:p>
-    <w:p>
-      <w:pPr>
-        <w:pStyle w:val="Heading1"/>
-        <w:spacing w:before="340" w:after="140"/>
-      </w:pPr>
-      <w:r>
-        <w:lastRenderedPageBreak/>
-        <w:t>7. Data Models and Schema Definitions</w:t>
+          <w:color w:val="595959"/>
+          <w:sz w:val="20"/>
+          <w:szCs w:val="20"/>
+        </w:rPr>
+        <w:t xml:space="preserve">Partition key: userId.</w:t>
       </w:r>
     </w:p>
     <w:tbl>
@@ -2803,70 +2673,1931 @@
           <w:insideV w:val="single" w:sz="4" w:space="0" w:color="auto"/>
         </w:tblBorders>
         <w:tblCellMar>
-          <w:left w:w="10" w:type="dxa"/>
-          <w:right w:w="10" w:type="dxa"/>
+          <w:left w:w="80" w:type="dxa"/>
+          <w:right w:w="80" w:type="dxa"/>
         </w:tblCellMar>
         <w:tblLook w:val="04A0" w:firstRow="1" w:lastRow="0" w:firstColumn="1" w:lastColumn="0" w:noHBand="0" w:noVBand="1"/>
       </w:tblPr>
       <w:tblGrid>
-        <w:gridCol w:w="9640"/>
+        <w:gridCol w:w="1700"/>
+        <w:gridCol w:w="2300"/>
+        <w:gridCol w:w="5640"/>
       </w:tblGrid>
       <w:tr>
         <w:tc>
           <w:tcPr>
-            <w:tcW w:w="9640" w:type="dxa"/>
-            <w:shd w:val="clear" w:color="auto" w:fill="FFF6E5"/>
-          </w:tcPr>
-          <w:p>
-            <w:pPr>
-              <w:spacing w:after="80"/>
-            </w:pPr>
+            <w:tcW w:w="1700" w:type="dxa"/>
+            <w:shd w:val="clear" w:color="auto" w:fill="D9D9D9"/>
+          </w:tcPr>
+          <w:p>
             <w:r>
               <w:rPr>
                 <w:b/>
                 <w:bCs/>
-                <w:i/>
-                <w:iCs/>
-                <w:color w:val="8A5A00"/>
-                <w:sz w:val="20"/>
-                <w:szCs w:val="20"/>
               </w:rPr>
-              <w:t>TO COMPLETE — Greg</w:t>
-            </w:r>
-          </w:p>
-          <w:p>
-            <w:pPr>
-              <w:spacing w:after="60"/>
-            </w:pPr>
+              <w:t xml:space="preserve">Field</w:t>
+            </w:r>
+          </w:p>
+        </w:tc>
+        <w:tc>
+          <w:tcPr>
+            <w:tcW w:w="2300" w:type="dxa"/>
+            <w:shd w:val="clear" w:color="auto" w:fill="D9D9D9"/>
+          </w:tcPr>
+          <w:p>
             <w:r>
               <w:rPr>
-                <w:i/>
-                <w:iCs/>
-                <w:color w:val="5A4A2A"/>
-                <w:sz w:val="20"/>
-                <w:szCs w:val="20"/>
+                <w:b/>
+                <w:bCs/>
               </w:rPr>
-              <w:t>List every piece of data the app needs to capture and persist — user profile, listing, demand request, match — with explicit data types (String, Int, Boolean, Date, etc.) for every field.</w:t>
-            </w:r>
-          </w:p>
-          <w:p>
-            <w:pPr>
-              <w:spacing w:after="60"/>
-            </w:pPr>
+              <w:t xml:space="preserve">Type</w:t>
+            </w:r>
+          </w:p>
+        </w:tc>
+        <w:tc>
+          <w:tcPr>
+            <w:tcW w:w="5640" w:type="dxa"/>
+            <w:shd w:val="clear" w:color="auto" w:fill="D9D9D9"/>
+          </w:tcPr>
+          <w:p>
             <w:r>
               <w:rPr>
-                <w:i/>
-                <w:iCs/>
-                <w:color w:val="5A4A2A"/>
-                <w:sz w:val="20"/>
-                <w:szCs w:val="20"/>
+                <w:b/>
+                <w:bCs/>
               </w:rPr>
-              <w:t>Keep this in sync with Kaehil's endpoint schemas once finalised — these should describe the same fields.</w:t>
+              <w:t xml:space="preserve">Notes</w:t>
+            </w:r>
+          </w:p>
+        </w:tc>
+      </w:tr>
+      <w:tr>
+        <w:tc>
+          <w:tcPr>
+            <w:tcW w:w="1700" w:type="dxa"/>
+          </w:tcPr>
+          <w:p>
+            <w:r>
+              <w:rPr>
+                <w:b/>
+                <w:bCs/>
+              </w:rPr>
+              <w:t xml:space="preserve">userId</w:t>
+            </w:r>
+          </w:p>
+        </w:tc>
+        <w:tc>
+          <w:tcPr>
+            <w:tcW w:w="2300" w:type="dxa"/>
+          </w:tcPr>
+          <w:p>
+            <w:r>
+              <w:t xml:space="preserve">Guid</w:t>
+            </w:r>
+          </w:p>
+        </w:tc>
+        <w:tc>
+          <w:tcPr>
+            <w:tcW w:w="5640" w:type="dxa"/>
+          </w:tcPr>
+          <w:p>
+            <w:r>
+              <w:t xml:space="preserve">Primary key. Issued when a Firebase ID token is first exchanged via POST /auth/session.</w:t>
+            </w:r>
+          </w:p>
+        </w:tc>
+      </w:tr>
+      <w:tr>
+        <w:tc>
+          <w:tcPr>
+            <w:tcW w:w="1700" w:type="dxa"/>
+          </w:tcPr>
+          <w:p>
+            <w:r>
+              <w:rPr>
+                <w:b/>
+                <w:bCs/>
+              </w:rPr>
+              <w:t xml:space="preserve">displayName</w:t>
+            </w:r>
+          </w:p>
+        </w:tc>
+        <w:tc>
+          <w:tcPr>
+            <w:tcW w:w="2300" w:type="dxa"/>
+          </w:tcPr>
+          <w:p>
+            <w:r>
+              <w:t xml:space="preserve">String</w:t>
+            </w:r>
+          </w:p>
+        </w:tc>
+        <w:tc>
+          <w:tcPr>
+            <w:tcW w:w="5640" w:type="dxa"/>
+          </w:tcPr>
+          <w:p>
+            <w:r>
+              <w:t xml:space="preserve">From the Google account used for Sign-In.</w:t>
+            </w:r>
+          </w:p>
+        </w:tc>
+      </w:tr>
+      <w:tr>
+        <w:tc>
+          <w:tcPr>
+            <w:tcW w:w="1700" w:type="dxa"/>
+          </w:tcPr>
+          <w:p>
+            <w:r>
+              <w:rPr>
+                <w:b/>
+                <w:bCs/>
+              </w:rPr>
+              <w:t xml:space="preserve">role</w:t>
+            </w:r>
+          </w:p>
+        </w:tc>
+        <w:tc>
+          <w:tcPr>
+            <w:tcW w:w="2300" w:type="dxa"/>
+          </w:tcPr>
+          <w:p>
+            <w:r>
+              <w:t xml:space="preserve">String ("Farmer" | "Buyer")</w:t>
+            </w:r>
+          </w:p>
+        </w:tc>
+        <w:tc>
+          <w:tcPr>
+            <w:tcW w:w="5640" w:type="dxa"/>
+          </w:tcPr>
+          <w:p>
+            <w:r>
+              <w:t xml:space="preserve">Set once via PUT /users/me during Onboarding.</w:t>
+            </w:r>
+          </w:p>
+        </w:tc>
+      </w:tr>
+      <w:tr>
+        <w:tc>
+          <w:tcPr>
+            <w:tcW w:w="1700" w:type="dxa"/>
+          </w:tcPr>
+          <w:p>
+            <w:r>
+              <w:rPr>
+                <w:b/>
+                <w:bCs/>
+              </w:rPr>
+              <w:t xml:space="preserve">language</w:t>
+            </w:r>
+          </w:p>
+        </w:tc>
+        <w:tc>
+          <w:tcPr>
+            <w:tcW w:w="2300" w:type="dxa"/>
+          </w:tcPr>
+          <w:p>
+            <w:r>
+              <w:t xml:space="preserve">String (ISO 639-1, e.g. "en", "zu", "af")</w:t>
+            </w:r>
+          </w:p>
+        </w:tc>
+        <w:tc>
+          <w:tcPr>
+            <w:tcW w:w="5640" w:type="dxa"/>
+          </w:tcPr>
+          <w:p>
+            <w:r>
+              <w:t xml:space="preserve">Stored as an ISO code rather than the label shown in the UI (English/isiZulu/Afrikaans). Mapping between the two is on the app side.</w:t>
+            </w:r>
+          </w:p>
+        </w:tc>
+      </w:tr>
+      <w:tr>
+        <w:tc>
+          <w:tcPr>
+            <w:tcW w:w="1700" w:type="dxa"/>
+          </w:tcPr>
+          <w:p>
+            <w:r>
+              <w:rPr>
+                <w:b/>
+                <w:bCs/>
+              </w:rPr>
+              <w:t xml:space="preserve">searchRadiusKm</w:t>
+            </w:r>
+          </w:p>
+        </w:tc>
+        <w:tc>
+          <w:tcPr>
+            <w:tcW w:w="2300" w:type="dxa"/>
+          </w:tcPr>
+          <w:p>
+            <w:r>
+              <w:t xml:space="preserve">Integer</w:t>
+            </w:r>
+          </w:p>
+        </w:tc>
+        <w:tc>
+          <w:tcPr>
+            <w:tcW w:w="5640" w:type="dxa"/>
+          </w:tcPr>
+          <w:p>
+            <w:r>
+              <w:t xml:space="preserve">Validated by PUT /users/me to a 1–50 range — matches the Onboarding slider.</w:t>
+            </w:r>
+          </w:p>
+        </w:tc>
+      </w:tr>
+      <w:tr>
+        <w:tc>
+          <w:tcPr>
+            <w:tcW w:w="1700" w:type="dxa"/>
+          </w:tcPr>
+          <w:p>
+            <w:r>
+              <w:rPr>
+                <w:b/>
+                <w:bCs/>
+              </w:rPr>
+              <w:t xml:space="preserve">notificationsEnabled</w:t>
+            </w:r>
+          </w:p>
+        </w:tc>
+        <w:tc>
+          <w:tcPr>
+            <w:tcW w:w="2300" w:type="dxa"/>
+          </w:tcPr>
+          <w:p>
+            <w:r>
+              <w:t xml:space="preserve">Boolean</w:t>
+            </w:r>
+          </w:p>
+        </w:tc>
+        <w:tc>
+          <w:tcPr>
+            <w:tcW w:w="5640" w:type="dxa"/>
+          </w:tcPr>
+          <w:p>
+            <w:r>
+              <w:t xml:space="preserve"/>
+            </w:r>
+          </w:p>
+        </w:tc>
+      </w:tr>
+      <w:tr>
+        <w:tc>
+          <w:tcPr>
+            <w:tcW w:w="1700" w:type="dxa"/>
+          </w:tcPr>
+          <w:p>
+            <w:r>
+              <w:rPr>
+                <w:b/>
+                <w:bCs/>
+              </w:rPr>
+              <w:t xml:space="preserve">biometricLockEnabled</w:t>
+            </w:r>
+          </w:p>
+        </w:tc>
+        <w:tc>
+          <w:tcPr>
+            <w:tcW w:w="2300" w:type="dxa"/>
+          </w:tcPr>
+          <w:p>
+            <w:r>
+              <w:t xml:space="preserve">Boolean</w:t>
+            </w:r>
+          </w:p>
+        </w:tc>
+        <w:tc>
+          <w:tcPr>
+            <w:tcW w:w="5640" w:type="dxa"/>
+          </w:tcPr>
+          <w:p>
+            <w:r>
+              <w:t xml:space="preserve"/>
+            </w:r>
+          </w:p>
+        </w:tc>
+      </w:tr>
+      <w:tr>
+        <w:tc>
+          <w:tcPr>
+            <w:tcW w:w="1700" w:type="dxa"/>
+          </w:tcPr>
+          <w:p>
+            <w:r>
+              <w:rPr>
+                <w:b/>
+                <w:bCs/>
+              </w:rPr>
+              <w:t xml:space="preserve">createdAt</w:t>
+            </w:r>
+          </w:p>
+        </w:tc>
+        <w:tc>
+          <w:tcPr>
+            <w:tcW w:w="2300" w:type="dxa"/>
+          </w:tcPr>
+          <w:p>
+            <w:r>
+              <w:t xml:space="preserve">DateTime</w:t>
+            </w:r>
+          </w:p>
+        </w:tc>
+        <w:tc>
+          <w:tcPr>
+            <w:tcW w:w="5640" w:type="dxa"/>
+          </w:tcPr>
+          <w:p>
+            <w:r>
+              <w:t xml:space="preserve">Returned by GET /users/me.</w:t>
             </w:r>
           </w:p>
         </w:tc>
       </w:tr>
     </w:tbl>
+    <w:p/>
+    <w:p>
+      <w:pPr>
+        <w:pStyle w:val="Heading2"/>
+        <w:spacing w:before="240" w:after="110"/>
+      </w:pPr>
+      <w:r>
+        <w:t>7.2 Listings</w:t>
+      </w:r>
+    </w:p>
+    <w:p>
+      <w:pPr>
+        <w:spacing w:after="120"/>
+      </w:pPr>
+      <w:r>
+        <w:rPr>
+          <w:i/>
+          <w:iCs/>
+          <w:color w:val="595959"/>
+          <w:sz w:val="20"/>
+          <w:szCs w:val="20"/>
+        </w:rPr>
+        <w:t xml:space="preserve">Partition key: farmerId.</w:t>
+      </w:r>
+    </w:p>
+    <w:tbl>
+      <w:tblPr>
+        <w:tblW w:w="9640" w:type="dxa"/>
+        <w:tblBorders>
+          <w:top w:val="single" w:sz="4" w:space="0" w:color="auto"/>
+          <w:left w:val="single" w:sz="4" w:space="0" w:color="auto"/>
+          <w:bottom w:val="single" w:sz="4" w:space="0" w:color="auto"/>
+          <w:right w:val="single" w:sz="4" w:space="0" w:color="auto"/>
+          <w:insideH w:val="single" w:sz="4" w:space="0" w:color="auto"/>
+          <w:insideV w:val="single" w:sz="4" w:space="0" w:color="auto"/>
+        </w:tblBorders>
+        <w:tblCellMar>
+          <w:left w:w="80" w:type="dxa"/>
+          <w:right w:w="80" w:type="dxa"/>
+        </w:tblCellMar>
+        <w:tblLook w:val="04A0" w:firstRow="1" w:lastRow="0" w:firstColumn="1" w:lastColumn="0" w:noHBand="0" w:noVBand="1"/>
+      </w:tblPr>
+      <w:tblGrid>
+        <w:gridCol w:w="1700"/>
+        <w:gridCol w:w="2300"/>
+        <w:gridCol w:w="5640"/>
+      </w:tblGrid>
+      <w:tr>
+        <w:tc>
+          <w:tcPr>
+            <w:tcW w:w="1700" w:type="dxa"/>
+            <w:shd w:val="clear" w:color="auto" w:fill="D9D9D9"/>
+          </w:tcPr>
+          <w:p>
+            <w:r>
+              <w:rPr>
+                <w:b/>
+                <w:bCs/>
+              </w:rPr>
+              <w:t xml:space="preserve">Field</w:t>
+            </w:r>
+          </w:p>
+        </w:tc>
+        <w:tc>
+          <w:tcPr>
+            <w:tcW w:w="2300" w:type="dxa"/>
+            <w:shd w:val="clear" w:color="auto" w:fill="D9D9D9"/>
+          </w:tcPr>
+          <w:p>
+            <w:r>
+              <w:rPr>
+                <w:b/>
+                <w:bCs/>
+              </w:rPr>
+              <w:t xml:space="preserve">Type</w:t>
+            </w:r>
+          </w:p>
+        </w:tc>
+        <w:tc>
+          <w:tcPr>
+            <w:tcW w:w="5640" w:type="dxa"/>
+            <w:shd w:val="clear" w:color="auto" w:fill="D9D9D9"/>
+          </w:tcPr>
+          <w:p>
+            <w:r>
+              <w:rPr>
+                <w:b/>
+                <w:bCs/>
+              </w:rPr>
+              <w:t xml:space="preserve">Notes</w:t>
+            </w:r>
+          </w:p>
+        </w:tc>
+      </w:tr>
+      <w:tr>
+        <w:tc>
+          <w:tcPr>
+            <w:tcW w:w="1700" w:type="dxa"/>
+          </w:tcPr>
+          <w:p>
+            <w:r>
+              <w:rPr>
+                <w:b/>
+                <w:bCs/>
+              </w:rPr>
+              <w:t xml:space="preserve">listingId</w:t>
+            </w:r>
+          </w:p>
+        </w:tc>
+        <w:tc>
+          <w:tcPr>
+            <w:tcW w:w="2300" w:type="dxa"/>
+          </w:tcPr>
+          <w:p>
+            <w:r>
+              <w:t xml:space="preserve">Guid</w:t>
+            </w:r>
+          </w:p>
+        </w:tc>
+        <w:tc>
+          <w:tcPr>
+            <w:tcW w:w="5640" w:type="dxa"/>
+          </w:tcPr>
+          <w:p>
+            <w:r>
+              <w:t xml:space="preserve">Primary key — this is the Cosmos document's own id field. For listings created offline, it's set to the client-generated identifier sent with POST /listings. That way, if a sync from RoomDB gets retried, it lands on the same document instead of duplicating it.</w:t>
+            </w:r>
+          </w:p>
+        </w:tc>
+      </w:tr>
+      <w:tr>
+        <w:tc>
+          <w:tcPr>
+            <w:tcW w:w="1700" w:type="dxa"/>
+          </w:tcPr>
+          <w:p>
+            <w:r>
+              <w:rPr>
+                <w:b/>
+                <w:bCs/>
+              </w:rPr>
+              <w:t xml:space="preserve">farmerId</w:t>
+            </w:r>
+          </w:p>
+        </w:tc>
+        <w:tc>
+          <w:tcPr>
+            <w:tcW w:w="2300" w:type="dxa"/>
+          </w:tcPr>
+          <w:p>
+            <w:r>
+              <w:t xml:space="preserve">Guid</w:t>
+            </w:r>
+          </w:p>
+        </w:tc>
+        <w:tc>
+          <w:tcPr>
+            <w:tcW w:w="5640" w:type="dxa"/>
+          </w:tcPr>
+          <w:p>
+            <w:r>
+              <w:t xml:space="preserve">Owner of the listing. Not something the client sends or the API returns directly — it comes from the caller's auth token.</w:t>
+            </w:r>
+          </w:p>
+        </w:tc>
+      </w:tr>
+      <w:tr>
+        <w:tc>
+          <w:tcPr>
+            <w:tcW w:w="1700" w:type="dxa"/>
+          </w:tcPr>
+          <w:p>
+            <w:r>
+              <w:rPr>
+                <w:b/>
+                <w:bCs/>
+              </w:rPr>
+              <w:t xml:space="preserve">cropType</w:t>
+            </w:r>
+          </w:p>
+        </w:tc>
+        <w:tc>
+          <w:tcPr>
+            <w:tcW w:w="2300" w:type="dxa"/>
+          </w:tcPr>
+          <w:p>
+            <w:r>
+              <w:t xml:space="preserve">String</w:t>
+            </w:r>
+          </w:p>
+        </w:tc>
+        <w:tc>
+          <w:tcPr>
+            <w:tcW w:w="5640" w:type="dxa"/>
+          </w:tcPr>
+          <w:p>
+            <w:r>
+              <w:t xml:space="preserve">Required.</w:t>
+            </w:r>
+          </w:p>
+        </w:tc>
+      </w:tr>
+      <w:tr>
+        <w:tc>
+          <w:tcPr>
+            <w:tcW w:w="1700" w:type="dxa"/>
+          </w:tcPr>
+          <w:p>
+            <w:r>
+              <w:rPr>
+                <w:b/>
+                <w:bCs/>
+              </w:rPr>
+              <w:t xml:space="preserve">quantity</w:t>
+            </w:r>
+          </w:p>
+        </w:tc>
+        <w:tc>
+          <w:tcPr>
+            <w:tcW w:w="2300" w:type="dxa"/>
+          </w:tcPr>
+          <w:p>
+            <w:r>
+              <w:t xml:space="preserve">Decimal</w:t>
+            </w:r>
+          </w:p>
+        </w:tc>
+        <w:tc>
+          <w:tcPr>
+            <w:tcW w:w="5640" w:type="dxa"/>
+          </w:tcPr>
+          <w:p>
+            <w:r>
+              <w:t xml:space="preserve">Required; API validates greater than 0.</w:t>
+            </w:r>
+          </w:p>
+        </w:tc>
+      </w:tr>
+      <w:tr>
+        <w:tc>
+          <w:tcPr>
+            <w:tcW w:w="1700" w:type="dxa"/>
+          </w:tcPr>
+          <w:p>
+            <w:r>
+              <w:rPr>
+                <w:b/>
+                <w:bCs/>
+              </w:rPr>
+              <w:t xml:space="preserve">unit</w:t>
+            </w:r>
+          </w:p>
+        </w:tc>
+        <w:tc>
+          <w:tcPr>
+            <w:tcW w:w="2300" w:type="dxa"/>
+          </w:tcPr>
+          <w:p>
+            <w:r>
+              <w:t xml:space="preserve">String</w:t>
+            </w:r>
+          </w:p>
+        </w:tc>
+        <w:tc>
+          <w:tcPr>
+            <w:tcW w:w="5640" w:type="dxa"/>
+          </w:tcPr>
+          <w:p>
+            <w:r>
+              <w:t xml:space="preserve">Required.</w:t>
+            </w:r>
+          </w:p>
+        </w:tc>
+      </w:tr>
+      <w:tr>
+        <w:tc>
+          <w:tcPr>
+            <w:tcW w:w="1700" w:type="dxa"/>
+          </w:tcPr>
+          <w:p>
+            <w:r>
+              <w:rPr>
+                <w:b/>
+                <w:bCs/>
+              </w:rPr>
+              <w:t xml:space="preserve">harvestDate</w:t>
+            </w:r>
+          </w:p>
+        </w:tc>
+        <w:tc>
+          <w:tcPr>
+            <w:tcW w:w="2300" w:type="dxa"/>
+          </w:tcPr>
+          <w:p>
+            <w:r>
+              <w:t xml:space="preserve">Date</w:t>
+            </w:r>
+          </w:p>
+        </w:tc>
+        <w:tc>
+          <w:tcPr>
+            <w:tcW w:w="5640" w:type="dxa"/>
+          </w:tcPr>
+          <w:p>
+            <w:r>
+              <w:t xml:space="preserve">Required.</w:t>
+            </w:r>
+          </w:p>
+        </w:tc>
+      </w:tr>
+      <w:tr>
+        <w:tc>
+          <w:tcPr>
+            <w:tcW w:w="1700" w:type="dxa"/>
+          </w:tcPr>
+          <w:p>
+            <w:r>
+              <w:rPr>
+                <w:b/>
+                <w:bCs/>
+              </w:rPr>
+              <w:t xml:space="preserve">location</w:t>
+            </w:r>
+          </w:p>
+        </w:tc>
+        <w:tc>
+          <w:tcPr>
+            <w:tcW w:w="2300" w:type="dxa"/>
+          </w:tcPr>
+          <w:p>
+            <w:r>
+              <w:t xml:space="preserve">Double latitude, Double longitude</w:t>
+            </w:r>
+          </w:p>
+        </w:tc>
+        <w:tc>
+          <w:tcPr>
+            <w:tcW w:w="5640" w:type="dxa"/>
+          </w:tcPr>
+          <w:p>
+            <w:r>
+              <w:t xml:space="preserve">Required. Feeds directly into the distance component of match scoring — see 7.4.</w:t>
+            </w:r>
+          </w:p>
+        </w:tc>
+      </w:tr>
+      <w:tr>
+        <w:tc>
+          <w:tcPr>
+            <w:tcW w:w="1700" w:type="dxa"/>
+          </w:tcPr>
+          <w:p>
+            <w:r>
+              <w:rPr>
+                <w:b/>
+                <w:bCs/>
+              </w:rPr>
+              <w:t xml:space="preserve">photoUrl</w:t>
+            </w:r>
+          </w:p>
+        </w:tc>
+        <w:tc>
+          <w:tcPr>
+            <w:tcW w:w="2300" w:type="dxa"/>
+          </w:tcPr>
+          <w:p>
+            <w:r>
+              <w:t xml:space="preserve">String (nullable)</w:t>
+            </w:r>
+          </w:p>
+        </w:tc>
+        <w:tc>
+          <w:tcPr>
+            <w:tcW w:w="5640" w:type="dxa"/>
+          </w:tcPr>
+          <w:p>
+            <w:r>
+              <w:t xml:space="preserve">Optional on creation (photoBase64 is submitted; the API returns a photoUrl once it's stored).</w:t>
+            </w:r>
+          </w:p>
+        </w:tc>
+      </w:tr>
+      <w:tr>
+        <w:tc>
+          <w:tcPr>
+            <w:tcW w:w="1700" w:type="dxa"/>
+          </w:tcPr>
+          <w:p>
+            <w:r>
+              <w:rPr>
+                <w:b/>
+                <w:bCs/>
+              </w:rPr>
+              <w:t xml:space="preserve">status</w:t>
+            </w:r>
+          </w:p>
+        </w:tc>
+        <w:tc>
+          <w:tcPr>
+            <w:tcW w:w="2300" w:type="dxa"/>
+          </w:tcPr>
+          <w:p>
+            <w:r>
+              <w:t xml:space="preserve">String ("Active" | "Matched" | "Expired")</w:t>
+            </w:r>
+          </w:p>
+        </w:tc>
+        <w:tc>
+          <w:tcPr>
+            <w:tcW w:w="5640" w:type="dxa"/>
+          </w:tcPr>
+          <w:p>
+            <w:r>
+              <w:t xml:space="preserve">A DELETE call doesn't actually remove the document — it just moves status into a terminal state, so any match already generated against the listing keeps its history intact.</w:t>
+            </w:r>
+          </w:p>
+        </w:tc>
+      </w:tr>
+      <w:tr>
+        <w:tc>
+          <w:tcPr>
+            <w:tcW w:w="1700" w:type="dxa"/>
+          </w:tcPr>
+          <w:p>
+            <w:r>
+              <w:rPr>
+                <w:b/>
+                <w:bCs/>
+              </w:rPr>
+              <w:t xml:space="preserve">createdAt</w:t>
+            </w:r>
+          </w:p>
+        </w:tc>
+        <w:tc>
+          <w:tcPr>
+            <w:tcW w:w="2300" w:type="dxa"/>
+          </w:tcPr>
+          <w:p>
+            <w:r>
+              <w:t xml:space="preserve">DateTime</w:t>
+            </w:r>
+          </w:p>
+        </w:tc>
+        <w:tc>
+          <w:tcPr>
+            <w:tcW w:w="5640" w:type="dxa"/>
+          </w:tcPr>
+          <w:p>
+            <w:r>
+              <w:t xml:space="preserve"/>
+            </w:r>
+          </w:p>
+        </w:tc>
+      </w:tr>
+    </w:tbl>
+    <w:p/>
+    <w:p>
+      <w:pPr>
+        <w:pStyle w:val="Heading2"/>
+        <w:spacing w:before="240" w:after="110"/>
+      </w:pPr>
+      <w:r>
+        <w:t>7.3 Demands</w:t>
+      </w:r>
+    </w:p>
+    <w:p>
+      <w:pPr>
+        <w:spacing w:after="120"/>
+      </w:pPr>
+      <w:r>
+        <w:rPr>
+          <w:i/>
+          <w:iCs/>
+          <w:color w:val="595959"/>
+          <w:sz w:val="20"/>
+          <w:szCs w:val="20"/>
+        </w:rPr>
+        <w:t xml:space="preserve">Partition key: buyerId.</w:t>
+      </w:r>
+    </w:p>
+    <w:tbl>
+      <w:tblPr>
+        <w:tblW w:w="9640" w:type="dxa"/>
+        <w:tblBorders>
+          <w:top w:val="single" w:sz="4" w:space="0" w:color="auto"/>
+          <w:left w:val="single" w:sz="4" w:space="0" w:color="auto"/>
+          <w:bottom w:val="single" w:sz="4" w:space="0" w:color="auto"/>
+          <w:right w:val="single" w:sz="4" w:space="0" w:color="auto"/>
+          <w:insideH w:val="single" w:sz="4" w:space="0" w:color="auto"/>
+          <w:insideV w:val="single" w:sz="4" w:space="0" w:color="auto"/>
+        </w:tblBorders>
+        <w:tblCellMar>
+          <w:left w:w="80" w:type="dxa"/>
+          <w:right w:w="80" w:type="dxa"/>
+        </w:tblCellMar>
+        <w:tblLook w:val="04A0" w:firstRow="1" w:lastRow="0" w:firstColumn="1" w:lastColumn="0" w:noHBand="0" w:noVBand="1"/>
+      </w:tblPr>
+      <w:tblGrid>
+        <w:gridCol w:w="1700"/>
+        <w:gridCol w:w="2300"/>
+        <w:gridCol w:w="5640"/>
+      </w:tblGrid>
+      <w:tr>
+        <w:tc>
+          <w:tcPr>
+            <w:tcW w:w="1700" w:type="dxa"/>
+            <w:shd w:val="clear" w:color="auto" w:fill="D9D9D9"/>
+          </w:tcPr>
+          <w:p>
+            <w:r>
+              <w:rPr>
+                <w:b/>
+                <w:bCs/>
+              </w:rPr>
+              <w:t xml:space="preserve">Field</w:t>
+            </w:r>
+          </w:p>
+        </w:tc>
+        <w:tc>
+          <w:tcPr>
+            <w:tcW w:w="2300" w:type="dxa"/>
+            <w:shd w:val="clear" w:color="auto" w:fill="D9D9D9"/>
+          </w:tcPr>
+          <w:p>
+            <w:r>
+              <w:rPr>
+                <w:b/>
+                <w:bCs/>
+              </w:rPr>
+              <w:t xml:space="preserve">Type</w:t>
+            </w:r>
+          </w:p>
+        </w:tc>
+        <w:tc>
+          <w:tcPr>
+            <w:tcW w:w="5640" w:type="dxa"/>
+            <w:shd w:val="clear" w:color="auto" w:fill="D9D9D9"/>
+          </w:tcPr>
+          <w:p>
+            <w:r>
+              <w:rPr>
+                <w:b/>
+                <w:bCs/>
+              </w:rPr>
+              <w:t xml:space="preserve">Notes</w:t>
+            </w:r>
+          </w:p>
+        </w:tc>
+      </w:tr>
+      <w:tr>
+        <w:tc>
+          <w:tcPr>
+            <w:tcW w:w="1700" w:type="dxa"/>
+          </w:tcPr>
+          <w:p>
+            <w:r>
+              <w:rPr>
+                <w:b/>
+                <w:bCs/>
+              </w:rPr>
+              <w:t xml:space="preserve">demandRequestId</w:t>
+            </w:r>
+          </w:p>
+        </w:tc>
+        <w:tc>
+          <w:tcPr>
+            <w:tcW w:w="2300" w:type="dxa"/>
+          </w:tcPr>
+          <w:p>
+            <w:r>
+              <w:t xml:space="preserve">Guid</w:t>
+            </w:r>
+          </w:p>
+        </w:tc>
+        <w:tc>
+          <w:tcPr>
+            <w:tcW w:w="5640" w:type="dxa"/>
+          </w:tcPr>
+          <w:p>
+            <w:r>
+              <w:t xml:space="preserve">Primary key, same as listingId — uses the client-generated identifier when created offline.</w:t>
+            </w:r>
+          </w:p>
+        </w:tc>
+      </w:tr>
+      <w:tr>
+        <w:tc>
+          <w:tcPr>
+            <w:tcW w:w="1700" w:type="dxa"/>
+          </w:tcPr>
+          <w:p>
+            <w:r>
+              <w:rPr>
+                <w:b/>
+                <w:bCs/>
+              </w:rPr>
+              <w:t xml:space="preserve">buyerId</w:t>
+            </w:r>
+          </w:p>
+        </w:tc>
+        <w:tc>
+          <w:tcPr>
+            <w:tcW w:w="2300" w:type="dxa"/>
+          </w:tcPr>
+          <w:p>
+            <w:r>
+              <w:t xml:space="preserve">Guid</w:t>
+            </w:r>
+          </w:p>
+        </w:tc>
+        <w:tc>
+          <w:tcPr>
+            <w:tcW w:w="5640" w:type="dxa"/>
+          </w:tcPr>
+          <w:p>
+            <w:r>
+              <w:t xml:space="preserve">Owner of the demand request; comes from the caller's auth token.</w:t>
+            </w:r>
+          </w:p>
+        </w:tc>
+      </w:tr>
+      <w:tr>
+        <w:tc>
+          <w:tcPr>
+            <w:tcW w:w="1700" w:type="dxa"/>
+          </w:tcPr>
+          <w:p>
+            <w:r>
+              <w:rPr>
+                <w:b/>
+                <w:bCs/>
+              </w:rPr>
+              <w:t xml:space="preserve">cropType</w:t>
+            </w:r>
+          </w:p>
+        </w:tc>
+        <w:tc>
+          <w:tcPr>
+            <w:tcW w:w="2300" w:type="dxa"/>
+          </w:tcPr>
+          <w:p>
+            <w:r>
+              <w:t xml:space="preserve">String</w:t>
+            </w:r>
+          </w:p>
+        </w:tc>
+        <w:tc>
+          <w:tcPr>
+            <w:tcW w:w="5640" w:type="dxa"/>
+          </w:tcPr>
+          <w:p>
+            <w:r>
+              <w:t xml:space="preserve">Required.</w:t>
+            </w:r>
+          </w:p>
+        </w:tc>
+      </w:tr>
+      <w:tr>
+        <w:tc>
+          <w:tcPr>
+            <w:tcW w:w="1700" w:type="dxa"/>
+          </w:tcPr>
+          <w:p>
+            <w:r>
+              <w:rPr>
+                <w:b/>
+                <w:bCs/>
+              </w:rPr>
+              <w:t xml:space="preserve">quantityNeeded</w:t>
+            </w:r>
+          </w:p>
+        </w:tc>
+        <w:tc>
+          <w:tcPr>
+            <w:tcW w:w="2300" w:type="dxa"/>
+          </w:tcPr>
+          <w:p>
+            <w:r>
+              <w:t xml:space="preserve">Decimal</w:t>
+            </w:r>
+          </w:p>
+        </w:tc>
+        <w:tc>
+          <w:tcPr>
+            <w:tcW w:w="5640" w:type="dxa"/>
+          </w:tcPr>
+          <w:p>
+            <w:r>
+              <w:t xml:space="preserve">Required.</w:t>
+            </w:r>
+          </w:p>
+        </w:tc>
+      </w:tr>
+      <w:tr>
+        <w:tc>
+          <w:tcPr>
+            <w:tcW w:w="1700" w:type="dxa"/>
+          </w:tcPr>
+          <w:p>
+            <w:r>
+              <w:rPr>
+                <w:b/>
+                <w:bCs/>
+              </w:rPr>
+              <w:t xml:space="preserve">unit</w:t>
+            </w:r>
+          </w:p>
+        </w:tc>
+        <w:tc>
+          <w:tcPr>
+            <w:tcW w:w="2300" w:type="dxa"/>
+          </w:tcPr>
+          <w:p>
+            <w:r>
+              <w:t xml:space="preserve">String</w:t>
+            </w:r>
+          </w:p>
+        </w:tc>
+        <w:tc>
+          <w:tcPr>
+            <w:tcW w:w="5640" w:type="dxa"/>
+          </w:tcPr>
+          <w:p>
+            <w:r>
+              <w:t xml:space="preserve">Required. Kept as its own field rather than folded into quantityNeeded.</w:t>
+            </w:r>
+          </w:p>
+        </w:tc>
+      </w:tr>
+      <w:tr>
+        <w:tc>
+          <w:tcPr>
+            <w:tcW w:w="1700" w:type="dxa"/>
+          </w:tcPr>
+          <w:p>
+            <w:r>
+              <w:rPr>
+                <w:b/>
+                <w:bCs/>
+              </w:rPr>
+              <w:t xml:space="preserve">deadline</w:t>
+            </w:r>
+          </w:p>
+        </w:tc>
+        <w:tc>
+          <w:tcPr>
+            <w:tcW w:w="2300" w:type="dxa"/>
+          </w:tcPr>
+          <w:p>
+            <w:r>
+              <w:t xml:space="preserve">Date</w:t>
+            </w:r>
+          </w:p>
+        </w:tc>
+        <w:tc>
+          <w:tcPr>
+            <w:tcW w:w="5640" w:type="dxa"/>
+          </w:tcPr>
+          <w:p>
+            <w:r>
+              <w:t xml:space="preserve">Used as the freshness-window boundary in match scoring (7.4).</w:t>
+            </w:r>
+          </w:p>
+        </w:tc>
+      </w:tr>
+      <w:tr>
+        <w:tc>
+          <w:tcPr>
+            <w:tcW w:w="1700" w:type="dxa"/>
+          </w:tcPr>
+          <w:p>
+            <w:r>
+              <w:rPr>
+                <w:b/>
+                <w:bCs/>
+              </w:rPr>
+              <w:t xml:space="preserve">location</w:t>
+            </w:r>
+          </w:p>
+        </w:tc>
+        <w:tc>
+          <w:tcPr>
+            <w:tcW w:w="2300" w:type="dxa"/>
+          </w:tcPr>
+          <w:p>
+            <w:r>
+              <w:t xml:space="preserve">Double latitude, Double longitude</w:t>
+            </w:r>
+          </w:p>
+        </w:tc>
+        <w:tc>
+          <w:tcPr>
+            <w:tcW w:w="5640" w:type="dxa"/>
+          </w:tcPr>
+          <w:p>
+            <w:r>
+              <w:t xml:space="preserve">Required.</w:t>
+            </w:r>
+          </w:p>
+        </w:tc>
+      </w:tr>
+      <w:tr>
+        <w:tc>
+          <w:tcPr>
+            <w:tcW w:w="1700" w:type="dxa"/>
+          </w:tcPr>
+          <w:p>
+            <w:r>
+              <w:rPr>
+                <w:b/>
+                <w:bCs/>
+              </w:rPr>
+              <w:t xml:space="preserve">status</w:t>
+            </w:r>
+          </w:p>
+        </w:tc>
+        <w:tc>
+          <w:tcPr>
+            <w:tcW w:w="2300" w:type="dxa"/>
+          </w:tcPr>
+          <w:p>
+            <w:r>
+              <w:t xml:space="preserve">String ("Open" | "Matched" | "Expired")</w:t>
+            </w:r>
+          </w:p>
+        </w:tc>
+        <w:tc>
+          <w:tcPr>
+            <w:tcW w:w="5640" w:type="dxa"/>
+          </w:tcPr>
+          <w:p>
+            <w:r>
+              <w:t xml:space="preserve"/>
+            </w:r>
+          </w:p>
+        </w:tc>
+      </w:tr>
+      <w:tr>
+        <w:tc>
+          <w:tcPr>
+            <w:tcW w:w="1700" w:type="dxa"/>
+          </w:tcPr>
+          <w:p>
+            <w:r>
+              <w:rPr>
+                <w:b/>
+                <w:bCs/>
+              </w:rPr>
+              <w:t xml:space="preserve">createdAt</w:t>
+            </w:r>
+          </w:p>
+        </w:tc>
+        <w:tc>
+          <w:tcPr>
+            <w:tcW w:w="2300" w:type="dxa"/>
+          </w:tcPr>
+          <w:p>
+            <w:r>
+              <w:t xml:space="preserve">DateTime</w:t>
+            </w:r>
+          </w:p>
+        </w:tc>
+        <w:tc>
+          <w:tcPr>
+            <w:tcW w:w="5640" w:type="dxa"/>
+          </w:tcPr>
+          <w:p>
+            <w:r>
+              <w:t xml:space="preserve"/>
+            </w:r>
+          </w:p>
+        </w:tc>
+      </w:tr>
+    </w:tbl>
+    <w:p/>
+    <w:p>
+      <w:pPr>
+        <w:pStyle w:val="Heading2"/>
+        <w:spacing w:before="240" w:after="110"/>
+      </w:pPr>
+      <w:r>
+        <w:t>7.4 Matches</w:t>
+      </w:r>
+    </w:p>
+    <w:p>
+      <w:pPr>
+        <w:spacing w:after="120"/>
+      </w:pPr>
+      <w:r>
+        <w:rPr>
+          <w:i/>
+          <w:iCs/>
+          <w:color w:val="595959"/>
+          <w:sz w:val="20"/>
+          <w:szCs w:val="20"/>
+        </w:rPr>
+        <w:t xml:space="preserve">Partition key: userId of whichever party is querying.</w:t>
+      </w:r>
+    </w:p>
+    <w:tbl>
+      <w:tblPr>
+        <w:tblW w:w="9640" w:type="dxa"/>
+        <w:tblBorders>
+          <w:top w:val="single" w:sz="4" w:space="0" w:color="auto"/>
+          <w:left w:val="single" w:sz="4" w:space="0" w:color="auto"/>
+          <w:bottom w:val="single" w:sz="4" w:space="0" w:color="auto"/>
+          <w:right w:val="single" w:sz="4" w:space="0" w:color="auto"/>
+          <w:insideH w:val="single" w:sz="4" w:space="0" w:color="auto"/>
+          <w:insideV w:val="single" w:sz="4" w:space="0" w:color="auto"/>
+        </w:tblBorders>
+        <w:tblCellMar>
+          <w:left w:w="80" w:type="dxa"/>
+          <w:right w:w="80" w:type="dxa"/>
+        </w:tblCellMar>
+        <w:tblLook w:val="04A0" w:firstRow="1" w:lastRow="0" w:firstColumn="1" w:lastColumn="0" w:noHBand="0" w:noVBand="1"/>
+      </w:tblPr>
+      <w:tblGrid>
+        <w:gridCol w:w="1700"/>
+        <w:gridCol w:w="2300"/>
+        <w:gridCol w:w="5640"/>
+      </w:tblGrid>
+      <w:tr>
+        <w:tc>
+          <w:tcPr>
+            <w:tcW w:w="1700" w:type="dxa"/>
+            <w:shd w:val="clear" w:color="auto" w:fill="D9D9D9"/>
+          </w:tcPr>
+          <w:p>
+            <w:r>
+              <w:rPr>
+                <w:b/>
+                <w:bCs/>
+              </w:rPr>
+              <w:t xml:space="preserve">Field</w:t>
+            </w:r>
+          </w:p>
+        </w:tc>
+        <w:tc>
+          <w:tcPr>
+            <w:tcW w:w="2300" w:type="dxa"/>
+            <w:shd w:val="clear" w:color="auto" w:fill="D9D9D9"/>
+          </w:tcPr>
+          <w:p>
+            <w:r>
+              <w:rPr>
+                <w:b/>
+                <w:bCs/>
+              </w:rPr>
+              <w:t xml:space="preserve">Type</w:t>
+            </w:r>
+          </w:p>
+        </w:tc>
+        <w:tc>
+          <w:tcPr>
+            <w:tcW w:w="5640" w:type="dxa"/>
+            <w:shd w:val="clear" w:color="auto" w:fill="D9D9D9"/>
+          </w:tcPr>
+          <w:p>
+            <w:r>
+              <w:rPr>
+                <w:b/>
+                <w:bCs/>
+              </w:rPr>
+              <w:t xml:space="preserve">Notes</w:t>
+            </w:r>
+          </w:p>
+        </w:tc>
+      </w:tr>
+      <w:tr>
+        <w:tc>
+          <w:tcPr>
+            <w:tcW w:w="1700" w:type="dxa"/>
+          </w:tcPr>
+          <w:p>
+            <w:r>
+              <w:rPr>
+                <w:b/>
+                <w:bCs/>
+              </w:rPr>
+              <w:t xml:space="preserve">matchId</w:t>
+            </w:r>
+          </w:p>
+        </w:tc>
+        <w:tc>
+          <w:tcPr>
+            <w:tcW w:w="2300" w:type="dxa"/>
+          </w:tcPr>
+          <w:p>
+            <w:r>
+              <w:t xml:space="preserve">Guid</w:t>
+            </w:r>
+          </w:p>
+        </w:tc>
+        <w:tc>
+          <w:tcPr>
+            <w:tcW w:w="5640" w:type="dxa"/>
+          </w:tcPr>
+          <w:p>
+            <w:r>
+              <w:t xml:space="preserve">Primary key.</w:t>
+            </w:r>
+          </w:p>
+        </w:tc>
+      </w:tr>
+      <w:tr>
+        <w:tc>
+          <w:tcPr>
+            <w:tcW w:w="1700" w:type="dxa"/>
+          </w:tcPr>
+          <w:p>
+            <w:r>
+              <w:rPr>
+                <w:b/>
+                <w:bCs/>
+              </w:rPr>
+              <w:t xml:space="preserve">listingId</w:t>
+            </w:r>
+          </w:p>
+        </w:tc>
+        <w:tc>
+          <w:tcPr>
+            <w:tcW w:w="2300" w:type="dxa"/>
+          </w:tcPr>
+          <w:p>
+            <w:r>
+              <w:t xml:space="preserve">Guid</w:t>
+            </w:r>
+          </w:p>
+        </w:tc>
+        <w:tc>
+          <w:tcPr>
+            <w:tcW w:w="5640" w:type="dxa"/>
+          </w:tcPr>
+          <w:p>
+            <w:r>
+              <w:t xml:space="preserve">Reference to the matched Listing.</w:t>
+            </w:r>
+          </w:p>
+        </w:tc>
+      </w:tr>
+      <w:tr>
+        <w:tc>
+          <w:tcPr>
+            <w:tcW w:w="1700" w:type="dxa"/>
+          </w:tcPr>
+          <w:p>
+            <w:r>
+              <w:rPr>
+                <w:b/>
+                <w:bCs/>
+              </w:rPr>
+              <w:t xml:space="preserve">demandRequestId</w:t>
+            </w:r>
+          </w:p>
+        </w:tc>
+        <w:tc>
+          <w:tcPr>
+            <w:tcW w:w="2300" w:type="dxa"/>
+          </w:tcPr>
+          <w:p>
+            <w:r>
+              <w:t xml:space="preserve">Guid</w:t>
+            </w:r>
+          </w:p>
+        </w:tc>
+        <w:tc>
+          <w:tcPr>
+            <w:tcW w:w="5640" w:type="dxa"/>
+          </w:tcPr>
+          <w:p>
+            <w:r>
+              <w:t xml:space="preserve">Reference to the matched Demand.</w:t>
+            </w:r>
+          </w:p>
+        </w:tc>
+      </w:tr>
+      <w:tr>
+        <w:tc>
+          <w:tcPr>
+            <w:tcW w:w="1700" w:type="dxa"/>
+          </w:tcPr>
+          <w:p>
+            <w:r>
+              <w:rPr>
+                <w:b/>
+                <w:bCs/>
+              </w:rPr>
+              <w:t xml:space="preserve">score</w:t>
+            </w:r>
+          </w:p>
+        </w:tc>
+        <w:tc>
+          <w:tcPr>
+            <w:tcW w:w="2300" w:type="dxa"/>
+          </w:tcPr>
+          <w:p>
+            <w:r>
+              <w:t xml:space="preserve">Decimal (0.0–1.0)</w:t>
+            </w:r>
+          </w:p>
+        </w:tc>
+        <w:tc>
+          <w:tcPr>
+            <w:tcW w:w="5640" w:type="dxa"/>
+          </w:tcPr>
+          <w:p>
+            <w:r>
+              <w:t xml:space="preserve">Weighted output of distance (35%), crop type (30%, binary), quantity fit (20%), and freshness window (15%) — see Section 3. Anything scoring below 0.4 never gets created.</w:t>
+            </w:r>
+          </w:p>
+        </w:tc>
+      </w:tr>
+      <w:tr>
+        <w:tc>
+          <w:tcPr>
+            <w:tcW w:w="1700" w:type="dxa"/>
+          </w:tcPr>
+          <w:p>
+            <w:r>
+              <w:rPr>
+                <w:b/>
+                <w:bCs/>
+              </w:rPr>
+              <w:t xml:space="preserve">status</w:t>
+            </w:r>
+          </w:p>
+        </w:tc>
+        <w:tc>
+          <w:tcPr>
+            <w:tcW w:w="2300" w:type="dxa"/>
+          </w:tcPr>
+          <w:p>
+            <w:r>
+              <w:t xml:space="preserve">String ("Suggested" | "Confirmed" | "Completed")</w:t>
+            </w:r>
+          </w:p>
+        </w:tc>
+        <w:tc>
+          <w:tcPr>
+            <w:tcW w:w="5640" w:type="dxa"/>
+          </w:tcPr>
+          <w:p>
+            <w:r>
+              <w:t xml:space="preserve">POST /matches/{matchId}/confirm moves a match from Suggested to Confirmed.</w:t>
+            </w:r>
+          </w:p>
+        </w:tc>
+      </w:tr>
+      <w:tr>
+        <w:tc>
+          <w:tcPr>
+            <w:tcW w:w="1700" w:type="dxa"/>
+          </w:tcPr>
+          <w:p>
+            <w:r>
+              <w:rPr>
+                <w:b/>
+                <w:bCs/>
+              </w:rPr>
+              <w:t xml:space="preserve">counterpartSnapshot</w:t>
+            </w:r>
+          </w:p>
+        </w:tc>
+        <w:tc>
+          <w:tcPr>
+            <w:tcW w:w="2300" w:type="dxa"/>
+          </w:tcPr>
+          <w:p>
+            <w:r>
+              <w:t xml:space="preserve">Object: cropType (String), quantity (Decimal), unit (String), distanceKm (Decimal), relevantDate (Date)</w:t>
+            </w:r>
+          </w:p>
+        </w:tc>
+        <w:tc>
+          <w:tcPr>
+            <w:tcW w:w="5640" w:type="dxa"/>
+          </w:tcPr>
+          <w:p>
+            <w:r>
+              <w:t xml:space="preserve">Copied over from the linked Listing/Demand when the match is created. This is what lets the feed (GET /matches) return everything in one call instead of reaching into two other containers.</w:t>
+            </w:r>
+          </w:p>
+        </w:tc>
+      </w:tr>
+      <w:tr>
+        <w:tc>
+          <w:tcPr>
+            <w:tcW w:w="1700" w:type="dxa"/>
+          </w:tcPr>
+          <w:p>
+            <w:r>
+              <w:rPr>
+                <w:b/>
+                <w:bCs/>
+              </w:rPr>
+              <w:t xml:space="preserve">confirmedAt</w:t>
+            </w:r>
+          </w:p>
+        </w:tc>
+        <w:tc>
+          <w:tcPr>
+            <w:tcW w:w="2300" w:type="dxa"/>
+          </w:tcPr>
+          <w:p>
+            <w:r>
+              <w:t xml:space="preserve">DateTime (nullable)</w:t>
+            </w:r>
+          </w:p>
+        </w:tc>
+        <w:tc>
+          <w:tcPr>
+            <w:tcW w:w="5640" w:type="dxa"/>
+          </w:tcPr>
+          <w:p>
+            <w:r>
+              <w:t xml:space="preserve">Populated once status flips to Confirmed.</w:t>
+            </w:r>
+          </w:p>
+        </w:tc>
+      </w:tr>
+      <w:tr>
+        <w:tc>
+          <w:tcPr>
+            <w:tcW w:w="1700" w:type="dxa"/>
+          </w:tcPr>
+          <w:p>
+            <w:r>
+              <w:rPr>
+                <w:b/>
+                <w:bCs/>
+              </w:rPr>
+              <w:t xml:space="preserve">createdAt</w:t>
+            </w:r>
+          </w:p>
+        </w:tc>
+        <w:tc>
+          <w:tcPr>
+            <w:tcW w:w="2300" w:type="dxa"/>
+          </w:tcPr>
+          <w:p>
+            <w:r>
+              <w:t xml:space="preserve">DateTime</w:t>
+            </w:r>
+          </w:p>
+        </w:tc>
+        <w:tc>
+          <w:tcPr>
+            <w:tcW w:w="5640" w:type="dxa"/>
+          </w:tcPr>
+          <w:p>
+            <w:r>
+              <w:t xml:space="preserve"/>
+            </w:r>
+          </w:p>
+        </w:tc>
+      </w:tr>
+    </w:tbl>
+    <w:p>
+      <w:r>
+        <w:t xml:space="preserve">Contact details — display name and phone — aren't stored on the Match at all. Once a match is Confirmed, the API pulls the counterpart's farmerId or buyerId from the linked Listing or Demand, then does a point-read against Users (partitioned on userId, so it's a single fast lookup, not a scan across partitions). That's how GET /matches/{matchId} can hand back contact info without keeping a second copy of it sitting in the Matches container.</w:t>
+      </w:r>
+    </w:p>
+    <w:p/>
+    <w:p>
+      <w:pPr>
+        <w:pStyle w:val="Heading2"/>
+        <w:spacing w:before="240" w:after="110"/>
+      </w:pPr>
+      <w:r>
+        <w:t>7.5 Ratings</w:t>
+      </w:r>
+    </w:p>
+    <w:p>
+      <w:pPr>
+        <w:spacing w:after="120"/>
+      </w:pPr>
+      <w:r>
+        <w:rPr>
+          <w:i/>
+          <w:iCs/>
+          <w:color w:val="595959"/>
+          <w:sz w:val="20"/>
+          <w:szCs w:val="20"/>
+        </w:rPr>
+        <w:t xml:space="preserve">Partition key: matchId.</w:t>
+      </w:r>
+    </w:p>
+    <w:tbl>
+      <w:tblPr>
+        <w:tblW w:w="9640" w:type="dxa"/>
+        <w:tblBorders>
+          <w:top w:val="single" w:sz="4" w:space="0" w:color="auto"/>
+          <w:left w:val="single" w:sz="4" w:space="0" w:color="auto"/>
+          <w:bottom w:val="single" w:sz="4" w:space="0" w:color="auto"/>
+          <w:right w:val="single" w:sz="4" w:space="0" w:color="auto"/>
+          <w:insideH w:val="single" w:sz="4" w:space="0" w:color="auto"/>
+          <w:insideV w:val="single" w:sz="4" w:space="0" w:color="auto"/>
+        </w:tblBorders>
+        <w:tblCellMar>
+          <w:left w:w="80" w:type="dxa"/>
+          <w:right w:w="80" w:type="dxa"/>
+        </w:tblCellMar>
+        <w:tblLook w:val="04A0" w:firstRow="1" w:lastRow="0" w:firstColumn="1" w:lastColumn="0" w:noHBand="0" w:noVBand="1"/>
+      </w:tblPr>
+      <w:tblGrid>
+        <w:gridCol w:w="1700"/>
+        <w:gridCol w:w="2300"/>
+        <w:gridCol w:w="5640"/>
+      </w:tblGrid>
+      <w:tr>
+        <w:tc>
+          <w:tcPr>
+            <w:tcW w:w="1700" w:type="dxa"/>
+            <w:shd w:val="clear" w:color="auto" w:fill="D9D9D9"/>
+          </w:tcPr>
+          <w:p>
+            <w:r>
+              <w:rPr>
+                <w:b/>
+                <w:bCs/>
+              </w:rPr>
+              <w:t xml:space="preserve">Field</w:t>
+            </w:r>
+          </w:p>
+        </w:tc>
+        <w:tc>
+          <w:tcPr>
+            <w:tcW w:w="2300" w:type="dxa"/>
+            <w:shd w:val="clear" w:color="auto" w:fill="D9D9D9"/>
+          </w:tcPr>
+          <w:p>
+            <w:r>
+              <w:rPr>
+                <w:b/>
+                <w:bCs/>
+              </w:rPr>
+              <w:t xml:space="preserve">Type</w:t>
+            </w:r>
+          </w:p>
+        </w:tc>
+        <w:tc>
+          <w:tcPr>
+            <w:tcW w:w="5640" w:type="dxa"/>
+            <w:shd w:val="clear" w:color="auto" w:fill="D9D9D9"/>
+          </w:tcPr>
+          <w:p>
+            <w:r>
+              <w:rPr>
+                <w:b/>
+                <w:bCs/>
+              </w:rPr>
+              <w:t xml:space="preserve">Notes</w:t>
+            </w:r>
+          </w:p>
+        </w:tc>
+      </w:tr>
+      <w:tr>
+        <w:tc>
+          <w:tcPr>
+            <w:tcW w:w="1700" w:type="dxa"/>
+          </w:tcPr>
+          <w:p>
+            <w:r>
+              <w:rPr>
+                <w:b/>
+                <w:bCs/>
+              </w:rPr>
+              <w:t xml:space="preserve">ratingId</w:t>
+            </w:r>
+          </w:p>
+        </w:tc>
+        <w:tc>
+          <w:tcPr>
+            <w:tcW w:w="2300" w:type="dxa"/>
+          </w:tcPr>
+          <w:p>
+            <w:r>
+              <w:t xml:space="preserve">Guid</w:t>
+            </w:r>
+          </w:p>
+        </w:tc>
+        <w:tc>
+          <w:tcPr>
+            <w:tcW w:w="5640" w:type="dxa"/>
+          </w:tcPr>
+          <w:p>
+            <w:r>
+              <w:t xml:space="preserve">Primary key.</w:t>
+            </w:r>
+          </w:p>
+        </w:tc>
+      </w:tr>
+      <w:tr>
+        <w:tc>
+          <w:tcPr>
+            <w:tcW w:w="1700" w:type="dxa"/>
+          </w:tcPr>
+          <w:p>
+            <w:r>
+              <w:rPr>
+                <w:b/>
+                <w:bCs/>
+              </w:rPr>
+              <w:t xml:space="preserve">matchId</w:t>
+            </w:r>
+          </w:p>
+        </w:tc>
+        <w:tc>
+          <w:tcPr>
+            <w:tcW w:w="2300" w:type="dxa"/>
+          </w:tcPr>
+          <w:p>
+            <w:r>
+              <w:t xml:space="preserve">Guid</w:t>
+            </w:r>
+          </w:p>
+        </w:tc>
+        <w:tc>
+          <w:tcPr>
+            <w:tcW w:w="5640" w:type="dxa"/>
+          </w:tcPr>
+          <w:p>
+            <w:r>
+              <w:t xml:space="preserve">Reference to the rated Match.</w:t>
+            </w:r>
+          </w:p>
+        </w:tc>
+      </w:tr>
+      <w:tr>
+        <w:tc>
+          <w:tcPr>
+            <w:tcW w:w="1700" w:type="dxa"/>
+          </w:tcPr>
+          <w:p>
+            <w:r>
+              <w:rPr>
+                <w:b/>
+                <w:bCs/>
+              </w:rPr>
+              <w:t xml:space="preserve">raisedByUserId</w:t>
+            </w:r>
+          </w:p>
+        </w:tc>
+        <w:tc>
+          <w:tcPr>
+            <w:tcW w:w="2300" w:type="dxa"/>
+          </w:tcPr>
+          <w:p>
+            <w:r>
+              <w:t xml:space="preserve">Guid</w:t>
+            </w:r>
+          </w:p>
+        </w:tc>
+        <w:tc>
+          <w:tcPr>
+            <w:tcW w:w="5640" w:type="dxa"/>
+          </w:tcPr>
+          <w:p>
+            <w:r>
+              <w:t xml:space="preserve">The user who submitted the rating.</w:t>
+            </w:r>
+          </w:p>
+        </w:tc>
+      </w:tr>
+      <w:tr>
+        <w:tc>
+          <w:tcPr>
+            <w:tcW w:w="1700" w:type="dxa"/>
+          </w:tcPr>
+          <w:p>
+            <w:r>
+              <w:rPr>
+                <w:b/>
+                <w:bCs/>
+              </w:rPr>
+              <w:t xml:space="preserve">thumbsUp</w:t>
+            </w:r>
+          </w:p>
+        </w:tc>
+        <w:tc>
+          <w:tcPr>
+            <w:tcW w:w="2300" w:type="dxa"/>
+          </w:tcPr>
+          <w:p>
+            <w:r>
+              <w:t xml:space="preserve">Boolean</w:t>
+            </w:r>
+          </w:p>
+        </w:tc>
+        <w:tc>
+          <w:tcPr>
+            <w:tcW w:w="5640" w:type="dxa"/>
+          </w:tcPr>
+          <w:p>
+            <w:r>
+              <w:t xml:space="preserve"/>
+            </w:r>
+          </w:p>
+        </w:tc>
+      </w:tr>
+      <w:tr>
+        <w:tc>
+          <w:tcPr>
+            <w:tcW w:w="1700" w:type="dxa"/>
+          </w:tcPr>
+          <w:p>
+            <w:r>
+              <w:rPr>
+                <w:b/>
+                <w:bCs/>
+              </w:rPr>
+              <w:t xml:space="preserve">createdAt</w:t>
+            </w:r>
+          </w:p>
+        </w:tc>
+        <w:tc>
+          <w:tcPr>
+            <w:tcW w:w="2300" w:type="dxa"/>
+          </w:tcPr>
+          <w:p>
+            <w:r>
+              <w:t xml:space="preserve">DateTime</w:t>
+            </w:r>
+          </w:p>
+        </w:tc>
+        <w:tc>
+          <w:tcPr>
+            <w:tcW w:w="5640" w:type="dxa"/>
+          </w:tcPr>
+          <w:p>
+            <w:r>
+              <w:t xml:space="preserve"/>
+            </w:r>
+          </w:p>
+        </w:tc>
+      </w:tr>
+    </w:tbl>
+    <w:p>
+      <w:r>
+        <w:t xml:space="preserve">POST /matches/{matchId}/rating won't accept anything until the match's status is Completed, and each user only gets one shot at it. Both the farmer and the buyer can rate each other, so a single completed match might end up with two Ratings documents — one per raisedByUserId — but never two from the same person.</w:t>
+      </w:r>
+    </w:p>
+    <w:p/>
+    <w:p>
+      <w:pPr>
+        <w:pStyle w:val="Heading2"/>
+        <w:spacing w:before="240" w:after="110"/>
+      </w:pPr>
+      <w:r>
+        <w:t>7.6 Harvest calendar — not a persisted entity</w:t>
+      </w:r>
+    </w:p>
+    <w:p>
+      <w:r>
+        <w:t xml:space="preserve">There's no separate container for the harvest calendar. GET /calendar just groups existing Listings by harvestDate on the fly and returns date (Date), listingCount (Integer), and listingIds (array of Guid). Since it's built straight from data already captured in 7.2, there's no second write path to keep in sync — the calendar can't drift out of date with the listings it's showing.</w:t>
+      </w:r>
+    </w:p>
+    <w:p>
+      <w:pPr>
+        <w:pBdr>
+          <w:top w:val="single" w:sz="6" w:space="8" w:color="999999"/>
+        </w:pBdr>
+        <w:spacing w:before="120" w:after="200"/>
+      </w:pPr>
+      <w:r>
+        <w:rPr>
+          <w:b/>
+          <w:bCs/>
+        </w:rPr>
+        <w:t xml:space="preserve">Note on scope: </w:t>
+      </w:r>
+      <w:r>
+        <w:rPr>
+          <w:i/>
+          <w:iCs/>
+        </w:rPr>
+        <w:t xml:space="preserve">this section covers what gets captured and persisted, and how it's split across containers. For the scoring logic behind Matches, see Section 3. For the full request/response shape of every endpoint, see Section 5.</w:t>
+      </w:r>
+    </w:p>
     <w:p>
       <w:pPr>
         <w:pStyle w:val="Heading1"/>

</xml_diff>

<commit_message>
docs: Added gantt chart to documents
</commit_message>
<xml_diff>
--- a/Documentation/FromTheFarm Planning & Design.docx
+++ b/Documentation/FromTheFarm Planning & Design.docx
@@ -1,6 +1,6 @@
 
 <file path=word/document.xml><?xml version="1.0" encoding="utf-8"?>
-<w:document xmlns:wpc="http://schemas.microsoft.com/office/word/2010/wordprocessingCanvas" xmlns:cx="http://schemas.microsoft.com/office/drawing/2014/chartex" xmlns:cx1="http://schemas.microsoft.com/office/drawing/2015/9/8/chartex" xmlns:cx2="http://schemas.microsoft.com/office/drawing/2015/10/21/chartex" xmlns:cx3="http://schemas.microsoft.com/office/drawing/2016/5/9/chartex" xmlns:cx4="http://schemas.microsoft.com/office/drawing/2016/5/10/chartex" xmlns:cx5="http://schemas.microsoft.com/office/drawing/2016/5/11/chartex" xmlns:cx6="http://schemas.microsoft.com/office/drawing/2016/5/12/chartex" xmlns:cx7="http://schemas.microsoft.com/office/drawing/2016/5/13/chartex" xmlns:cx8="http://schemas.microsoft.com/office/drawing/2016/5/14/chartex" xmlns:mc="http://schemas.openxmlformats.org/markup-compatibility/2006" xmlns:aink="http://schemas.microsoft.com/office/drawing/2016/ink" xmlns:am3d="http://schemas.microsoft.com/office/drawing/2017/model3d" xmlns:o="urn:schemas-microsoft-com:office:office" xmlns:oel="http://schemas.microsoft.com/office/2019/extlst" xmlns:r="http://schemas.openxmlformats.org/officeDocument/2006/relationships" xmlns:m="http://schemas.openxmlformats.org/officeDocument/2006/math" xmlns:v="urn:schemas-microsoft-com:vml" xmlns:wp14="http://schemas.microsoft.com/office/word/2010/wordprocessingDrawing" xmlns:wp="http://schemas.openxmlformats.org/drawingml/2006/wordprocessingDrawing" xmlns:w10="urn:schemas-microsoft-com:office:word" xmlns:w="http://schemas.openxmlformats.org/wordprocessingml/2006/main" xmlns:w14="http://schemas.microsoft.com/office/word/2010/wordml" xmlns:w15="http://schemas.microsoft.com/office/word/2012/wordml" xmlns:w16cei="http://schemas.microsoft.com/office/word/2026/wordml/cei" xmlns:w16cex="http://schemas.microsoft.com/office/word/2018/wordml/cex" xmlns:w16cid="http://schemas.microsoft.com/office/word/2016/wordml/cid" xmlns:w16="http://schemas.microsoft.com/office/word/2018/wordml" xmlns:w16du="http://schemas.microsoft.com/office/word/2023/wordml/word16du" xmlns:w16sdtdh="http://schemas.microsoft.com/office/word/2020/wordml/sdtdatahash" xmlns:w16sdtfl="http://schemas.microsoft.com/office/word/2024/wordml/sdtformatlock" xmlns:w16se="http://schemas.microsoft.com/office/word/2015/wordml/symex" xmlns:wpg="http://schemas.microsoft.com/office/word/2010/wordprocessingGroup" xmlns:wpi="http://schemas.microsoft.com/office/word/2010/wordprocessingInk" xmlns:wne="http://schemas.microsoft.com/office/word/2006/wordml" xmlns:wps="http://schemas.microsoft.com/office/word/2010/wordprocessingShape" mc:Ignorable="w14 w15 w16se w16cid w16 w16cex w16sdtdh w16sdtfl w16du wp14">
+<w:document xmlns:wpc="http://schemas.microsoft.com/office/word/2010/wordprocessingCanvas" xmlns:cx="http://schemas.microsoft.com/office/drawing/2014/chartex" xmlns:cx1="http://schemas.microsoft.com/office/drawing/2015/9/8/chartex" xmlns:cx2="http://schemas.microsoft.com/office/drawing/2015/10/21/chartex" xmlns:cx3="http://schemas.microsoft.com/office/drawing/2016/5/9/chartex" xmlns:cx4="http://schemas.microsoft.com/office/drawing/2016/5/10/chartex" xmlns:cx5="http://schemas.microsoft.com/office/drawing/2016/5/11/chartex" xmlns:cx6="http://schemas.microsoft.com/office/drawing/2016/5/12/chartex" xmlns:cx7="http://schemas.microsoft.com/office/drawing/2016/5/13/chartex" xmlns:cx8="http://schemas.microsoft.com/office/drawing/2016/5/14/chartex" xmlns:mc="http://schemas.openxmlformats.org/markup-compatibility/2006" xmlns:aink="http://schemas.microsoft.com/office/drawing/2016/ink" xmlns:am3d="http://schemas.microsoft.com/office/drawing/2017/model3d" xmlns:o="urn:schemas-microsoft-com:office:office" xmlns:oel="http://schemas.microsoft.com/office/2019/extlst" xmlns:r="http://schemas.openxmlformats.org/officeDocument/2006/relationships" xmlns:m="http://schemas.openxmlformats.org/officeDocument/2006/math" xmlns:v="urn:schemas-microsoft-com:vml" xmlns:wp14="http://schemas.microsoft.com/office/word/2010/wordprocessingDrawing" xmlns:wp="http://schemas.openxmlformats.org/drawingml/2006/wordprocessingDrawing" xmlns:w10="urn:schemas-microsoft-com:office:word" xmlns:w="http://schemas.openxmlformats.org/wordprocessingml/2006/main" xmlns:w14="http://schemas.microsoft.com/office/word/2010/wordml" xmlns:w15="http://schemas.microsoft.com/office/word/2012/wordml" xmlns:w16cex="http://schemas.microsoft.com/office/word/2018/wordml/cex" xmlns:w16cid="http://schemas.microsoft.com/office/word/2016/wordml/cid" xmlns:w16="http://schemas.microsoft.com/office/word/2018/wordml" xmlns:w16du="http://schemas.microsoft.com/office/word/2023/wordml/word16du" xmlns:w16sdtdh="http://schemas.microsoft.com/office/word/2020/wordml/sdtdatahash" xmlns:w16sdtfl="http://schemas.microsoft.com/office/word/2024/wordml/sdtformatlock" xmlns:w16se="http://schemas.microsoft.com/office/word/2015/wordml/symex" xmlns:wpg="http://schemas.microsoft.com/office/word/2010/wordprocessingGroup" xmlns:wpi="http://schemas.microsoft.com/office/word/2010/wordprocessingInk" xmlns:wne="http://schemas.microsoft.com/office/word/2006/wordml" xmlns:wps="http://schemas.microsoft.com/office/word/2010/wordprocessingShape" mc:Ignorable="w14 w15 w16se w16cid w16 w16cex w16sdtdh w16sdtfl w16du wp14">
   <w:body>
     <w:sdt>
       <w:sdtPr>
@@ -199,33 +199,11 @@
                                     <w:color w:val="FFFFFF" w:themeColor="background1"/>
                                   </w:rPr>
                                 </w:pPr>
-                                <w:proofErr w:type="spellStart"/>
                                 <w:r>
                                   <w:rPr>
                                     <w:color w:val="FFFFFF" w:themeColor="background1"/>
                                   </w:rPr>
-                                  <w:t>Kaehil</w:t>
-                                </w:r>
-                                <w:proofErr w:type="spellEnd"/>
-                                <w:r>
-                                  <w:rPr>
-                                    <w:color w:val="FFFFFF" w:themeColor="background1"/>
-                                  </w:rPr>
-                                  <w:t xml:space="preserve"> </w:t>
-                                </w:r>
-                                <w:proofErr w:type="spellStart"/>
-                                <w:r>
-                                  <w:rPr>
-                                    <w:color w:val="FFFFFF" w:themeColor="background1"/>
-                                  </w:rPr>
-                                  <w:t>Indurjeeth</w:t>
-                                </w:r>
-                                <w:proofErr w:type="spellEnd"/>
-                                <w:r>
-                                  <w:rPr>
-                                    <w:color w:val="FFFFFF" w:themeColor="background1"/>
-                                  </w:rPr>
-                                  <w:t>: ST10438880</w:t>
+                                  <w:t>Kaehil Indurjeeth: ST10438880</w:t>
                                 </w:r>
                               </w:p>
                               <w:p>
@@ -275,7 +253,7 @@
                   </wp:anchor>
                 </w:drawing>
               </mc:Choice>
-              <mc:Fallback>
+              <mc:Fallback xmlns:w16cei="http://schemas.microsoft.com/office/word/2026/wordml/cei">
                 <w:pict>
                   <v:rect w14:anchorId="115719A1" id="Rectangle 16" o:spid="_x0000_s1026" style="position:absolute;margin-left:0;margin-top:0;width:422.3pt;height:760.1pt;z-index:251680768;visibility:visible;mso-wrap-style:square;mso-width-percent:690;mso-height-percent:960;mso-left-percent:20;mso-top-percent:20;mso-wrap-distance-left:9pt;mso-wrap-distance-top:0;mso-wrap-distance-right:9pt;mso-wrap-distance-bottom:0;mso-position-horizontal-relative:page;mso-position-vertical-relative:page;mso-width-percent:690;mso-height-percent:960;mso-left-percent:20;mso-top-percent:20;mso-width-relative:page;mso-height-relative:page;v-text-anchor:middle" o:gfxdata="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" fillcolor="#156082 [3204]" stroked="f">
                     <v:textbox inset="21.6pt,1in,21.6pt">
@@ -588,7 +566,7 @@
                   </wp:anchor>
                 </w:drawing>
               </mc:Choice>
-              <mc:Fallback>
+              <mc:Fallback xmlns:w16cei="http://schemas.microsoft.com/office/word/2026/wordml/cei">
                 <w:pict>
                   <v:rect w14:anchorId="7F210FE4" id="Rectangle 268" o:spid="_x0000_s1027" style="position:absolute;margin-left:0;margin-top:0;width:148.1pt;height:760.3pt;z-index:251681792;visibility:visible;mso-wrap-style:square;mso-width-percent:242;mso-height-percent:960;mso-left-percent:730;mso-wrap-distance-left:9pt;mso-wrap-distance-top:0;mso-wrap-distance-right:9pt;mso-wrap-distance-bottom:0;mso-position-horizontal-relative:page;mso-position-vertical:center;mso-position-vertical-relative:page;mso-width-percent:242;mso-height-percent:960;mso-left-percent:730;mso-width-relative:page;mso-height-relative:page;v-text-anchor:middle" o:gfxdata="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" fillcolor="#0e2841 [3215]" stroked="f" strokeweight="1.5pt">
                     <v:textbox inset="14.4pt,,14.4pt">
@@ -649,6 +627,13 @@
     </w:sdt>
     <w:sdt>
       <w:sdtPr>
+        <w:rPr>
+          <w:rFonts w:ascii="Calibri" w:eastAsia="Calibri" w:hAnsi="Calibri" w:cs="Calibri"/>
+          <w:color w:val="auto"/>
+          <w:sz w:val="22"/>
+          <w:szCs w:val="22"/>
+          <w:lang w:val="en-ZA" w:eastAsia="en-ZA"/>
+        </w:rPr>
         <w:id w:val="1282602897"/>
         <w:docPartObj>
           <w:docPartGallery w:val="Table of Contents"/>
@@ -657,14 +642,9 @@
       </w:sdtPr>
       <w:sdtEndPr>
         <w:rPr>
-          <w:rFonts w:ascii="Calibri" w:eastAsia="Calibri" w:hAnsi="Calibri" w:cs="Calibri"/>
           <w:b/>
           <w:bCs/>
           <w:noProof/>
-          <w:color w:val="auto"/>
-          <w:sz w:val="22"/>
-          <w:szCs w:val="22"/>
-          <w:lang w:val="en-ZA" w:eastAsia="en-ZA"/>
         </w:rPr>
       </w:sdtEndPr>
       <w:sdtContent>
@@ -3442,10 +3422,7 @@
       </w:pPr>
       <w:bookmarkStart w:id="3" w:name="_Toc238458717"/>
       <w:r>
-        <w:t xml:space="preserve">3.1. </w:t>
-      </w:r>
-      <w:r>
-        <w:t>UI-related requirements</w:t>
+        <w:t>3.1. UI-related requirements</w:t>
       </w:r>
       <w:bookmarkEnd w:id="3"/>
       <w:r>
@@ -3829,10 +3806,7 @@
       </w:pPr>
       <w:bookmarkStart w:id="6" w:name="_Toc238458720"/>
       <w:r>
-        <w:t xml:space="preserve">4.1. </w:t>
-      </w:r>
-      <w:r>
-        <w:t>Screen list and functional descriptions</w:t>
+        <w:t>4.1. Screen list and functional descriptions</w:t>
       </w:r>
       <w:bookmarkEnd w:id="6"/>
     </w:p>
@@ -3974,15 +3948,7 @@
         <w:t xml:space="preserve">Match detail &amp; rating: </w:t>
       </w:r>
       <w:r>
-        <w:t xml:space="preserve">Shows the counterpart's contact info once the match reaches Confirmed status, plus a </w:t>
-      </w:r>
-      <w:proofErr w:type="gramStart"/>
-      <w:r>
-        <w:t>thumbs</w:t>
-      </w:r>
-      <w:proofErr w:type="gramEnd"/>
-      <w:r>
-        <w:t>-up/thumbs-down rating control that appears once the match reaches Completed status (see the open question flagged in Section 5.3</w:t>
+        <w:t>Shows the counterpart's contact info once the match reaches Confirmed status, plus a thumbs-up/thumbs-down rating control that appears once the match reaches Completed status (see the open question flagged in Section 5.3</w:t>
       </w:r>
       <w:r>
         <w:t>,</w:t>
@@ -4062,10 +4028,7 @@
       <w:bookmarkStart w:id="7" w:name="_Toc238458721"/>
       <w:r>
         <w:lastRenderedPageBreak/>
-        <w:t xml:space="preserve">4.2. </w:t>
-      </w:r>
-      <w:r>
-        <w:t>Screen mock</w:t>
+        <w:t>4.2. Screen mock</w:t>
       </w:r>
       <w:r>
         <w:t>-</w:t>
@@ -4151,7 +4114,7 @@
               </wp:anchor>
             </w:drawing>
           </mc:Choice>
-          <mc:Fallback>
+          <mc:Fallback xmlns:w16cei="http://schemas.microsoft.com/office/word/2026/wordml/cei">
             <w:pict>
               <v:shapetype w14:anchorId="68C5B54F" id="_x0000_t202" coordsize="21600,21600" o:spt="202" path="m,l,21600r21600,l21600,xe">
                 <v:stroke joinstyle="miter"/>
@@ -4340,7 +4303,7 @@
               </wp:anchor>
             </w:drawing>
           </mc:Choice>
-          <mc:Fallback>
+          <mc:Fallback xmlns:w16cei="http://schemas.microsoft.com/office/word/2026/wordml/cei">
             <w:pict>
               <v:shape w14:anchorId="4E89FA69" id="_x0000_s1029" type="#_x0000_t202" style="position:absolute;margin-left:6pt;margin-top:430.9pt;width:188.25pt;height:.05pt;z-index:-251655168;visibility:visible;mso-wrap-style:square;mso-wrap-distance-left:9pt;mso-wrap-distance-top:0;mso-wrap-distance-right:9pt;mso-wrap-distance-bottom:0;mso-position-horizontal:absolute;mso-position-horizontal-relative:text;mso-position-vertical:absolute;mso-position-vertical-relative:text;v-text-anchor:top" o:gfxdata="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" filled="f" stroked="f">
                 <v:textbox style="mso-fit-shape-to-text:t" inset="0,0,0,0">
@@ -4537,7 +4500,7 @@
               </wp:anchor>
             </w:drawing>
           </mc:Choice>
-          <mc:Fallback>
+          <mc:Fallback xmlns:w16cei="http://schemas.microsoft.com/office/word/2026/wordml/cei">
             <w:pict>
               <v:shape w14:anchorId="1F7B14F6" id="_x0000_s1030" type="#_x0000_t202" style="position:absolute;margin-left:304.5pt;margin-top:430.35pt;width:188.25pt;height:.05pt;z-index:-251650048;visibility:visible;mso-wrap-style:square;mso-wrap-distance-left:9pt;mso-wrap-distance-top:0;mso-wrap-distance-right:9pt;mso-wrap-distance-bottom:0;mso-position-horizontal:absolute;mso-position-horizontal-relative:text;mso-position-vertical:absolute;mso-position-vertical-relative:text;v-text-anchor:top" o:gfxdata="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" filled="f" stroked="f">
                 <v:textbox style="mso-fit-shape-to-text:t" inset="0,0,0,0">
@@ -4722,7 +4685,7 @@
               </wp:anchor>
             </w:drawing>
           </mc:Choice>
-          <mc:Fallback>
+          <mc:Fallback xmlns:w16cei="http://schemas.microsoft.com/office/word/2026/wordml/cei">
             <w:pict>
               <v:shape w14:anchorId="372430DF" id="_x0000_s1031" type="#_x0000_t202" style="position:absolute;margin-left:6pt;margin-top:429.65pt;width:188.25pt;height:.05pt;z-index:-251651072;visibility:visible;mso-wrap-style:square;mso-wrap-distance-left:9pt;mso-wrap-distance-top:0;mso-wrap-distance-right:9pt;mso-wrap-distance-bottom:0;mso-position-horizontal:absolute;mso-position-horizontal-relative:text;mso-position-vertical:absolute;mso-position-vertical-relative:text;v-text-anchor:top" o:gfxdata="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" filled="f" stroked="f">
                 <v:textbox style="mso-fit-shape-to-text:t" inset="0,0,0,0">
@@ -5005,7 +4968,7 @@
               </wp:anchor>
             </w:drawing>
           </mc:Choice>
-          <mc:Fallback>
+          <mc:Fallback xmlns:w16cei="http://schemas.microsoft.com/office/word/2026/wordml/cei">
             <w:pict>
               <v:shape w14:anchorId="5FA84984" id="_x0000_s1032" type="#_x0000_t202" style="position:absolute;margin-left:6pt;margin-top:431.2pt;width:188.25pt;height:.05pt;z-index:-251646976;visibility:visible;mso-wrap-style:square;mso-wrap-distance-left:9pt;mso-wrap-distance-top:0;mso-wrap-distance-right:9pt;mso-wrap-distance-bottom:0;mso-position-horizontal:absolute;mso-position-horizontal-relative:text;mso-position-vertical:absolute;mso-position-vertical-relative:text;v-text-anchor:top" o:gfxdata="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" filled="f" stroked="f">
                 <v:textbox style="mso-fit-shape-to-text:t" inset="0,0,0,0">
@@ -5177,24 +5140,14 @@
                             <w:r>
                               <w:t xml:space="preserve">Figure </w:t>
                             </w:r>
-                            <w:r>
-                              <w:fldChar w:fldCharType="begin"/>
-                            </w:r>
-                            <w:r>
-                              <w:instrText xml:space="preserve"> SEQ Figure \* ARABIC </w:instrText>
-                            </w:r>
-                            <w:r>
-                              <w:fldChar w:fldCharType="separate"/>
-                            </w:r>
-                            <w:r>
-                              <w:rPr>
-                                <w:noProof/>
-                              </w:rPr>
-                              <w:t>6</w:t>
-                            </w:r>
-                            <w:r>
-                              <w:fldChar w:fldCharType="end"/>
-                            </w:r>
+                            <w:fldSimple w:instr=" SEQ Figure \* ARABIC ">
+                              <w:r>
+                                <w:rPr>
+                                  <w:noProof/>
+                                </w:rPr>
+                                <w:t>6</w:t>
+                              </w:r>
+                            </w:fldSimple>
                             <w:r>
                               <w:t>: Buyer Demand Board Screen</w:t>
                             </w:r>
@@ -5213,7 +5166,7 @@
               </wp:anchor>
             </w:drawing>
           </mc:Choice>
-          <mc:Fallback>
+          <mc:Fallback xmlns:w16cei="http://schemas.microsoft.com/office/word/2026/wordml/cei">
             <w:pict>
               <v:shape w14:anchorId="6A40D99E" id="_x0000_s1033" type="#_x0000_t202" style="position:absolute;margin-left:304.5pt;margin-top:431.65pt;width:188.25pt;height:.05pt;z-index:-251645952;visibility:visible;mso-wrap-style:square;mso-wrap-distance-left:9pt;mso-wrap-distance-top:0;mso-wrap-distance-right:9pt;mso-wrap-distance-bottom:0;mso-position-horizontal:absolute;mso-position-horizontal-relative:text;mso-position-vertical:absolute;mso-position-vertical-relative:text;v-text-anchor:top" o:gfxdata="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" filled="f" stroked="f">
                 <v:textbox style="mso-fit-shape-to-text:t" inset="0,0,0,0">
@@ -5353,7 +5306,7 @@
               </wp:anchor>
             </w:drawing>
           </mc:Choice>
-          <mc:Fallback>
+          <mc:Fallback xmlns:w16cei="http://schemas.microsoft.com/office/word/2026/wordml/cei">
             <w:pict>
               <v:shape w14:anchorId="1C192D12" id="_x0000_s1034" type="#_x0000_t202" style="position:absolute;margin-left:306pt;margin-top:430.9pt;width:187.95pt;height:.05pt;z-index:-251641856;visibility:visible;mso-wrap-style:square;mso-wrap-distance-left:9pt;mso-wrap-distance-top:0;mso-wrap-distance-right:9pt;mso-wrap-distance-bottom:0;mso-position-horizontal:absolute;mso-position-horizontal-relative:text;mso-position-vertical:absolute;mso-position-vertical-relative:text;v-text-anchor:top" o:gfxdata="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" filled="f" stroked="f">
                 <v:textbox style="mso-fit-shape-to-text:t" inset="0,0,0,0">
@@ -5537,7 +5490,7 @@
               </wp:anchor>
             </w:drawing>
           </mc:Choice>
-          <mc:Fallback>
+          <mc:Fallback xmlns:w16cei="http://schemas.microsoft.com/office/word/2026/wordml/cei">
             <w:pict>
               <v:shape w14:anchorId="6A93C761" id="_x0000_s1035" type="#_x0000_t202" style="position:absolute;margin-left:6pt;margin-top:431.65pt;width:187.75pt;height:.05pt;z-index:-251642880;visibility:visible;mso-wrap-style:square;mso-wrap-distance-left:9pt;mso-wrap-distance-top:0;mso-wrap-distance-right:9pt;mso-wrap-distance-bottom:0;mso-position-horizontal:absolute;mso-position-horizontal-relative:text;mso-position-vertical:absolute;mso-position-vertical-relative:text;v-text-anchor:top" o:gfxdata="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" filled="f" stroked="f">
                 <v:textbox style="mso-fit-shape-to-text:t" inset="0,0,0,0">
@@ -5743,7 +5696,7 @@
               </wp:anchor>
             </w:drawing>
           </mc:Choice>
-          <mc:Fallback>
+          <mc:Fallback xmlns:w16cei="http://schemas.microsoft.com/office/word/2026/wordml/cei">
             <w:pict>
               <v:shape w14:anchorId="19224FCD" id="_x0000_s1036" type="#_x0000_t202" style="position:absolute;margin-left:306pt;margin-top:430.45pt;width:188.25pt;height:.05pt;z-index:-251637760;visibility:visible;mso-wrap-style:square;mso-wrap-distance-left:9pt;mso-wrap-distance-top:0;mso-wrap-distance-right:9pt;mso-wrap-distance-bottom:0;mso-position-horizontal:absolute;mso-position-horizontal-relative:text;mso-position-vertical:absolute;mso-position-vertical-relative:text;v-text-anchor:top" o:gfxdata="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" filled="f" stroked="f">
                 <v:textbox style="mso-fit-shape-to-text:t" inset="0,0,0,0">
@@ -5915,18 +5868,7 @@
                             <w:r>
                               <w:t>Figure 9</w:t>
                             </w:r>
-                            <w:r>
-                              <w:fldChar w:fldCharType="begin"/>
-                            </w:r>
-                            <w:r>
-                              <w:instrText xml:space="preserve"> SEQ Figure \* ARABIC </w:instrText>
-                            </w:r>
-                            <w:r>
-                              <w:fldChar w:fldCharType="separate"/>
-                            </w:r>
-                            <w:r>
-                              <w:fldChar w:fldCharType="end"/>
-                            </w:r>
+                            <w:fldSimple w:instr=" SEQ Figure \* ARABIC "/>
                             <w:r>
                               <w:t>: Match Detail &amp; Rating Screen</w:t>
                             </w:r>
@@ -5945,7 +5887,7 @@
               </wp:anchor>
             </w:drawing>
           </mc:Choice>
-          <mc:Fallback>
+          <mc:Fallback xmlns:w16cei="http://schemas.microsoft.com/office/word/2026/wordml/cei">
             <w:pict>
               <v:shape w14:anchorId="449AECBE" id="_x0000_s1037" type="#_x0000_t202" style="position:absolute;margin-left:6pt;margin-top:430.4pt;width:188.25pt;height:.05pt;z-index:-251638784;visibility:visible;mso-wrap-style:square;mso-wrap-distance-left:9pt;mso-wrap-distance-top:0;mso-wrap-distance-right:9pt;mso-wrap-distance-bottom:0;mso-position-horizontal:absolute;mso-position-horizontal-relative:text;mso-position-vertical:absolute;mso-position-vertical-relative:text;v-text-anchor:top" o:gfxdata="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" filled="f" stroked="f">
                 <v:textbox style="mso-fit-shape-to-text:t" inset="0,0,0,0">
@@ -6090,16 +6032,7 @@
       <w:bookmarkStart w:id="8" w:name="_Toc238458722"/>
       <w:r>
         <w:lastRenderedPageBreak/>
-        <w:t xml:space="preserve">4.3. </w:t>
-      </w:r>
-      <w:r>
-        <w:t xml:space="preserve">Navigation </w:t>
-      </w:r>
-      <w:r>
-        <w:t>wire flow</w:t>
-      </w:r>
-      <w:r>
-        <w:t xml:space="preserve"> diagrams</w:t>
+        <w:t>4.3. Navigation wire flow diagrams</w:t>
       </w:r>
       <w:bookmarkEnd w:id="8"/>
     </w:p>
@@ -6442,7 +6375,6 @@
       <w:r>
         <w:t xml:space="preserve"> (String, required), </w:t>
       </w:r>
-      <w:proofErr w:type="spellStart"/>
       <w:r>
         <w:rPr>
           <w:b/>
@@ -6450,7 +6382,6 @@
         </w:rPr>
         <w:t>deviceLanguage</w:t>
       </w:r>
-      <w:proofErr w:type="spellEnd"/>
       <w:r>
         <w:t xml:space="preserve"> (String, optional</w:t>
       </w:r>
@@ -6959,7 +6890,6 @@
       <w:r>
         <w:t xml:space="preserve"> (latitude and longitude as Double), </w:t>
       </w:r>
-      <w:proofErr w:type="spellStart"/>
       <w:r>
         <w:rPr>
           <w:b/>
@@ -6967,7 +6897,6 @@
         </w:rPr>
         <w:t>farmName</w:t>
       </w:r>
-      <w:proofErr w:type="spellEnd"/>
       <w:r>
         <w:t xml:space="preserve"> (String</w:t>
       </w:r>
@@ -7353,7 +7282,6 @@
       <w:r>
         <w:t xml:space="preserve"> (Double latitude/longitude), </w:t>
       </w:r>
-      <w:proofErr w:type="spellStart"/>
       <w:r>
         <w:rPr>
           <w:b/>
@@ -7361,7 +7289,6 @@
         </w:rPr>
         <w:t>buyerName</w:t>
       </w:r>
-      <w:proofErr w:type="spellEnd"/>
       <w:r>
         <w:t xml:space="preserve"> (String</w:t>
       </w:r>
@@ -7819,7 +7746,7 @@
         <w:spacing w:line="276" w:lineRule="auto"/>
       </w:pPr>
       <w:r>
-        <w:t xml:space="preserve">Purpose: Records a one-time trust rating after a completed exchange.</w:t>
+        <w:t>Purpose: Records a one-time trust rating after a completed exchange.</w:t>
       </w:r>
     </w:p>
     <w:p>
@@ -7832,7 +7759,7 @@
         <w:spacing w:line="276" w:lineRule="auto"/>
       </w:pPr>
       <w:r>
-        <w:t xml:space="preserve">Request body: thumbsUp (Boolean)</w:t>
+        <w:t>Request body: thumbsUp (Boolean)</w:t>
       </w:r>
     </w:p>
     <w:p>
@@ -7845,7 +7772,7 @@
         <w:spacing w:line="276" w:lineRule="auto"/>
       </w:pPr>
       <w:r>
-        <w:t xml:space="preserve">Response (201 Created): ratingId (Guid), matchId (Guid), raisedByUserId (Guid), thumbsUp (Boolean), createdAt (DateTime)</w:t>
+        <w:t>Response (201 Created): ratingId (Guid), matchId (Guid), raisedByUserId (Guid), thumbsUp (Boolean), createdAt (DateTime)</w:t>
       </w:r>
     </w:p>
     <w:p>
@@ -7858,7 +7785,7 @@
         <w:spacing w:line="276" w:lineRule="auto"/>
       </w:pPr>
       <w:r>
-        <w:t xml:space="preserve">Validation: 403 Forbidden if the match's status is not "Completed"; 403 Forbidden if the calling user has already submitted a rating for this match.</w:t>
+        <w:t>Validation: 403 Forbidden if the match's status is not "Completed"; 403 Forbidden if the calling user has already submitted a rating for this match.</w:t>
       </w:r>
     </w:p>
     <w:p>
@@ -7887,7 +7814,7 @@
         <w:spacing w:line="276" w:lineRule="auto"/>
       </w:pPr>
       <w:r>
-        <w:t xml:space="preserve">Purpose: Returns the authenticated user's own rating for this match, so the client can hide or disable the rating control after submission without relying on local state.</w:t>
+        <w:t>Purpose: Returns the authenticated user's own rating for this match, so the client can hide or disable the rating control after submission without relying on local state.</w:t>
       </w:r>
     </w:p>
     <w:p>
@@ -7900,7 +7827,7 @@
         <w:spacing w:line="276" w:lineRule="auto"/>
       </w:pPr>
       <w:r>
-        <w:t xml:space="preserve">Response (200 OK): submitted (Boolean), thumbsUp (Boolean or null), createdAt (DateTime or null) — the last two are null when the caller hasn't rated this match yet.</w:t>
+        <w:t>Response (200 OK): submitted (Boolean), thumbsUp (Boolean or null), createdAt (DateTime or null) — the last two are null when the caller hasn't rated this match yet.</w:t>
       </w:r>
     </w:p>
     <w:p>
@@ -7917,7 +7844,6 @@
       </w:pPr>
       <w:bookmarkStart w:id="19" w:name="_Toc238458733"/>
       <w:r>
-        <w:lastRenderedPageBreak/>
         <w:t xml:space="preserve">5.3.7. </w:t>
       </w:r>
       <w:r>
@@ -7931,11 +7857,17 @@
         <w:spacing w:line="276" w:lineRule="auto"/>
       </w:pPr>
       <w:r>
+        <w:lastRenderedPageBreak/>
         <w:t>GET /calendar</w:t>
       </w:r>
     </w:p>
     <w:p>
       <w:pPr>
+        <w:pStyle w:val="ListParagraph"/>
+        <w:numPr>
+          <w:ilvl w:val="0"/>
+          <w:numId w:val="16"/>
+        </w:numPr>
         <w:spacing w:line="276" w:lineRule="auto"/>
       </w:pPr>
       <w:r>
@@ -7944,6 +7876,11 @@
     </w:p>
     <w:p>
       <w:pPr>
+        <w:pStyle w:val="ListParagraph"/>
+        <w:numPr>
+          <w:ilvl w:val="0"/>
+          <w:numId w:val="16"/>
+        </w:numPr>
         <w:spacing w:line="276" w:lineRule="auto"/>
       </w:pPr>
       <w:r>
@@ -7973,7 +7910,20 @@
         <w:t>year</w:t>
       </w:r>
       <w:r>
-        <w:t xml:space="preserve"> (Integer). Example: </w:t>
+        <w:t xml:space="preserve"> (Integer). </w:t>
+      </w:r>
+    </w:p>
+    <w:p>
+      <w:pPr>
+        <w:pStyle w:val="ListParagraph"/>
+        <w:numPr>
+          <w:ilvl w:val="0"/>
+          <w:numId w:val="16"/>
+        </w:numPr>
+        <w:spacing w:line="276" w:lineRule="auto"/>
+      </w:pPr>
+      <w:r>
+        <w:t xml:space="preserve">Example: </w:t>
       </w:r>
       <w:r>
         <w:rPr>
@@ -7987,6 +7937,11 @@
     </w:p>
     <w:p>
       <w:pPr>
+        <w:pStyle w:val="ListParagraph"/>
+        <w:numPr>
+          <w:ilvl w:val="0"/>
+          <w:numId w:val="16"/>
+        </w:numPr>
         <w:spacing w:line="276" w:lineRule="auto"/>
       </w:pPr>
       <w:r>
@@ -8133,7 +8088,7 @@
           <w:noProof/>
         </w:rPr>
         <w:drawing>
-          <wp:inline distT="0" distB="0" distL="0" distR="0" wp14:anchorId="626264AA" wp14:editId="371711F3">
+          <wp:inline distT="0" distB="0" distL="0" distR="0" wp14:anchorId="626264AA" wp14:editId="13E8BD3B">
             <wp:extent cx="5990326" cy="4105275"/>
             <wp:effectExtent l="76200" t="76200" r="125095" b="123825"/>
             <wp:docPr id="1254646097" name="Picture 1"/>
@@ -8228,7 +8183,7 @@
         </w:rPr>
         <w:lastRenderedPageBreak/>
         <w:drawing>
-          <wp:inline distT="0" distB="0" distL="0" distR="0" wp14:anchorId="7FAE58DD" wp14:editId="0B618424">
+          <wp:inline distT="0" distB="0" distL="0" distR="0" wp14:anchorId="7FAE58DD" wp14:editId="4786A806">
             <wp:extent cx="5924550" cy="3397800"/>
             <wp:effectExtent l="76200" t="76200" r="133350" b="127000"/>
             <wp:docPr id="1698985220" name="Picture 2"/>
@@ -9439,15 +9394,7 @@
               <w:spacing w:line="276" w:lineRule="auto"/>
             </w:pPr>
             <w:r>
-              <w:t xml:space="preserve">A DELETE call doesn't </w:t>
-            </w:r>
-            <w:proofErr w:type="gramStart"/>
-            <w:r>
-              <w:t>actually remove</w:t>
-            </w:r>
-            <w:proofErr w:type="gramEnd"/>
-            <w:r>
-              <w:t xml:space="preserve"> the document</w:t>
+              <w:t>A DELETE call doesn't actually remove the document</w:t>
             </w:r>
             <w:r>
               <w:t>:</w:t>
@@ -9650,13 +9597,8 @@
               <w:spacing w:line="276" w:lineRule="auto"/>
             </w:pPr>
             <w:r>
-              <w:t xml:space="preserve">Primary key, same as </w:t>
-            </w:r>
-            <w:proofErr w:type="spellStart"/>
-            <w:r>
-              <w:t>listingId</w:t>
-            </w:r>
-            <w:proofErr w:type="spellEnd"/>
+              <w:t>Primary key, same as listingId</w:t>
+            </w:r>
             <w:r>
               <w:t>:</w:t>
             </w:r>
@@ -10894,7 +10836,11 @@
         <w:spacing w:line="276" w:lineRule="auto"/>
       </w:pPr>
       <w:r>
-        <w:t xml:space="preserve">POST /matches/{matchId}/ratings won't accept anything until the match's status is Completed, and each user only gets one shot at it — both violations return a 403. Both the farmer and the buyer can rate each other, so a single completed match might end up with two Ratings documents (one per raisedByUserId) but never two from the same person. GET /matches/{matchId}/ratings returns only the caller's own rating for the match (or null if they haven't rated it yet), consistent with every other endpoint deriving identity from the auth token rather than exposing another user's data.</w:t>
+        <w:t xml:space="preserve">POST /matches/{matchId}/ratings won't accept anything until the match's status is Completed, and each user only gets one shot at it — both violations return a 403. Both the farmer and the buyer can rate each other, so a single completed match might end up with two Ratings documents (one per raisedByUserId) but never two from the same person. GET /matches/{matchId}/ratings returns only the caller's own rating for the match (or null if </w:t>
+      </w:r>
+      <w:r>
+        <w:lastRenderedPageBreak/>
+        <w:t>they haven't rated it yet), consistent with every other endpoint deriving identity from the auth token rather than exposing another user's data.</w:t>
       </w:r>
     </w:p>
     <w:p>
@@ -10909,7 +10855,6 @@
       </w:pPr>
       <w:bookmarkStart w:id="28" w:name="_Toc238458742"/>
       <w:r>
-        <w:lastRenderedPageBreak/>
         <w:t>7.6 Harvest calendar — not a persisted entity</w:t>
       </w:r>
       <w:bookmarkEnd w:id="28"/>
@@ -10992,97 +10937,134 @@
       </w:r>
       <w:bookmarkEnd w:id="29"/>
     </w:p>
-    <w:tbl>
-      <w:tblPr>
-        <w:tblW w:w="9640" w:type="dxa"/>
-        <w:tblBorders>
-          <w:top w:val="single" w:sz="4" w:space="0" w:color="auto"/>
-          <w:left w:val="single" w:sz="4" w:space="0" w:color="auto"/>
-          <w:bottom w:val="single" w:sz="4" w:space="0" w:color="auto"/>
-          <w:right w:val="single" w:sz="4" w:space="0" w:color="auto"/>
-          <w:insideH w:val="single" w:sz="4" w:space="0" w:color="auto"/>
-          <w:insideV w:val="single" w:sz="4" w:space="0" w:color="auto"/>
-        </w:tblBorders>
-        <w:tblCellMar>
-          <w:left w:w="10" w:type="dxa"/>
-          <w:right w:w="10" w:type="dxa"/>
-        </w:tblCellMar>
-        <w:tblLook w:val="04A0" w:firstRow="1" w:lastRow="0" w:firstColumn="1" w:lastColumn="0" w:noHBand="0" w:noVBand="1"/>
-      </w:tblPr>
-      <w:tblGrid>
-        <w:gridCol w:w="9640"/>
-      </w:tblGrid>
-      <w:tr>
-        <w:tc>
-          <w:tcPr>
-            <w:tcW w:w="9640" w:type="dxa"/>
-            <w:shd w:val="clear" w:color="auto" w:fill="FFF6E5"/>
-          </w:tcPr>
-          <w:p>
-            <w:pPr>
-              <w:spacing w:after="80" w:line="276" w:lineRule="auto"/>
-            </w:pPr>
-            <w:r>
-              <w:rPr>
-                <w:b/>
-                <w:bCs/>
-                <w:i/>
-                <w:iCs/>
-                <w:color w:val="8A5A00"/>
-                <w:sz w:val="20"/>
-                <w:szCs w:val="20"/>
-              </w:rPr>
-              <w:t>TO COMPLETE — Kaehil (or whoever owns final assembly)</w:t>
-            </w:r>
-          </w:p>
-          <w:p>
-            <w:pPr>
-              <w:spacing w:after="60" w:line="276" w:lineRule="auto"/>
-            </w:pPr>
-            <w:r>
-              <w:rPr>
-                <w:i/>
-                <w:iCs/>
-                <w:color w:val="5A4A2A"/>
-                <w:sz w:val="20"/>
-                <w:szCs w:val="20"/>
-              </w:rPr>
-              <w:t>Insert a visual Gantt chart with granular, specific engineering tasks (not vague phases) covering Part 1 through the final POE.</w:t>
-            </w:r>
-          </w:p>
-          <w:p>
-            <w:pPr>
-              <w:spacing w:after="60" w:line="276" w:lineRule="auto"/>
-            </w:pPr>
-            <w:r>
-              <w:rPr>
-                <w:i/>
-                <w:iCs/>
-                <w:color w:val="5A4A2A"/>
-                <w:sz w:val="20"/>
-                <w:szCs w:val="20"/>
-              </w:rPr>
-              <w:t>Explicitly allocate dedicated time for testing and bug-fixing cycles, as the brief requires.</w:t>
-            </w:r>
-          </w:p>
-          <w:p>
-            <w:pPr>
-              <w:spacing w:after="60" w:line="276" w:lineRule="auto"/>
-            </w:pPr>
-            <w:r>
-              <w:rPr>
-                <w:i/>
-                <w:iCs/>
-                <w:color w:val="5A4A2A"/>
-                <w:sz w:val="20"/>
-                <w:szCs w:val="20"/>
-              </w:rPr>
-              <w:t>The group's task-assignment breakdown from earlier can be adapted into this Gantt chart rather than rebuilt from scratch.</w:t>
-            </w:r>
-          </w:p>
-        </w:tc>
-      </w:tr>
-    </w:tbl>
+    <w:p>
+      <w:pPr>
+        <w:spacing w:after="200" w:line="276" w:lineRule="auto"/>
+        <w:jc w:val="center"/>
+        <w:rPr>
+          <w:i/>
+          <w:iCs/>
+          <w:color w:val="666666"/>
+          <w:sz w:val="18"/>
+          <w:szCs w:val="18"/>
+        </w:rPr>
+      </w:pPr>
+      <w:r>
+        <w:rPr>
+          <w:noProof/>
+        </w:rPr>
+        <w:drawing>
+          <wp:inline distT="0" distB="0" distL="0" distR="0" wp14:anchorId="1A2171D5" wp14:editId="46641D1C">
+            <wp:extent cx="6400800" cy="4925695"/>
+            <wp:effectExtent l="0" t="0" r="0" b="8255"/>
+            <wp:docPr id="1594176255" name="Picture 13"/>
+            <wp:cNvGraphicFramePr>
+              <a:graphicFrameLocks xmlns:a="http://schemas.openxmlformats.org/drawingml/2006/main" noChangeAspect="1"/>
+            </wp:cNvGraphicFramePr>
+            <a:graphic xmlns:a="http://schemas.openxmlformats.org/drawingml/2006/main">
+              <a:graphicData uri="http://schemas.openxmlformats.org/drawingml/2006/picture">
+                <pic:pic xmlns:pic="http://schemas.openxmlformats.org/drawingml/2006/picture">
+                  <pic:nvPicPr>
+                    <pic:cNvPr id="1594176255" name="Picture 1594176255"/>
+                    <pic:cNvPicPr/>
+                  </pic:nvPicPr>
+                  <pic:blipFill>
+                    <a:blip r:embed="rId23" cstate="print">
+                      <a:extLst>
+                        <a:ext uri="{28A0092B-C50C-407E-A947-70E740481C1C}">
+                          <a14:useLocalDpi xmlns:a14="http://schemas.microsoft.com/office/drawing/2010/main" val="0"/>
+                        </a:ext>
+                      </a:extLst>
+                    </a:blip>
+                    <a:stretch>
+                      <a:fillRect/>
+                    </a:stretch>
+                  </pic:blipFill>
+                  <pic:spPr>
+                    <a:xfrm>
+                      <a:off x="0" y="0"/>
+                      <a:ext cx="6400800" cy="4925695"/>
+                    </a:xfrm>
+                    <a:prstGeom prst="rect">
+                      <a:avLst/>
+                    </a:prstGeom>
+                  </pic:spPr>
+                </pic:pic>
+              </a:graphicData>
+            </a:graphic>
+          </wp:inline>
+        </w:drawing>
+      </w:r>
+      <w:r>
+        <w:rPr>
+          <w:i/>
+          <w:iCs/>
+          <w:color w:val="666666"/>
+          <w:sz w:val="18"/>
+          <w:szCs w:val="18"/>
+        </w:rPr>
+        <w:t xml:space="preserve"> </w:t>
+      </w:r>
+      <w:r>
+        <w:rPr>
+          <w:i/>
+          <w:iCs/>
+          <w:color w:val="666666"/>
+          <w:sz w:val="18"/>
+          <w:szCs w:val="18"/>
+        </w:rPr>
+        <w:t>Figure 1</w:t>
+      </w:r>
+      <w:r>
+        <w:rPr>
+          <w:i/>
+          <w:iCs/>
+          <w:color w:val="666666"/>
+          <w:sz w:val="18"/>
+          <w:szCs w:val="18"/>
+        </w:rPr>
+        <w:t>5</w:t>
+      </w:r>
+      <w:r>
+        <w:rPr>
+          <w:i/>
+          <w:iCs/>
+          <w:color w:val="666666"/>
+          <w:sz w:val="18"/>
+          <w:szCs w:val="18"/>
+        </w:rPr>
+        <w:t xml:space="preserve">:  </w:t>
+      </w:r>
+      <w:r>
+        <w:rPr>
+          <w:i/>
+          <w:iCs/>
+          <w:color w:val="666666"/>
+          <w:sz w:val="18"/>
+          <w:szCs w:val="18"/>
+        </w:rPr>
+        <w:t>FromTheFarm Project Management Plan</w:t>
+      </w:r>
+    </w:p>
+    <w:p>
+      <w:pPr>
+        <w:rPr>
+          <w:rStyle w:val="SubtleEmphasis"/>
+          <w:i w:val="0"/>
+          <w:iCs w:val="0"/>
+          <w:color w:val="000000" w:themeColor="text1"/>
+        </w:rPr>
+      </w:pPr>
+      <w:r>
+        <w:rPr>
+          <w:rStyle w:val="SubtleEmphasis"/>
+          <w:i w:val="0"/>
+          <w:iCs w:val="0"/>
+          <w:color w:val="000000" w:themeColor="text1"/>
+        </w:rPr>
+        <w:t>Above is an overview of the deliverables and development plan for FromTheFarm, colour coded bars align with individual activities, spread out across the team’s allotted timeline. An in-depth Gantt chart has been documented in our development repository, and may be viewed for further details.</w:t>
+      </w:r>
+    </w:p>
     <w:p>
       <w:pPr>
         <w:spacing w:line="276" w:lineRule="auto"/>
@@ -11138,39 +11120,7 @@
         <w:spacing w:line="276" w:lineRule="auto"/>
       </w:pPr>
       <w:r>
-        <w:t xml:space="preserve">The table below scores Khula! Inputs &amp; Trader, Farmer's Market, and </w:t>
-      </w:r>
-      <w:proofErr w:type="spellStart"/>
-      <w:r>
-        <w:t>Farmsell</w:t>
-      </w:r>
-      <w:proofErr w:type="spellEnd"/>
-      <w:r>
-        <w:t xml:space="preserve"> against From </w:t>
-      </w:r>
-      <w:proofErr w:type="gramStart"/>
-      <w:r>
-        <w:t>The</w:t>
-      </w:r>
-      <w:proofErr w:type="gramEnd"/>
-      <w:r>
-        <w:t xml:space="preserve"> Farm across the same criteria used throughout the Competitive Analysis. Where direct testing was blocked (Farmer's Market's paywall) or a feature was simply never observed (</w:t>
-      </w:r>
-      <w:proofErr w:type="spellStart"/>
-      <w:r>
-        <w:t>Khula!'s</w:t>
-      </w:r>
-      <w:proofErr w:type="spellEnd"/>
-      <w:r>
-        <w:t xml:space="preserve"> testing, </w:t>
-      </w:r>
-      <w:proofErr w:type="spellStart"/>
-      <w:r>
-        <w:t>Farmsell's</w:t>
-      </w:r>
-      <w:proofErr w:type="spellEnd"/>
-      <w:r>
-        <w:t xml:space="preserve"> confirmed gaps), this is marked explicitly rather than assumed.</w:t>
+        <w:t>The table below scores Khula! Inputs &amp; Trader, Farmer's Market, and Farmsell against From The Farm across the same criteria used throughout the Competitive Analysis. Where direct testing was blocked (Farmer's Market's paywall) or a feature was simply never observed (Khula!'s testing, Farmsell's confirmed gaps), this is marked explicitly rather than assumed.</w:t>
       </w:r>
     </w:p>
     <w:tbl>
@@ -11261,7 +11211,6 @@
             <w:pPr>
               <w:spacing w:line="276" w:lineRule="auto"/>
             </w:pPr>
-            <w:proofErr w:type="spellStart"/>
             <w:r>
               <w:rPr>
                 <w:b/>
@@ -11269,7 +11218,6 @@
               </w:rPr>
               <w:t>Farmsell</w:t>
             </w:r>
-            <w:proofErr w:type="spellEnd"/>
           </w:p>
         </w:tc>
         <w:tc>
@@ -11452,15 +11400,7 @@
               <w:spacing w:line="276" w:lineRule="auto"/>
             </w:pPr>
             <w:r>
-              <w:t xml:space="preserve">Narrow, single purpose: </w:t>
-            </w:r>
-            <w:proofErr w:type="gramStart"/>
-            <w:r>
-              <w:t>proximity based</w:t>
-            </w:r>
-            <w:proofErr w:type="gramEnd"/>
-            <w:r>
-              <w:t xml:space="preserve"> farmer-to-buyer matching only</w:t>
+              <w:t>Narrow, single purpose: proximity based farmer-to-buyer matching only</w:t>
             </w:r>
           </w:p>
         </w:tc>
@@ -11979,15 +11919,7 @@
               <w:spacing w:line="276" w:lineRule="auto"/>
             </w:pPr>
             <w:r>
-              <w:t xml:space="preserve">MVVM; mature </w:t>
-            </w:r>
-            <w:proofErr w:type="spellStart"/>
-            <w:r>
-              <w:t>RecyclerView</w:t>
-            </w:r>
-            <w:proofErr w:type="spellEnd"/>
-            <w:r>
-              <w:t xml:space="preserve"> with partial Compose migration</w:t>
+              <w:t>MVVM; mature RecyclerView with partial Compose migration</w:t>
             </w:r>
           </w:p>
         </w:tc>
@@ -12000,21 +11932,8 @@
               <w:spacing w:line="276" w:lineRule="auto"/>
             </w:pPr>
             <w:r>
-              <w:t xml:space="preserve">MVVM (probable); XML layouts with </w:t>
-            </w:r>
-            <w:proofErr w:type="spellStart"/>
-            <w:r>
-              <w:t>ViewModel</w:t>
-            </w:r>
-            <w:proofErr w:type="spellEnd"/>
-            <w:r>
-              <w:t>/</w:t>
-            </w:r>
-            <w:proofErr w:type="spellStart"/>
-            <w:r>
-              <w:t>LiveData</w:t>
-            </w:r>
-            <w:proofErr w:type="spellEnd"/>
+              <w:t>MVVM (probable); XML layouts with ViewModel/LiveData</w:t>
+            </w:r>
           </w:p>
         </w:tc>
         <w:tc>
@@ -12026,13 +11945,8 @@
               <w:spacing w:line="276" w:lineRule="auto"/>
             </w:pPr>
             <w:r>
-              <w:t xml:space="preserve">MVVM (probable); Compose or advanced </w:t>
-            </w:r>
-            <w:proofErr w:type="spellStart"/>
-            <w:r>
-              <w:t>RecyclerView</w:t>
-            </w:r>
-            <w:proofErr w:type="spellEnd"/>
+              <w:t>MVVM (probable); Compose or advanced RecyclerView</w:t>
+            </w:r>
           </w:p>
         </w:tc>
         <w:tc>
@@ -12082,10 +11996,7 @@
       <w:bookmarkStart w:id="31" w:name="_Toc238458745"/>
       <w:r>
         <w:lastRenderedPageBreak/>
-        <w:t>10</w:t>
-      </w:r>
-      <w:r>
-        <w:t>. Conclusion</w:t>
+        <w:t>10. Conclusion</w:t>
       </w:r>
       <w:bookmarkEnd w:id="31"/>
     </w:p>
@@ -12094,15 +12005,7 @@
         <w:spacing w:line="276" w:lineRule="auto"/>
       </w:pPr>
       <w:r>
-        <w:t xml:space="preserve">This Planning and Design Document has translated the From </w:t>
-      </w:r>
-      <w:proofErr w:type="gramStart"/>
-      <w:r>
-        <w:t>The</w:t>
-      </w:r>
-      <w:proofErr w:type="gramEnd"/>
-      <w:r>
-        <w:t xml:space="preserve"> Farm concept into a complete technical blueprint ready for implementation in Part 2. The application's scope has been deliberately bounded throughout</w:t>
+        <w:t>This Planning and Design Document has translated the From The Farm concept into a complete technical blueprint ready for implementation in Part 2. The application's scope has been deliberately bounded throughout</w:t>
       </w:r>
       <w:r>
         <w:t>,</w:t>
@@ -12296,7 +12199,7 @@
       <w:r>
         <w:t xml:space="preserve">. [App] Available at: </w:t>
       </w:r>
-      <w:hyperlink r:id="rId23" w:history="1">
+      <w:hyperlink r:id="rId24" w:history="1">
         <w:r>
           <w:rPr>
             <w:rStyle w:val="Hyperlink"/>
@@ -12330,7 +12233,7 @@
       <w:r>
         <w:t xml:space="preserve">. [online] Available at: </w:t>
       </w:r>
-      <w:hyperlink r:id="rId24" w:history="1">
+      <w:hyperlink r:id="rId25" w:history="1">
         <w:r>
           <w:rPr>
             <w:rStyle w:val="Hyperlink"/>
@@ -12364,7 +12267,7 @@
       <w:r>
         <w:t xml:space="preserve">. [App] Available at: </w:t>
       </w:r>
-      <w:hyperlink r:id="rId25" w:history="1">
+      <w:hyperlink r:id="rId26" w:history="1">
         <w:r>
           <w:rPr>
             <w:rStyle w:val="Hyperlink"/>
@@ -12388,51 +12291,17 @@
       <w:r>
         <w:t xml:space="preserve">Google Play, 2026. </w:t>
       </w:r>
-      <w:proofErr w:type="spellStart"/>
       <w:r>
         <w:rPr>
           <w:i/>
           <w:iCs/>
         </w:rPr>
-        <w:t>Farmsell</w:t>
-      </w:r>
-      <w:proofErr w:type="spellEnd"/>
-      <w:r>
-        <w:rPr>
-          <w:i/>
-          <w:iCs/>
-        </w:rPr>
-        <w:t xml:space="preserve">: </w:t>
-      </w:r>
-      <w:proofErr w:type="spellStart"/>
-      <w:r>
-        <w:rPr>
-          <w:i/>
-          <w:iCs/>
-        </w:rPr>
-        <w:t>Buy&amp;Sell</w:t>
-      </w:r>
-      <w:proofErr w:type="spellEnd"/>
-      <w:r>
-        <w:rPr>
-          <w:i/>
-          <w:iCs/>
-        </w:rPr>
-        <w:t xml:space="preserve"> </w:t>
-      </w:r>
-      <w:proofErr w:type="spellStart"/>
-      <w:r>
-        <w:rPr>
-          <w:i/>
-          <w:iCs/>
-        </w:rPr>
-        <w:t>Agroproduce</w:t>
-      </w:r>
-      <w:proofErr w:type="spellEnd"/>
+        <w:t>Farmsell: Buy&amp;Sell Agroproduce</w:t>
+      </w:r>
       <w:r>
         <w:t xml:space="preserve">. [App] Available at: </w:t>
       </w:r>
-      <w:hyperlink r:id="rId26" w:history="1">
+      <w:hyperlink r:id="rId27" w:history="1">
         <w:r>
           <w:rPr>
             <w:rStyle w:val="Hyperlink"/>
@@ -12466,7 +12335,7 @@
       <w:r>
         <w:t xml:space="preserve">. [App] Available at: </w:t>
       </w:r>
-      <w:hyperlink r:id="rId27" w:history="1">
+      <w:hyperlink r:id="rId28" w:history="1">
         <w:r>
           <w:rPr>
             <w:rStyle w:val="Hyperlink"/>
@@ -12500,7 +12369,7 @@
       <w:r>
         <w:t xml:space="preserve">. [App] Available at: </w:t>
       </w:r>
-      <w:hyperlink r:id="rId28" w:history="1">
+      <w:hyperlink r:id="rId29" w:history="1">
         <w:r>
           <w:rPr>
             <w:rStyle w:val="Hyperlink"/>
@@ -12534,7 +12403,7 @@
       <w:r>
         <w:t xml:space="preserve">. [online] Available at: </w:t>
       </w:r>
-      <w:hyperlink r:id="rId29" w:history="1">
+      <w:hyperlink r:id="rId30" w:history="1">
         <w:r>
           <w:rPr>
             <w:rStyle w:val="Hyperlink"/>
@@ -12568,7 +12437,7 @@
       <w:r>
         <w:t xml:space="preserve">. [online] Available at: </w:t>
       </w:r>
-      <w:hyperlink r:id="rId30" w:history="1">
+      <w:hyperlink r:id="rId31" w:history="1">
         <w:r>
           <w:rPr>
             <w:rStyle w:val="Hyperlink"/>
@@ -12602,7 +12471,7 @@
       </w:pPr>
     </w:p>
     <w:sectPr>
-      <w:footerReference w:type="default" r:id="rId31"/>
+      <w:footerReference w:type="default" r:id="rId32"/>
       <w:pgSz w:w="12240" w:h="15840"/>
       <w:pgMar w:top="1080" w:right="1080" w:bottom="1080" w:left="1080" w:header="708" w:footer="708" w:gutter="0"/>
       <w:pgNumType w:start="0"/>
@@ -12615,7 +12484,7 @@
 </file>
 
 <file path=word/endnotes.xml><?xml version="1.0" encoding="utf-8"?>
-<w:endnotes xmlns:wpc="http://schemas.microsoft.com/office/word/2010/wordprocessingCanvas" xmlns:cx="http://schemas.microsoft.com/office/drawing/2014/chartex" xmlns:cx1="http://schemas.microsoft.com/office/drawing/2015/9/8/chartex" xmlns:cx2="http://schemas.microsoft.com/office/drawing/2015/10/21/chartex" xmlns:cx3="http://schemas.microsoft.com/office/drawing/2016/5/9/chartex" xmlns:cx4="http://schemas.microsoft.com/office/drawing/2016/5/10/chartex" xmlns:cx5="http://schemas.microsoft.com/office/drawing/2016/5/11/chartex" xmlns:cx6="http://schemas.microsoft.com/office/drawing/2016/5/12/chartex" xmlns:cx7="http://schemas.microsoft.com/office/drawing/2016/5/13/chartex" xmlns:cx8="http://schemas.microsoft.com/office/drawing/2016/5/14/chartex" xmlns:mc="http://schemas.openxmlformats.org/markup-compatibility/2006" xmlns:aink="http://schemas.microsoft.com/office/drawing/2016/ink" xmlns:am3d="http://schemas.microsoft.com/office/drawing/2017/model3d" xmlns:o="urn:schemas-microsoft-com:office:office" xmlns:oel="http://schemas.microsoft.com/office/2019/extlst" xmlns:r="http://schemas.openxmlformats.org/officeDocument/2006/relationships" xmlns:m="http://schemas.openxmlformats.org/officeDocument/2006/math" xmlns:v="urn:schemas-microsoft-com:vml" xmlns:wp14="http://schemas.microsoft.com/office/word/2010/wordprocessingDrawing" xmlns:wp="http://schemas.openxmlformats.org/drawingml/2006/wordprocessingDrawing" xmlns:w10="urn:schemas-microsoft-com:office:word" xmlns:w="http://schemas.openxmlformats.org/wordprocessingml/2006/main" xmlns:w14="http://schemas.microsoft.com/office/word/2010/wordml" xmlns:w15="http://schemas.microsoft.com/office/word/2012/wordml" xmlns:w16cei="http://schemas.microsoft.com/office/word/2026/wordml/cei" xmlns:w16cex="http://schemas.microsoft.com/office/word/2018/wordml/cex" xmlns:w16cid="http://schemas.microsoft.com/office/word/2016/wordml/cid" xmlns:w16="http://schemas.microsoft.com/office/word/2018/wordml" xmlns:w16du="http://schemas.microsoft.com/office/word/2023/wordml/word16du" xmlns:w16sdtdh="http://schemas.microsoft.com/office/word/2020/wordml/sdtdatahash" xmlns:w16sdtfl="http://schemas.microsoft.com/office/word/2024/wordml/sdtformatlock" xmlns:w16se="http://schemas.microsoft.com/office/word/2015/wordml/symex" xmlns:wpg="http://schemas.microsoft.com/office/word/2010/wordprocessingGroup" xmlns:wpi="http://schemas.microsoft.com/office/word/2010/wordprocessingInk" xmlns:wne="http://schemas.microsoft.com/office/word/2006/wordml" xmlns:wps="http://schemas.microsoft.com/office/word/2010/wordprocessingShape" mc:Ignorable="w14 w15 w16se w16cid w16 w16cex w16sdtdh w16sdtfl w16du wp14">
+<w:endnotes xmlns:wpc="http://schemas.microsoft.com/office/word/2010/wordprocessingCanvas" xmlns:cx="http://schemas.microsoft.com/office/drawing/2014/chartex" xmlns:cx1="http://schemas.microsoft.com/office/drawing/2015/9/8/chartex" xmlns:cx2="http://schemas.microsoft.com/office/drawing/2015/10/21/chartex" xmlns:cx3="http://schemas.microsoft.com/office/drawing/2016/5/9/chartex" xmlns:cx4="http://schemas.microsoft.com/office/drawing/2016/5/10/chartex" xmlns:cx5="http://schemas.microsoft.com/office/drawing/2016/5/11/chartex" xmlns:cx6="http://schemas.microsoft.com/office/drawing/2016/5/12/chartex" xmlns:cx7="http://schemas.microsoft.com/office/drawing/2016/5/13/chartex" xmlns:cx8="http://schemas.microsoft.com/office/drawing/2016/5/14/chartex" xmlns:mc="http://schemas.openxmlformats.org/markup-compatibility/2006" xmlns:aink="http://schemas.microsoft.com/office/drawing/2016/ink" xmlns:am3d="http://schemas.microsoft.com/office/drawing/2017/model3d" xmlns:o="urn:schemas-microsoft-com:office:office" xmlns:oel="http://schemas.microsoft.com/office/2019/extlst" xmlns:r="http://schemas.openxmlformats.org/officeDocument/2006/relationships" xmlns:m="http://schemas.openxmlformats.org/officeDocument/2006/math" xmlns:v="urn:schemas-microsoft-com:vml" xmlns:wp14="http://schemas.microsoft.com/office/word/2010/wordprocessingDrawing" xmlns:wp="http://schemas.openxmlformats.org/drawingml/2006/wordprocessingDrawing" xmlns:w10="urn:schemas-microsoft-com:office:word" xmlns:w="http://schemas.openxmlformats.org/wordprocessingml/2006/main" xmlns:w14="http://schemas.microsoft.com/office/word/2010/wordml" xmlns:w15="http://schemas.microsoft.com/office/word/2012/wordml" xmlns:w16cex="http://schemas.microsoft.com/office/word/2018/wordml/cex" xmlns:w16cid="http://schemas.microsoft.com/office/word/2016/wordml/cid" xmlns:w16="http://schemas.microsoft.com/office/word/2018/wordml" xmlns:w16du="http://schemas.microsoft.com/office/word/2023/wordml/word16du" xmlns:w16sdtdh="http://schemas.microsoft.com/office/word/2020/wordml/sdtdatahash" xmlns:w16sdtfl="http://schemas.microsoft.com/office/word/2024/wordml/sdtformatlock" xmlns:w16se="http://schemas.microsoft.com/office/word/2015/wordml/symex" xmlns:wpg="http://schemas.microsoft.com/office/word/2010/wordprocessingGroup" xmlns:wpi="http://schemas.microsoft.com/office/word/2010/wordprocessingInk" xmlns:wne="http://schemas.microsoft.com/office/word/2006/wordml" xmlns:wps="http://schemas.microsoft.com/office/word/2010/wordprocessingShape" mc:Ignorable="w14 w15 w16se w16cid w16 w16cex w16sdtdh w16sdtfl w16du wp14">
   <w:endnote w:type="separator" w:id="-1">
     <w:p>
       <w:r>
@@ -12634,7 +12503,7 @@
 </file>
 
 <file path=word/footer1.xml><?xml version="1.0" encoding="utf-8"?>
-<w:ftr xmlns:wpc="http://schemas.microsoft.com/office/word/2010/wordprocessingCanvas" xmlns:cx="http://schemas.microsoft.com/office/drawing/2014/chartex" xmlns:cx1="http://schemas.microsoft.com/office/drawing/2015/9/8/chartex" xmlns:cx2="http://schemas.microsoft.com/office/drawing/2015/10/21/chartex" xmlns:cx3="http://schemas.microsoft.com/office/drawing/2016/5/9/chartex" xmlns:cx4="http://schemas.microsoft.com/office/drawing/2016/5/10/chartex" xmlns:cx5="http://schemas.microsoft.com/office/drawing/2016/5/11/chartex" xmlns:cx6="http://schemas.microsoft.com/office/drawing/2016/5/12/chartex" xmlns:cx7="http://schemas.microsoft.com/office/drawing/2016/5/13/chartex" xmlns:cx8="http://schemas.microsoft.com/office/drawing/2016/5/14/chartex" xmlns:mc="http://schemas.openxmlformats.org/markup-compatibility/2006" xmlns:aink="http://schemas.microsoft.com/office/drawing/2016/ink" xmlns:am3d="http://schemas.microsoft.com/office/drawing/2017/model3d" xmlns:o="urn:schemas-microsoft-com:office:office" xmlns:oel="http://schemas.microsoft.com/office/2019/extlst" xmlns:r="http://schemas.openxmlformats.org/officeDocument/2006/relationships" xmlns:m="http://schemas.openxmlformats.org/officeDocument/2006/math" xmlns:v="urn:schemas-microsoft-com:vml" xmlns:wp14="http://schemas.microsoft.com/office/word/2010/wordprocessingDrawing" xmlns:wp="http://schemas.openxmlformats.org/drawingml/2006/wordprocessingDrawing" xmlns:w10="urn:schemas-microsoft-com:office:word" xmlns:w="http://schemas.openxmlformats.org/wordprocessingml/2006/main" xmlns:w14="http://schemas.microsoft.com/office/word/2010/wordml" xmlns:w15="http://schemas.microsoft.com/office/word/2012/wordml" xmlns:w16cei="http://schemas.microsoft.com/office/word/2026/wordml/cei" xmlns:w16cex="http://schemas.microsoft.com/office/word/2018/wordml/cex" xmlns:w16cid="http://schemas.microsoft.com/office/word/2016/wordml/cid" xmlns:w16="http://schemas.microsoft.com/office/word/2018/wordml" xmlns:w16du="http://schemas.microsoft.com/office/word/2023/wordml/word16du" xmlns:w16sdtdh="http://schemas.microsoft.com/office/word/2020/wordml/sdtdatahash" xmlns:w16sdtfl="http://schemas.microsoft.com/office/word/2024/wordml/sdtformatlock" xmlns:w16se="http://schemas.microsoft.com/office/word/2015/wordml/symex" xmlns:wpg="http://schemas.microsoft.com/office/word/2010/wordprocessingGroup" xmlns:wpi="http://schemas.microsoft.com/office/word/2010/wordprocessingInk" xmlns:wne="http://schemas.microsoft.com/office/word/2006/wordml" xmlns:wps="http://schemas.microsoft.com/office/word/2010/wordprocessingShape" mc:Ignorable="w14 w15 w16se w16cid w16 w16cex w16sdtdh w16sdtfl w16du wp14">
+<w:ftr xmlns:wpc="http://schemas.microsoft.com/office/word/2010/wordprocessingCanvas" xmlns:cx="http://schemas.microsoft.com/office/drawing/2014/chartex" xmlns:cx1="http://schemas.microsoft.com/office/drawing/2015/9/8/chartex" xmlns:cx2="http://schemas.microsoft.com/office/drawing/2015/10/21/chartex" xmlns:cx3="http://schemas.microsoft.com/office/drawing/2016/5/9/chartex" xmlns:cx4="http://schemas.microsoft.com/office/drawing/2016/5/10/chartex" xmlns:cx5="http://schemas.microsoft.com/office/drawing/2016/5/11/chartex" xmlns:cx6="http://schemas.microsoft.com/office/drawing/2016/5/12/chartex" xmlns:cx7="http://schemas.microsoft.com/office/drawing/2016/5/13/chartex" xmlns:cx8="http://schemas.microsoft.com/office/drawing/2016/5/14/chartex" xmlns:mc="http://schemas.openxmlformats.org/markup-compatibility/2006" xmlns:aink="http://schemas.microsoft.com/office/drawing/2016/ink" xmlns:am3d="http://schemas.microsoft.com/office/drawing/2017/model3d" xmlns:o="urn:schemas-microsoft-com:office:office" xmlns:oel="http://schemas.microsoft.com/office/2019/extlst" xmlns:r="http://schemas.openxmlformats.org/officeDocument/2006/relationships" xmlns:m="http://schemas.openxmlformats.org/officeDocument/2006/math" xmlns:v="urn:schemas-microsoft-com:vml" xmlns:wp14="http://schemas.microsoft.com/office/word/2010/wordprocessingDrawing" xmlns:wp="http://schemas.openxmlformats.org/drawingml/2006/wordprocessingDrawing" xmlns:w10="urn:schemas-microsoft-com:office:word" xmlns:w="http://schemas.openxmlformats.org/wordprocessingml/2006/main" xmlns:w14="http://schemas.microsoft.com/office/word/2010/wordml" xmlns:w15="http://schemas.microsoft.com/office/word/2012/wordml" xmlns:w16cex="http://schemas.microsoft.com/office/word/2018/wordml/cex" xmlns:w16cid="http://schemas.microsoft.com/office/word/2016/wordml/cid" xmlns:w16="http://schemas.microsoft.com/office/word/2018/wordml" xmlns:w16du="http://schemas.microsoft.com/office/word/2023/wordml/word16du" xmlns:w16sdtdh="http://schemas.microsoft.com/office/word/2020/wordml/sdtdatahash" xmlns:w16sdtfl="http://schemas.microsoft.com/office/word/2024/wordml/sdtformatlock" xmlns:w16se="http://schemas.microsoft.com/office/word/2015/wordml/symex" xmlns:wpg="http://schemas.microsoft.com/office/word/2010/wordprocessingGroup" xmlns:wpi="http://schemas.microsoft.com/office/word/2010/wordprocessingInk" xmlns:wne="http://schemas.microsoft.com/office/word/2006/wordml" xmlns:wps="http://schemas.microsoft.com/office/word/2010/wordprocessingShape" mc:Ignorable="w14 w15 w16se w16cid w16 w16cex w16sdtdh w16sdtfl w16du wp14">
   <w:sdt>
     <w:sdtPr>
       <w:id w:val="-30342350"/>
@@ -12701,7 +12570,7 @@
 </file>
 
 <file path=word/footnotes.xml><?xml version="1.0" encoding="utf-8"?>
-<w:footnotes xmlns:wpc="http://schemas.microsoft.com/office/word/2010/wordprocessingCanvas" xmlns:cx="http://schemas.microsoft.com/office/drawing/2014/chartex" xmlns:cx1="http://schemas.microsoft.com/office/drawing/2015/9/8/chartex" xmlns:cx2="http://schemas.microsoft.com/office/drawing/2015/10/21/chartex" xmlns:cx3="http://schemas.microsoft.com/office/drawing/2016/5/9/chartex" xmlns:cx4="http://schemas.microsoft.com/office/drawing/2016/5/10/chartex" xmlns:cx5="http://schemas.microsoft.com/office/drawing/2016/5/11/chartex" xmlns:cx6="http://schemas.microsoft.com/office/drawing/2016/5/12/chartex" xmlns:cx7="http://schemas.microsoft.com/office/drawing/2016/5/13/chartex" xmlns:cx8="http://schemas.microsoft.com/office/drawing/2016/5/14/chartex" xmlns:mc="http://schemas.openxmlformats.org/markup-compatibility/2006" xmlns:aink="http://schemas.microsoft.com/office/drawing/2016/ink" xmlns:am3d="http://schemas.microsoft.com/office/drawing/2017/model3d" xmlns:o="urn:schemas-microsoft-com:office:office" xmlns:oel="http://schemas.microsoft.com/office/2019/extlst" xmlns:r="http://schemas.openxmlformats.org/officeDocument/2006/relationships" xmlns:m="http://schemas.openxmlformats.org/officeDocument/2006/math" xmlns:v="urn:schemas-microsoft-com:vml" xmlns:wp14="http://schemas.microsoft.com/office/word/2010/wordprocessingDrawing" xmlns:wp="http://schemas.openxmlformats.org/drawingml/2006/wordprocessingDrawing" xmlns:w10="urn:schemas-microsoft-com:office:word" xmlns:w="http://schemas.openxmlformats.org/wordprocessingml/2006/main" xmlns:w14="http://schemas.microsoft.com/office/word/2010/wordml" xmlns:w15="http://schemas.microsoft.com/office/word/2012/wordml" xmlns:w16cei="http://schemas.microsoft.com/office/word/2026/wordml/cei" xmlns:w16cex="http://schemas.microsoft.com/office/word/2018/wordml/cex" xmlns:w16cid="http://schemas.microsoft.com/office/word/2016/wordml/cid" xmlns:w16="http://schemas.microsoft.com/office/word/2018/wordml" xmlns:w16du="http://schemas.microsoft.com/office/word/2023/wordml/word16du" xmlns:w16sdtdh="http://schemas.microsoft.com/office/word/2020/wordml/sdtdatahash" xmlns:w16sdtfl="http://schemas.microsoft.com/office/word/2024/wordml/sdtformatlock" xmlns:w16se="http://schemas.microsoft.com/office/word/2015/wordml/symex" xmlns:wpg="http://schemas.microsoft.com/office/word/2010/wordprocessingGroup" xmlns:wpi="http://schemas.microsoft.com/office/word/2010/wordprocessingInk" xmlns:wne="http://schemas.microsoft.com/office/word/2006/wordml" xmlns:wps="http://schemas.microsoft.com/office/word/2010/wordprocessingShape" mc:Ignorable="w14 w15 w16se w16cid w16 w16cex w16sdtdh w16sdtfl w16du wp14">
+<w:footnotes xmlns:wpc="http://schemas.microsoft.com/office/word/2010/wordprocessingCanvas" xmlns:cx="http://schemas.microsoft.com/office/drawing/2014/chartex" xmlns:cx1="http://schemas.microsoft.com/office/drawing/2015/9/8/chartex" xmlns:cx2="http://schemas.microsoft.com/office/drawing/2015/10/21/chartex" xmlns:cx3="http://schemas.microsoft.com/office/drawing/2016/5/9/chartex" xmlns:cx4="http://schemas.microsoft.com/office/drawing/2016/5/10/chartex" xmlns:cx5="http://schemas.microsoft.com/office/drawing/2016/5/11/chartex" xmlns:cx6="http://schemas.microsoft.com/office/drawing/2016/5/12/chartex" xmlns:cx7="http://schemas.microsoft.com/office/drawing/2016/5/13/chartex" xmlns:cx8="http://schemas.microsoft.com/office/drawing/2016/5/14/chartex" xmlns:mc="http://schemas.openxmlformats.org/markup-compatibility/2006" xmlns:aink="http://schemas.microsoft.com/office/drawing/2016/ink" xmlns:am3d="http://schemas.microsoft.com/office/drawing/2017/model3d" xmlns:o="urn:schemas-microsoft-com:office:office" xmlns:oel="http://schemas.microsoft.com/office/2019/extlst" xmlns:r="http://schemas.openxmlformats.org/officeDocument/2006/relationships" xmlns:m="http://schemas.openxmlformats.org/officeDocument/2006/math" xmlns:v="urn:schemas-microsoft-com:vml" xmlns:wp14="http://schemas.microsoft.com/office/word/2010/wordprocessingDrawing" xmlns:wp="http://schemas.openxmlformats.org/drawingml/2006/wordprocessingDrawing" xmlns:w10="urn:schemas-microsoft-com:office:word" xmlns:w="http://schemas.openxmlformats.org/wordprocessingml/2006/main" xmlns:w14="http://schemas.microsoft.com/office/word/2010/wordml" xmlns:w15="http://schemas.microsoft.com/office/word/2012/wordml" xmlns:w16cex="http://schemas.microsoft.com/office/word/2018/wordml/cex" xmlns:w16cid="http://schemas.microsoft.com/office/word/2016/wordml/cid" xmlns:w16="http://schemas.microsoft.com/office/word/2018/wordml" xmlns:w16du="http://schemas.microsoft.com/office/word/2023/wordml/word16du" xmlns:w16sdtdh="http://schemas.microsoft.com/office/word/2020/wordml/sdtdatahash" xmlns:w16sdtfl="http://schemas.microsoft.com/office/word/2024/wordml/sdtformatlock" xmlns:w16se="http://schemas.microsoft.com/office/word/2015/wordml/symex" xmlns:wpg="http://schemas.microsoft.com/office/word/2010/wordprocessingGroup" xmlns:wpi="http://schemas.microsoft.com/office/word/2010/wordprocessingInk" xmlns:wne="http://schemas.microsoft.com/office/word/2006/wordml" xmlns:wps="http://schemas.microsoft.com/office/word/2010/wordprocessingShape" mc:Ignorable="w14 w15 w16se w16cid w16 w16cex w16sdtdh w16sdtfl w16du wp14">
   <w:footnote w:type="separator" w:id="-1">
     <w:p>
       <w:r>
@@ -12720,11 +12589,11 @@
 </file>
 
 <file path=word/numbering.xml><?xml version="1.0" encoding="utf-8"?>
-<w:numbering xmlns:wpc="http://schemas.microsoft.com/office/word/2010/wordprocessingCanvas" xmlns:cx="http://schemas.microsoft.com/office/drawing/2014/chartex" xmlns:cx1="http://schemas.microsoft.com/office/drawing/2015/9/8/chartex" xmlns:cx2="http://schemas.microsoft.com/office/drawing/2015/10/21/chartex" xmlns:cx3="http://schemas.microsoft.com/office/drawing/2016/5/9/chartex" xmlns:cx4="http://schemas.microsoft.com/office/drawing/2016/5/10/chartex" xmlns:cx5="http://schemas.microsoft.com/office/drawing/2016/5/11/chartex" xmlns:cx6="http://schemas.microsoft.com/office/drawing/2016/5/12/chartex" xmlns:cx7="http://schemas.microsoft.com/office/drawing/2016/5/13/chartex" xmlns:cx8="http://schemas.microsoft.com/office/drawing/2016/5/14/chartex" xmlns:mc="http://schemas.openxmlformats.org/markup-compatibility/2006" xmlns:aink="http://schemas.microsoft.com/office/drawing/2016/ink" xmlns:am3d="http://schemas.microsoft.com/office/drawing/2017/model3d" xmlns:o="urn:schemas-microsoft-com:office:office" xmlns:oel="http://schemas.microsoft.com/office/2019/extlst" xmlns:r="http://schemas.openxmlformats.org/officeDocument/2006/relationships" xmlns:m="http://schemas.openxmlformats.org/officeDocument/2006/math" xmlns:v="urn:schemas-microsoft-com:vml" xmlns:wp14="http://schemas.microsoft.com/office/word/2010/wordprocessingDrawing" xmlns:wp="http://schemas.openxmlformats.org/drawingml/2006/wordprocessingDrawing" xmlns:w10="urn:schemas-microsoft-com:office:word" xmlns:w="http://schemas.openxmlformats.org/wordprocessingml/2006/main" xmlns:w14="http://schemas.microsoft.com/office/word/2010/wordml" xmlns:w15="http://schemas.microsoft.com/office/word/2012/wordml" xmlns:w16cei="http://schemas.microsoft.com/office/word/2026/wordml/cei" xmlns:w16cex="http://schemas.microsoft.com/office/word/2018/wordml/cex" xmlns:w16cid="http://schemas.microsoft.com/office/word/2016/wordml/cid" xmlns:w16="http://schemas.microsoft.com/office/word/2018/wordml" xmlns:w16du="http://schemas.microsoft.com/office/word/2023/wordml/word16du" xmlns:w16sdtdh="http://schemas.microsoft.com/office/word/2020/wordml/sdtdatahash" xmlns:w16sdtfl="http://schemas.microsoft.com/office/word/2024/wordml/sdtformatlock" xmlns:w16se="http://schemas.microsoft.com/office/word/2015/wordml/symex" xmlns:wpg="http://schemas.microsoft.com/office/word/2010/wordprocessingGroup" xmlns:wpi="http://schemas.microsoft.com/office/word/2010/wordprocessingInk" xmlns:wne="http://schemas.microsoft.com/office/word/2006/wordml" xmlns:wps="http://schemas.microsoft.com/office/word/2010/wordprocessingShape" mc:Ignorable="w14 w15 w16se w16cid w16 w16cex w16sdtdh w16sdtfl w16du wp14">
+<w:numbering xmlns:wpc="http://schemas.microsoft.com/office/word/2010/wordprocessingCanvas" xmlns:cx="http://schemas.microsoft.com/office/drawing/2014/chartex" xmlns:cx1="http://schemas.microsoft.com/office/drawing/2015/9/8/chartex" xmlns:cx2="http://schemas.microsoft.com/office/drawing/2015/10/21/chartex" xmlns:cx3="http://schemas.microsoft.com/office/drawing/2016/5/9/chartex" xmlns:cx4="http://schemas.microsoft.com/office/drawing/2016/5/10/chartex" xmlns:cx5="http://schemas.microsoft.com/office/drawing/2016/5/11/chartex" xmlns:cx6="http://schemas.microsoft.com/office/drawing/2016/5/12/chartex" xmlns:cx7="http://schemas.microsoft.com/office/drawing/2016/5/13/chartex" xmlns:cx8="http://schemas.microsoft.com/office/drawing/2016/5/14/chartex" xmlns:mc="http://schemas.openxmlformats.org/markup-compatibility/2006" xmlns:aink="http://schemas.microsoft.com/office/drawing/2016/ink" xmlns:am3d="http://schemas.microsoft.com/office/drawing/2017/model3d" xmlns:o="urn:schemas-microsoft-com:office:office" xmlns:oel="http://schemas.microsoft.com/office/2019/extlst" xmlns:r="http://schemas.openxmlformats.org/officeDocument/2006/relationships" xmlns:m="http://schemas.openxmlformats.org/officeDocument/2006/math" xmlns:v="urn:schemas-microsoft-com:vml" xmlns:wp14="http://schemas.microsoft.com/office/word/2010/wordprocessingDrawing" xmlns:wp="http://schemas.openxmlformats.org/drawingml/2006/wordprocessingDrawing" xmlns:w10="urn:schemas-microsoft-com:office:word" xmlns:w="http://schemas.openxmlformats.org/wordprocessingml/2006/main" xmlns:w14="http://schemas.microsoft.com/office/word/2010/wordml" xmlns:w15="http://schemas.microsoft.com/office/word/2012/wordml" xmlns:w16cex="http://schemas.microsoft.com/office/word/2018/wordml/cex" xmlns:w16cid="http://schemas.microsoft.com/office/word/2016/wordml/cid" xmlns:w16="http://schemas.microsoft.com/office/word/2018/wordml" xmlns:w16du="http://schemas.microsoft.com/office/word/2023/wordml/word16du" xmlns:w16sdtdh="http://schemas.microsoft.com/office/word/2020/wordml/sdtdatahash" xmlns:w16sdtfl="http://schemas.microsoft.com/office/word/2024/wordml/sdtformatlock" xmlns:w16se="http://schemas.microsoft.com/office/word/2015/wordml/symex" xmlns:wpg="http://schemas.microsoft.com/office/word/2010/wordprocessingGroup" xmlns:wpi="http://schemas.microsoft.com/office/word/2010/wordprocessingInk" xmlns:wne="http://schemas.microsoft.com/office/word/2006/wordml" xmlns:wps="http://schemas.microsoft.com/office/word/2010/wordprocessingShape" mc:Ignorable="w14 w15 w16se w16cid w16 w16cex w16sdtdh w16sdtfl w16du wp14">
   <w:abstractNum w:abstractNumId="0" w15:restartNumberingAfterBreak="0">
-    <w:nsid w:val="0A521D39"/>
+    <w:nsid w:val="03AD25E7"/>
     <w:multiLevelType w:val="hybridMultilevel"/>
-    <w:tmpl w:val="8B722A84"/>
+    <w:tmpl w:val="B3C88240"/>
     <w:lvl w:ilvl="0" w:tplc="1C090001">
       <w:start w:val="1"/>
       <w:numFmt w:val="bullet"/>
@@ -12835,9 +12704,9 @@
     </w:lvl>
   </w:abstractNum>
   <w:abstractNum w:abstractNumId="1" w15:restartNumberingAfterBreak="0">
-    <w:nsid w:val="18496722"/>
+    <w:nsid w:val="0A521D39"/>
     <w:multiLevelType w:val="hybridMultilevel"/>
-    <w:tmpl w:val="9B688FBE"/>
+    <w:tmpl w:val="8B722A84"/>
     <w:lvl w:ilvl="0" w:tplc="1C090001">
       <w:start w:val="1"/>
       <w:numFmt w:val="bullet"/>
@@ -12948,95 +12817,9 @@
     </w:lvl>
   </w:abstractNum>
   <w:abstractNum w:abstractNumId="2" w15:restartNumberingAfterBreak="0">
-    <w:nsid w:val="25945672"/>
+    <w:nsid w:val="18496722"/>
     <w:multiLevelType w:val="hybridMultilevel"/>
-    <w:tmpl w:val="6F4AFD92"/>
-    <w:lvl w:ilvl="0" w:tplc="8BA8573C">
-      <w:start w:val="1"/>
-      <w:numFmt w:val="bullet"/>
-      <w:lvlText w:val="●"/>
-      <w:lvlJc w:val="left"/>
-      <w:pPr>
-        <w:ind w:left="720" w:hanging="360"/>
-      </w:pPr>
-    </w:lvl>
-    <w:lvl w:ilvl="1" w:tplc="F77E3338">
-      <w:start w:val="1"/>
-      <w:numFmt w:val="bullet"/>
-      <w:lvlText w:val="○"/>
-      <w:lvlJc w:val="left"/>
-      <w:pPr>
-        <w:ind w:left="1440" w:hanging="360"/>
-      </w:pPr>
-    </w:lvl>
-    <w:lvl w:ilvl="2" w:tplc="38600D98">
-      <w:start w:val="1"/>
-      <w:numFmt w:val="bullet"/>
-      <w:lvlText w:val="■"/>
-      <w:lvlJc w:val="left"/>
-      <w:pPr>
-        <w:ind w:left="2160" w:hanging="360"/>
-      </w:pPr>
-    </w:lvl>
-    <w:lvl w:ilvl="3" w:tplc="FD1CA3B4">
-      <w:start w:val="1"/>
-      <w:numFmt w:val="bullet"/>
-      <w:lvlText w:val="●"/>
-      <w:lvlJc w:val="left"/>
-      <w:pPr>
-        <w:ind w:left="2880" w:hanging="360"/>
-      </w:pPr>
-    </w:lvl>
-    <w:lvl w:ilvl="4" w:tplc="B45A644E">
-      <w:start w:val="1"/>
-      <w:numFmt w:val="bullet"/>
-      <w:lvlText w:val="○"/>
-      <w:lvlJc w:val="left"/>
-      <w:pPr>
-        <w:ind w:left="3600" w:hanging="360"/>
-      </w:pPr>
-    </w:lvl>
-    <w:lvl w:ilvl="5" w:tplc="6876DB38">
-      <w:start w:val="1"/>
-      <w:numFmt w:val="bullet"/>
-      <w:lvlText w:val="■"/>
-      <w:lvlJc w:val="left"/>
-      <w:pPr>
-        <w:ind w:left="4320" w:hanging="360"/>
-      </w:pPr>
-    </w:lvl>
-    <w:lvl w:ilvl="6" w:tplc="9B48C4FE">
-      <w:start w:val="1"/>
-      <w:numFmt w:val="bullet"/>
-      <w:lvlText w:val="●"/>
-      <w:lvlJc w:val="left"/>
-      <w:pPr>
-        <w:ind w:left="5040" w:hanging="360"/>
-      </w:pPr>
-    </w:lvl>
-    <w:lvl w:ilvl="7" w:tplc="C6147C62">
-      <w:start w:val="1"/>
-      <w:numFmt w:val="bullet"/>
-      <w:lvlText w:val="●"/>
-      <w:lvlJc w:val="left"/>
-      <w:pPr>
-        <w:ind w:left="5760" w:hanging="360"/>
-      </w:pPr>
-    </w:lvl>
-    <w:lvl w:ilvl="8" w:tplc="588EC6E2">
-      <w:start w:val="1"/>
-      <w:numFmt w:val="bullet"/>
-      <w:lvlText w:val="●"/>
-      <w:lvlJc w:val="left"/>
-      <w:pPr>
-        <w:ind w:left="6480" w:hanging="360"/>
-      </w:pPr>
-    </w:lvl>
-  </w:abstractNum>
-  <w:abstractNum w:abstractNumId="3" w15:restartNumberingAfterBreak="0">
-    <w:nsid w:val="2697377C"/>
-    <w:multiLevelType w:val="hybridMultilevel"/>
-    <w:tmpl w:val="E8489312"/>
+    <w:tmpl w:val="9B688FBE"/>
     <w:lvl w:ilvl="0" w:tplc="1C090001">
       <w:start w:val="1"/>
       <w:numFmt w:val="bullet"/>
@@ -13146,10 +12929,96 @@
       </w:rPr>
     </w:lvl>
   </w:abstractNum>
+  <w:abstractNum w:abstractNumId="3" w15:restartNumberingAfterBreak="0">
+    <w:nsid w:val="25945672"/>
+    <w:multiLevelType w:val="hybridMultilevel"/>
+    <w:tmpl w:val="6F4AFD92"/>
+    <w:lvl w:ilvl="0" w:tplc="8BA8573C">
+      <w:start w:val="1"/>
+      <w:numFmt w:val="bullet"/>
+      <w:lvlText w:val="●"/>
+      <w:lvlJc w:val="left"/>
+      <w:pPr>
+        <w:ind w:left="720" w:hanging="360"/>
+      </w:pPr>
+    </w:lvl>
+    <w:lvl w:ilvl="1" w:tplc="F77E3338">
+      <w:start w:val="1"/>
+      <w:numFmt w:val="bullet"/>
+      <w:lvlText w:val="○"/>
+      <w:lvlJc w:val="left"/>
+      <w:pPr>
+        <w:ind w:left="1440" w:hanging="360"/>
+      </w:pPr>
+    </w:lvl>
+    <w:lvl w:ilvl="2" w:tplc="38600D98">
+      <w:start w:val="1"/>
+      <w:numFmt w:val="bullet"/>
+      <w:lvlText w:val="■"/>
+      <w:lvlJc w:val="left"/>
+      <w:pPr>
+        <w:ind w:left="2160" w:hanging="360"/>
+      </w:pPr>
+    </w:lvl>
+    <w:lvl w:ilvl="3" w:tplc="FD1CA3B4">
+      <w:start w:val="1"/>
+      <w:numFmt w:val="bullet"/>
+      <w:lvlText w:val="●"/>
+      <w:lvlJc w:val="left"/>
+      <w:pPr>
+        <w:ind w:left="2880" w:hanging="360"/>
+      </w:pPr>
+    </w:lvl>
+    <w:lvl w:ilvl="4" w:tplc="B45A644E">
+      <w:start w:val="1"/>
+      <w:numFmt w:val="bullet"/>
+      <w:lvlText w:val="○"/>
+      <w:lvlJc w:val="left"/>
+      <w:pPr>
+        <w:ind w:left="3600" w:hanging="360"/>
+      </w:pPr>
+    </w:lvl>
+    <w:lvl w:ilvl="5" w:tplc="6876DB38">
+      <w:start w:val="1"/>
+      <w:numFmt w:val="bullet"/>
+      <w:lvlText w:val="■"/>
+      <w:lvlJc w:val="left"/>
+      <w:pPr>
+        <w:ind w:left="4320" w:hanging="360"/>
+      </w:pPr>
+    </w:lvl>
+    <w:lvl w:ilvl="6" w:tplc="9B48C4FE">
+      <w:start w:val="1"/>
+      <w:numFmt w:val="bullet"/>
+      <w:lvlText w:val="●"/>
+      <w:lvlJc w:val="left"/>
+      <w:pPr>
+        <w:ind w:left="5040" w:hanging="360"/>
+      </w:pPr>
+    </w:lvl>
+    <w:lvl w:ilvl="7" w:tplc="C6147C62">
+      <w:start w:val="1"/>
+      <w:numFmt w:val="bullet"/>
+      <w:lvlText w:val="●"/>
+      <w:lvlJc w:val="left"/>
+      <w:pPr>
+        <w:ind w:left="5760" w:hanging="360"/>
+      </w:pPr>
+    </w:lvl>
+    <w:lvl w:ilvl="8" w:tplc="588EC6E2">
+      <w:start w:val="1"/>
+      <w:numFmt w:val="bullet"/>
+      <w:lvlText w:val="●"/>
+      <w:lvlJc w:val="left"/>
+      <w:pPr>
+        <w:ind w:left="6480" w:hanging="360"/>
+      </w:pPr>
+    </w:lvl>
+  </w:abstractNum>
   <w:abstractNum w:abstractNumId="4" w15:restartNumberingAfterBreak="0">
-    <w:nsid w:val="2B9F2795"/>
+    <w:nsid w:val="2697377C"/>
     <w:multiLevelType w:val="hybridMultilevel"/>
-    <w:tmpl w:val="8070DF78"/>
+    <w:tmpl w:val="E8489312"/>
     <w:lvl w:ilvl="0" w:tplc="1C090001">
       <w:start w:val="1"/>
       <w:numFmt w:val="bullet"/>
@@ -13260,19 +13129,22 @@
     </w:lvl>
   </w:abstractNum>
   <w:abstractNum w:abstractNumId="5" w15:restartNumberingAfterBreak="0">
-    <w:nsid w:val="39803285"/>
+    <w:nsid w:val="2B9F2795"/>
     <w:multiLevelType w:val="hybridMultilevel"/>
-    <w:tmpl w:val="C5DE6846"/>
-    <w:lvl w:ilvl="0" w:tplc="8BA8573C">
+    <w:tmpl w:val="8070DF78"/>
+    <w:lvl w:ilvl="0" w:tplc="1C090001">
       <w:start w:val="1"/>
       <w:numFmt w:val="bullet"/>
-      <w:lvlText w:val="●"/>
+      <w:lvlText w:val=""/>
       <w:lvlJc w:val="left"/>
       <w:pPr>
         <w:ind w:left="720" w:hanging="360"/>
       </w:pPr>
+      <w:rPr>
+        <w:rFonts w:ascii="Symbol" w:hAnsi="Symbol" w:hint="default"/>
+      </w:rPr>
     </w:lvl>
-    <w:lvl w:ilvl="1" w:tplc="1C090003">
+    <w:lvl w:ilvl="1" w:tplc="1C090003" w:tentative="1">
       <w:start w:val="1"/>
       <w:numFmt w:val="bullet"/>
       <w:lvlText w:val="o"/>
@@ -13370,6 +13242,116 @@
     </w:lvl>
   </w:abstractNum>
   <w:abstractNum w:abstractNumId="6" w15:restartNumberingAfterBreak="0">
+    <w:nsid w:val="39803285"/>
+    <w:multiLevelType w:val="hybridMultilevel"/>
+    <w:tmpl w:val="C5DE6846"/>
+    <w:lvl w:ilvl="0" w:tplc="8BA8573C">
+      <w:start w:val="1"/>
+      <w:numFmt w:val="bullet"/>
+      <w:lvlText w:val="●"/>
+      <w:lvlJc w:val="left"/>
+      <w:pPr>
+        <w:ind w:left="720" w:hanging="360"/>
+      </w:pPr>
+    </w:lvl>
+    <w:lvl w:ilvl="1" w:tplc="1C090003">
+      <w:start w:val="1"/>
+      <w:numFmt w:val="bullet"/>
+      <w:lvlText w:val="o"/>
+      <w:lvlJc w:val="left"/>
+      <w:pPr>
+        <w:ind w:left="1440" w:hanging="360"/>
+      </w:pPr>
+      <w:rPr>
+        <w:rFonts w:ascii="Courier New" w:hAnsi="Courier New" w:cs="Courier New" w:hint="default"/>
+      </w:rPr>
+    </w:lvl>
+    <w:lvl w:ilvl="2" w:tplc="1C090005" w:tentative="1">
+      <w:start w:val="1"/>
+      <w:numFmt w:val="bullet"/>
+      <w:lvlText w:val=""/>
+      <w:lvlJc w:val="left"/>
+      <w:pPr>
+        <w:ind w:left="2160" w:hanging="360"/>
+      </w:pPr>
+      <w:rPr>
+        <w:rFonts w:ascii="Wingdings" w:hAnsi="Wingdings" w:hint="default"/>
+      </w:rPr>
+    </w:lvl>
+    <w:lvl w:ilvl="3" w:tplc="1C090001" w:tentative="1">
+      <w:start w:val="1"/>
+      <w:numFmt w:val="bullet"/>
+      <w:lvlText w:val=""/>
+      <w:lvlJc w:val="left"/>
+      <w:pPr>
+        <w:ind w:left="2880" w:hanging="360"/>
+      </w:pPr>
+      <w:rPr>
+        <w:rFonts w:ascii="Symbol" w:hAnsi="Symbol" w:hint="default"/>
+      </w:rPr>
+    </w:lvl>
+    <w:lvl w:ilvl="4" w:tplc="1C090003" w:tentative="1">
+      <w:start w:val="1"/>
+      <w:numFmt w:val="bullet"/>
+      <w:lvlText w:val="o"/>
+      <w:lvlJc w:val="left"/>
+      <w:pPr>
+        <w:ind w:left="3600" w:hanging="360"/>
+      </w:pPr>
+      <w:rPr>
+        <w:rFonts w:ascii="Courier New" w:hAnsi="Courier New" w:cs="Courier New" w:hint="default"/>
+      </w:rPr>
+    </w:lvl>
+    <w:lvl w:ilvl="5" w:tplc="1C090005" w:tentative="1">
+      <w:start w:val="1"/>
+      <w:numFmt w:val="bullet"/>
+      <w:lvlText w:val=""/>
+      <w:lvlJc w:val="left"/>
+      <w:pPr>
+        <w:ind w:left="4320" w:hanging="360"/>
+      </w:pPr>
+      <w:rPr>
+        <w:rFonts w:ascii="Wingdings" w:hAnsi="Wingdings" w:hint="default"/>
+      </w:rPr>
+    </w:lvl>
+    <w:lvl w:ilvl="6" w:tplc="1C090001" w:tentative="1">
+      <w:start w:val="1"/>
+      <w:numFmt w:val="bullet"/>
+      <w:lvlText w:val=""/>
+      <w:lvlJc w:val="left"/>
+      <w:pPr>
+        <w:ind w:left="5040" w:hanging="360"/>
+      </w:pPr>
+      <w:rPr>
+        <w:rFonts w:ascii="Symbol" w:hAnsi="Symbol" w:hint="default"/>
+      </w:rPr>
+    </w:lvl>
+    <w:lvl w:ilvl="7" w:tplc="1C090003" w:tentative="1">
+      <w:start w:val="1"/>
+      <w:numFmt w:val="bullet"/>
+      <w:lvlText w:val="o"/>
+      <w:lvlJc w:val="left"/>
+      <w:pPr>
+        <w:ind w:left="5760" w:hanging="360"/>
+      </w:pPr>
+      <w:rPr>
+        <w:rFonts w:ascii="Courier New" w:hAnsi="Courier New" w:cs="Courier New" w:hint="default"/>
+      </w:rPr>
+    </w:lvl>
+    <w:lvl w:ilvl="8" w:tplc="1C090005" w:tentative="1">
+      <w:start w:val="1"/>
+      <w:numFmt w:val="bullet"/>
+      <w:lvlText w:val=""/>
+      <w:lvlJc w:val="left"/>
+      <w:pPr>
+        <w:ind w:left="6480" w:hanging="360"/>
+      </w:pPr>
+      <w:rPr>
+        <w:rFonts w:ascii="Wingdings" w:hAnsi="Wingdings" w:hint="default"/>
+      </w:rPr>
+    </w:lvl>
+  </w:abstractNum>
+  <w:abstractNum w:abstractNumId="7" w15:restartNumberingAfterBreak="0">
     <w:nsid w:val="41F067A3"/>
     <w:multiLevelType w:val="multilevel"/>
     <w:tmpl w:val="3BF240EE"/>
@@ -13518,7 +13500,7 @@
       </w:rPr>
     </w:lvl>
   </w:abstractNum>
-  <w:abstractNum w:abstractNumId="7" w15:restartNumberingAfterBreak="0">
+  <w:abstractNum w:abstractNumId="8" w15:restartNumberingAfterBreak="0">
     <w:nsid w:val="4A4625B9"/>
     <w:multiLevelType w:val="hybridMultilevel"/>
     <w:tmpl w:val="C1463914"/>
@@ -13631,7 +13613,7 @@
       </w:rPr>
     </w:lvl>
   </w:abstractNum>
-  <w:abstractNum w:abstractNumId="8" w15:restartNumberingAfterBreak="0">
+  <w:abstractNum w:abstractNumId="9" w15:restartNumberingAfterBreak="0">
     <w:nsid w:val="4F083DED"/>
     <w:multiLevelType w:val="hybridMultilevel"/>
     <w:tmpl w:val="D406A6DC"/>
@@ -13744,7 +13726,7 @@
       </w:rPr>
     </w:lvl>
   </w:abstractNum>
-  <w:abstractNum w:abstractNumId="9" w15:restartNumberingAfterBreak="0">
+  <w:abstractNum w:abstractNumId="10" w15:restartNumberingAfterBreak="0">
     <w:nsid w:val="5A0B162B"/>
     <w:multiLevelType w:val="hybridMultilevel"/>
     <w:tmpl w:val="6C047434"/>
@@ -13857,7 +13839,7 @@
       </w:rPr>
     </w:lvl>
   </w:abstractNum>
-  <w:abstractNum w:abstractNumId="10" w15:restartNumberingAfterBreak="0">
+  <w:abstractNum w:abstractNumId="11" w15:restartNumberingAfterBreak="0">
     <w:nsid w:val="663A176C"/>
     <w:multiLevelType w:val="hybridMultilevel"/>
     <w:tmpl w:val="4574FB3E"/>
@@ -13970,7 +13952,7 @@
       </w:rPr>
     </w:lvl>
   </w:abstractNum>
-  <w:abstractNum w:abstractNumId="11" w15:restartNumberingAfterBreak="0">
+  <w:abstractNum w:abstractNumId="12" w15:restartNumberingAfterBreak="0">
     <w:nsid w:val="685D064D"/>
     <w:multiLevelType w:val="hybridMultilevel"/>
     <w:tmpl w:val="F44CCCB8"/>
@@ -14083,7 +14065,7 @@
       </w:rPr>
     </w:lvl>
   </w:abstractNum>
-  <w:abstractNum w:abstractNumId="12" w15:restartNumberingAfterBreak="0">
+  <w:abstractNum w:abstractNumId="13" w15:restartNumberingAfterBreak="0">
     <w:nsid w:val="74203B4A"/>
     <w:multiLevelType w:val="hybridMultilevel"/>
     <w:tmpl w:val="AFA2838C"/>
@@ -14196,50 +14178,169 @@
       </w:rPr>
     </w:lvl>
   </w:abstractNum>
+  <w:abstractNum w:abstractNumId="14" w15:restartNumberingAfterBreak="0">
+    <w:nsid w:val="7ABA737D"/>
+    <w:multiLevelType w:val="hybridMultilevel"/>
+    <w:tmpl w:val="92A2EF62"/>
+    <w:lvl w:ilvl="0" w:tplc="1C090001">
+      <w:start w:val="1"/>
+      <w:numFmt w:val="bullet"/>
+      <w:lvlText w:val=""/>
+      <w:lvlJc w:val="left"/>
+      <w:pPr>
+        <w:ind w:left="720" w:hanging="360"/>
+      </w:pPr>
+      <w:rPr>
+        <w:rFonts w:ascii="Symbol" w:hAnsi="Symbol" w:hint="default"/>
+      </w:rPr>
+    </w:lvl>
+    <w:lvl w:ilvl="1" w:tplc="1C090003" w:tentative="1">
+      <w:start w:val="1"/>
+      <w:numFmt w:val="bullet"/>
+      <w:lvlText w:val="o"/>
+      <w:lvlJc w:val="left"/>
+      <w:pPr>
+        <w:ind w:left="1440" w:hanging="360"/>
+      </w:pPr>
+      <w:rPr>
+        <w:rFonts w:ascii="Courier New" w:hAnsi="Courier New" w:cs="Courier New" w:hint="default"/>
+      </w:rPr>
+    </w:lvl>
+    <w:lvl w:ilvl="2" w:tplc="1C090005" w:tentative="1">
+      <w:start w:val="1"/>
+      <w:numFmt w:val="bullet"/>
+      <w:lvlText w:val=""/>
+      <w:lvlJc w:val="left"/>
+      <w:pPr>
+        <w:ind w:left="2160" w:hanging="360"/>
+      </w:pPr>
+      <w:rPr>
+        <w:rFonts w:ascii="Wingdings" w:hAnsi="Wingdings" w:hint="default"/>
+      </w:rPr>
+    </w:lvl>
+    <w:lvl w:ilvl="3" w:tplc="1C090001" w:tentative="1">
+      <w:start w:val="1"/>
+      <w:numFmt w:val="bullet"/>
+      <w:lvlText w:val=""/>
+      <w:lvlJc w:val="left"/>
+      <w:pPr>
+        <w:ind w:left="2880" w:hanging="360"/>
+      </w:pPr>
+      <w:rPr>
+        <w:rFonts w:ascii="Symbol" w:hAnsi="Symbol" w:hint="default"/>
+      </w:rPr>
+    </w:lvl>
+    <w:lvl w:ilvl="4" w:tplc="1C090003" w:tentative="1">
+      <w:start w:val="1"/>
+      <w:numFmt w:val="bullet"/>
+      <w:lvlText w:val="o"/>
+      <w:lvlJc w:val="left"/>
+      <w:pPr>
+        <w:ind w:left="3600" w:hanging="360"/>
+      </w:pPr>
+      <w:rPr>
+        <w:rFonts w:ascii="Courier New" w:hAnsi="Courier New" w:cs="Courier New" w:hint="default"/>
+      </w:rPr>
+    </w:lvl>
+    <w:lvl w:ilvl="5" w:tplc="1C090005" w:tentative="1">
+      <w:start w:val="1"/>
+      <w:numFmt w:val="bullet"/>
+      <w:lvlText w:val=""/>
+      <w:lvlJc w:val="left"/>
+      <w:pPr>
+        <w:ind w:left="4320" w:hanging="360"/>
+      </w:pPr>
+      <w:rPr>
+        <w:rFonts w:ascii="Wingdings" w:hAnsi="Wingdings" w:hint="default"/>
+      </w:rPr>
+    </w:lvl>
+    <w:lvl w:ilvl="6" w:tplc="1C090001" w:tentative="1">
+      <w:start w:val="1"/>
+      <w:numFmt w:val="bullet"/>
+      <w:lvlText w:val=""/>
+      <w:lvlJc w:val="left"/>
+      <w:pPr>
+        <w:ind w:left="5040" w:hanging="360"/>
+      </w:pPr>
+      <w:rPr>
+        <w:rFonts w:ascii="Symbol" w:hAnsi="Symbol" w:hint="default"/>
+      </w:rPr>
+    </w:lvl>
+    <w:lvl w:ilvl="7" w:tplc="1C090003" w:tentative="1">
+      <w:start w:val="1"/>
+      <w:numFmt w:val="bullet"/>
+      <w:lvlText w:val="o"/>
+      <w:lvlJc w:val="left"/>
+      <w:pPr>
+        <w:ind w:left="5760" w:hanging="360"/>
+      </w:pPr>
+      <w:rPr>
+        <w:rFonts w:ascii="Courier New" w:hAnsi="Courier New" w:cs="Courier New" w:hint="default"/>
+      </w:rPr>
+    </w:lvl>
+    <w:lvl w:ilvl="8" w:tplc="1C090005" w:tentative="1">
+      <w:start w:val="1"/>
+      <w:numFmt w:val="bullet"/>
+      <w:lvlText w:val=""/>
+      <w:lvlJc w:val="left"/>
+      <w:pPr>
+        <w:ind w:left="6480" w:hanging="360"/>
+      </w:pPr>
+      <w:rPr>
+        <w:rFonts w:ascii="Wingdings" w:hAnsi="Wingdings" w:hint="default"/>
+      </w:rPr>
+    </w:lvl>
+  </w:abstractNum>
   <w:num w:numId="1" w16cid:durableId="1523587865">
-    <w:abstractNumId w:val="2"/>
+    <w:abstractNumId w:val="3"/>
     <w:lvlOverride w:ilvl="0">
       <w:startOverride w:val="1"/>
     </w:lvlOverride>
   </w:num>
   <w:num w:numId="2" w16cid:durableId="806239829">
+    <w:abstractNumId w:val="7"/>
+  </w:num>
+  <w:num w:numId="3" w16cid:durableId="1517188068">
+    <w:abstractNumId w:val="3"/>
+  </w:num>
+  <w:num w:numId="4" w16cid:durableId="417334179">
     <w:abstractNumId w:val="6"/>
   </w:num>
-  <w:num w:numId="3" w16cid:durableId="1517188068">
+  <w:num w:numId="5" w16cid:durableId="1574312741">
+    <w:abstractNumId w:val="1"/>
+  </w:num>
+  <w:num w:numId="6" w16cid:durableId="1118720893">
+    <w:abstractNumId w:val="5"/>
+  </w:num>
+  <w:num w:numId="7" w16cid:durableId="1261839337">
+    <w:abstractNumId w:val="10"/>
+  </w:num>
+  <w:num w:numId="8" w16cid:durableId="402333674">
     <w:abstractNumId w:val="2"/>
   </w:num>
-  <w:num w:numId="4" w16cid:durableId="417334179">
-    <w:abstractNumId w:val="5"/>
+  <w:num w:numId="9" w16cid:durableId="1379551515">
+    <w:abstractNumId w:val="9"/>
   </w:num>
-  <w:num w:numId="5" w16cid:durableId="1574312741">
-    <w:abstractNumId w:val="0"/>
-  </w:num>
-  <w:num w:numId="6" w16cid:durableId="1118720893">
+  <w:num w:numId="10" w16cid:durableId="992754689">
     <w:abstractNumId w:val="4"/>
   </w:num>
-  <w:num w:numId="7" w16cid:durableId="1261839337">
-    <w:abstractNumId w:val="9"/>
+  <w:num w:numId="11" w16cid:durableId="396898259">
+    <w:abstractNumId w:val="13"/>
   </w:num>
-  <w:num w:numId="8" w16cid:durableId="402333674">
-    <w:abstractNumId w:val="1"/>
-  </w:num>
-  <w:num w:numId="9" w16cid:durableId="1379551515">
+  <w:num w:numId="12" w16cid:durableId="426585319">
     <w:abstractNumId w:val="8"/>
   </w:num>
-  <w:num w:numId="10" w16cid:durableId="992754689">
-    <w:abstractNumId w:val="3"/>
-  </w:num>
-  <w:num w:numId="11" w16cid:durableId="396898259">
+  <w:num w:numId="13" w16cid:durableId="1555774513">
     <w:abstractNumId w:val="12"/>
   </w:num>
-  <w:num w:numId="12" w16cid:durableId="426585319">
-    <w:abstractNumId w:val="7"/>
-  </w:num>
-  <w:num w:numId="13" w16cid:durableId="1555774513">
+  <w:num w:numId="14" w16cid:durableId="1339187345">
     <w:abstractNumId w:val="11"/>
   </w:num>
-  <w:num w:numId="14" w16cid:durableId="1339187345">
-    <w:abstractNumId w:val="10"/>
+  <w:num w:numId="15" w16cid:durableId="1745250490">
+    <w:abstractNumId w:val="14"/>
+  </w:num>
+  <w:num w:numId="16" w16cid:durableId="88543622">
+    <w:abstractNumId w:val="0"/>
   </w:num>
 </w:numbering>
 </file>
@@ -14722,6 +14823,7 @@
   <w:style w:type="character" w:default="1" w:styleId="DefaultParagraphFont">
     <w:name w:val="Default Paragraph Font"/>
     <w:uiPriority w:val="1"/>
+    <w:semiHidden/>
     <w:unhideWhenUsed/>
   </w:style>
   <w:style w:type="table" w:default="1" w:styleId="TableNormal">

</xml_diff>

<commit_message>
docs: finalized docs + created pdfs + added gantt
</commit_message>
<xml_diff>
--- a/Documentation/FromTheFarm Planning & Design.docx
+++ b/Documentation/FromTheFarm Planning & Design.docx
@@ -184,11 +184,19 @@
                                     <w:color w:val="FFFFFF" w:themeColor="background1"/>
                                   </w:rPr>
                                 </w:pPr>
+                                <w:proofErr w:type="spellStart"/>
                                 <w:r>
                                   <w:rPr>
                                     <w:color w:val="FFFFFF" w:themeColor="background1"/>
                                   </w:rPr>
-                                  <w:t>Zario Di Paolo: ST10441349</w:t>
+                                  <w:t>Zario</w:t>
+                                </w:r>
+                                <w:proofErr w:type="spellEnd"/>
+                                <w:r>
+                                  <w:rPr>
+                                    <w:color w:val="FFFFFF" w:themeColor="background1"/>
+                                  </w:rPr>
+                                  <w:t xml:space="preserve"> Di Paolo: ST10441349</w:t>
                                 </w:r>
                               </w:p>
                               <w:p>
@@ -253,7 +261,7 @@
                   </wp:anchor>
                 </w:drawing>
               </mc:Choice>
-              <mc:Fallback xmlns:w16cei="http://schemas.microsoft.com/office/word/2026/wordml/cei">
+              <mc:Fallback>
                 <w:pict>
                   <v:rect w14:anchorId="115719A1" id="Rectangle 16" o:spid="_x0000_s1026" style="position:absolute;margin-left:0;margin-top:0;width:422.3pt;height:760.1pt;z-index:251680768;visibility:visible;mso-wrap-style:square;mso-width-percent:690;mso-height-percent:960;mso-left-percent:20;mso-top-percent:20;mso-wrap-distance-left:9pt;mso-wrap-distance-top:0;mso-wrap-distance-right:9pt;mso-wrap-distance-bottom:0;mso-position-horizontal-relative:page;mso-position-vertical-relative:page;mso-width-percent:690;mso-height-percent:960;mso-left-percent:20;mso-top-percent:20;mso-width-relative:page;mso-height-relative:page;v-text-anchor:middle" o:gfxdata="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" fillcolor="#156082 [3204]" stroked="f">
                     <v:textbox inset="21.6pt,1in,21.6pt">
@@ -364,11 +372,19 @@
                               <w:color w:val="FFFFFF" w:themeColor="background1"/>
                             </w:rPr>
                           </w:pPr>
+                          <w:proofErr w:type="spellStart"/>
                           <w:r>
                             <w:rPr>
                               <w:color w:val="FFFFFF" w:themeColor="background1"/>
                             </w:rPr>
-                            <w:t>Zario Di Paolo: ST10441349</w:t>
+                            <w:t>Zario</w:t>
+                          </w:r>
+                          <w:proofErr w:type="spellEnd"/>
+                          <w:r>
+                            <w:rPr>
+                              <w:color w:val="FFFFFF" w:themeColor="background1"/>
+                            </w:rPr>
+                            <w:t xml:space="preserve"> Di Paolo: ST10441349</w:t>
                           </w:r>
                         </w:p>
                         <w:p>
@@ -379,33 +395,11 @@
                               <w:color w:val="FFFFFF" w:themeColor="background1"/>
                             </w:rPr>
                           </w:pPr>
-                          <w:proofErr w:type="spellStart"/>
                           <w:r>
                             <w:rPr>
                               <w:color w:val="FFFFFF" w:themeColor="background1"/>
                             </w:rPr>
-                            <w:t>Kaehil</w:t>
-                          </w:r>
-                          <w:proofErr w:type="spellEnd"/>
-                          <w:r>
-                            <w:rPr>
-                              <w:color w:val="FFFFFF" w:themeColor="background1"/>
-                            </w:rPr>
-                            <w:t xml:space="preserve"> </w:t>
-                          </w:r>
-                          <w:proofErr w:type="spellStart"/>
-                          <w:r>
-                            <w:rPr>
-                              <w:color w:val="FFFFFF" w:themeColor="background1"/>
-                            </w:rPr>
-                            <w:t>Indurjeeth</w:t>
-                          </w:r>
-                          <w:proofErr w:type="spellEnd"/>
-                          <w:r>
-                            <w:rPr>
-                              <w:color w:val="FFFFFF" w:themeColor="background1"/>
-                            </w:rPr>
-                            <w:t>: ST10438880</w:t>
+                            <w:t>Kaehil Indurjeeth: ST10438880</w:t>
                           </w:r>
                         </w:p>
                         <w:p>
@@ -566,7 +560,7 @@
                   </wp:anchor>
                 </w:drawing>
               </mc:Choice>
-              <mc:Fallback xmlns:w16cei="http://schemas.microsoft.com/office/word/2026/wordml/cei">
+              <mc:Fallback>
                 <w:pict>
                   <v:rect w14:anchorId="7F210FE4" id="Rectangle 268" o:spid="_x0000_s1027" style="position:absolute;margin-left:0;margin-top:0;width:148.1pt;height:760.3pt;z-index:251681792;visibility:visible;mso-wrap-style:square;mso-width-percent:242;mso-height-percent:960;mso-left-percent:730;mso-wrap-distance-left:9pt;mso-wrap-distance-top:0;mso-wrap-distance-right:9pt;mso-wrap-distance-bottom:0;mso-position-horizontal-relative:page;mso-position-vertical:center;mso-position-vertical-relative:page;mso-width-percent:242;mso-height-percent:960;mso-left-percent:730;mso-width-relative:page;mso-height-relative:page;v-text-anchor:middle" o:gfxdata="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" fillcolor="#0e2841 [3215]" stroked="f" strokeweight="1.5pt">
                     <v:textbox inset="14.4pt,,14.4pt">
@@ -681,7 +675,7 @@
           <w:r>
             <w:fldChar w:fldCharType="separate"/>
           </w:r>
-          <w:hyperlink w:anchor="_Toc238458714" w:history="1">
+          <w:hyperlink w:anchor="_Toc238474717" w:history="1">
             <w:r>
               <w:rPr>
                 <w:rStyle w:val="Hyperlink"/>
@@ -708,7 +702,7 @@
                 <w:noProof/>
                 <w:webHidden/>
               </w:rPr>
-              <w:instrText xml:space="preserve"> PAGEREF _Toc238458714 \h </w:instrText>
+              <w:instrText xml:space="preserve"> PAGEREF _Toc238474717 \h </w:instrText>
             </w:r>
             <w:r>
               <w:rPr>
@@ -751,7 +745,7 @@
               <w14:ligatures w14:val="standardContextual"/>
             </w:rPr>
           </w:pPr>
-          <w:hyperlink w:anchor="_Toc238458715" w:history="1">
+          <w:hyperlink w:anchor="_Toc238474718" w:history="1">
             <w:r>
               <w:rPr>
                 <w:rStyle w:val="Hyperlink"/>
@@ -778,7 +772,7 @@
                 <w:noProof/>
                 <w:webHidden/>
               </w:rPr>
-              <w:instrText xml:space="preserve"> PAGEREF _Toc238458715 \h </w:instrText>
+              <w:instrText xml:space="preserve"> PAGEREF _Toc238474718 \h </w:instrText>
             </w:r>
             <w:r>
               <w:rPr>
@@ -798,7 +792,7 @@
                 <w:noProof/>
                 <w:webHidden/>
               </w:rPr>
-              <w:t>2</w:t>
+              <w:t>3</w:t>
             </w:r>
             <w:r>
               <w:rPr>
@@ -821,7 +815,7 @@
               <w14:ligatures w14:val="standardContextual"/>
             </w:rPr>
           </w:pPr>
-          <w:hyperlink w:anchor="_Toc238458716" w:history="1">
+          <w:hyperlink w:anchor="_Toc238474719" w:history="1">
             <w:r>
               <w:rPr>
                 <w:rStyle w:val="Hyperlink"/>
@@ -848,7 +842,7 @@
                 <w:noProof/>
                 <w:webHidden/>
               </w:rPr>
-              <w:instrText xml:space="preserve"> PAGEREF _Toc238458716 \h </w:instrText>
+              <w:instrText xml:space="preserve"> PAGEREF _Toc238474719 \h </w:instrText>
             </w:r>
             <w:r>
               <w:rPr>
@@ -894,7 +888,7 @@
               <w14:ligatures w14:val="standardContextual"/>
             </w:rPr>
           </w:pPr>
-          <w:hyperlink w:anchor="_Toc238458717" w:history="1">
+          <w:hyperlink w:anchor="_Toc238474720" w:history="1">
             <w:r>
               <w:rPr>
                 <w:rStyle w:val="Hyperlink"/>
@@ -921,7 +915,7 @@
                 <w:noProof/>
                 <w:webHidden/>
               </w:rPr>
-              <w:instrText xml:space="preserve"> PAGEREF _Toc238458717 \h </w:instrText>
+              <w:instrText xml:space="preserve"> PAGEREF _Toc238474720 \h </w:instrText>
             </w:r>
             <w:r>
               <w:rPr>
@@ -967,7 +961,7 @@
               <w14:ligatures w14:val="standardContextual"/>
             </w:rPr>
           </w:pPr>
-          <w:hyperlink w:anchor="_Toc238458718" w:history="1">
+          <w:hyperlink w:anchor="_Toc238474721" w:history="1">
             <w:r>
               <w:rPr>
                 <w:rStyle w:val="Hyperlink"/>
@@ -994,7 +988,7 @@
                 <w:noProof/>
                 <w:webHidden/>
               </w:rPr>
-              <w:instrText xml:space="preserve"> PAGEREF _Toc238458718 \h </w:instrText>
+              <w:instrText xml:space="preserve"> PAGEREF _Toc238474721 \h </w:instrText>
             </w:r>
             <w:r>
               <w:rPr>
@@ -1037,7 +1031,7 @@
               <w14:ligatures w14:val="standardContextual"/>
             </w:rPr>
           </w:pPr>
-          <w:hyperlink w:anchor="_Toc238458719" w:history="1">
+          <w:hyperlink w:anchor="_Toc238474722" w:history="1">
             <w:r>
               <w:rPr>
                 <w:rStyle w:val="Hyperlink"/>
@@ -1064,7 +1058,7 @@
                 <w:noProof/>
                 <w:webHidden/>
               </w:rPr>
-              <w:instrText xml:space="preserve"> PAGEREF _Toc238458719 \h </w:instrText>
+              <w:instrText xml:space="preserve"> PAGEREF _Toc238474722 \h </w:instrText>
             </w:r>
             <w:r>
               <w:rPr>
@@ -1110,7 +1104,7 @@
               <w14:ligatures w14:val="standardContextual"/>
             </w:rPr>
           </w:pPr>
-          <w:hyperlink w:anchor="_Toc238458720" w:history="1">
+          <w:hyperlink w:anchor="_Toc238474723" w:history="1">
             <w:r>
               <w:rPr>
                 <w:rStyle w:val="Hyperlink"/>
@@ -1137,7 +1131,7 @@
                 <w:noProof/>
                 <w:webHidden/>
               </w:rPr>
-              <w:instrText xml:space="preserve"> PAGEREF _Toc238458720 \h </w:instrText>
+              <w:instrText xml:space="preserve"> PAGEREF _Toc238474723 \h </w:instrText>
             </w:r>
             <w:r>
               <w:rPr>
@@ -1183,7 +1177,7 @@
               <w14:ligatures w14:val="standardContextual"/>
             </w:rPr>
           </w:pPr>
-          <w:hyperlink w:anchor="_Toc238458721" w:history="1">
+          <w:hyperlink w:anchor="_Toc238474724" w:history="1">
             <w:r>
               <w:rPr>
                 <w:rStyle w:val="Hyperlink"/>
@@ -1210,7 +1204,7 @@
                 <w:noProof/>
                 <w:webHidden/>
               </w:rPr>
-              <w:instrText xml:space="preserve"> PAGEREF _Toc238458721 \h </w:instrText>
+              <w:instrText xml:space="preserve"> PAGEREF _Toc238474724 \h </w:instrText>
             </w:r>
             <w:r>
               <w:rPr>
@@ -1256,7 +1250,7 @@
               <w14:ligatures w14:val="standardContextual"/>
             </w:rPr>
           </w:pPr>
-          <w:hyperlink w:anchor="_Toc238458722" w:history="1">
+          <w:hyperlink w:anchor="_Toc238474725" w:history="1">
             <w:r>
               <w:rPr>
                 <w:rStyle w:val="Hyperlink"/>
@@ -1283,7 +1277,7 @@
                 <w:noProof/>
                 <w:webHidden/>
               </w:rPr>
-              <w:instrText xml:space="preserve"> PAGEREF _Toc238458722 \h </w:instrText>
+              <w:instrText xml:space="preserve"> PAGEREF _Toc238474725 \h </w:instrText>
             </w:r>
             <w:r>
               <w:rPr>
@@ -1326,7 +1320,7 @@
               <w14:ligatures w14:val="standardContextual"/>
             </w:rPr>
           </w:pPr>
-          <w:hyperlink w:anchor="_Toc238458723" w:history="1">
+          <w:hyperlink w:anchor="_Toc238474726" w:history="1">
             <w:r>
               <w:rPr>
                 <w:rStyle w:val="Hyperlink"/>
@@ -1353,7 +1347,7 @@
                 <w:noProof/>
                 <w:webHidden/>
               </w:rPr>
-              <w:instrText xml:space="preserve"> PAGEREF _Toc238458723 \h </w:instrText>
+              <w:instrText xml:space="preserve"> PAGEREF _Toc238474726 \h </w:instrText>
             </w:r>
             <w:r>
               <w:rPr>
@@ -1399,7 +1393,7 @@
               <w14:ligatures w14:val="standardContextual"/>
             </w:rPr>
           </w:pPr>
-          <w:hyperlink w:anchor="_Toc238458724" w:history="1">
+          <w:hyperlink w:anchor="_Toc238474727" w:history="1">
             <w:r>
               <w:rPr>
                 <w:rStyle w:val="Hyperlink"/>
@@ -1426,7 +1420,7 @@
                 <w:noProof/>
                 <w:webHidden/>
               </w:rPr>
-              <w:instrText xml:space="preserve"> PAGEREF _Toc238458724 \h </w:instrText>
+              <w:instrText xml:space="preserve"> PAGEREF _Toc238474727 \h </w:instrText>
             </w:r>
             <w:r>
               <w:rPr>
@@ -1472,7 +1466,7 @@
               <w14:ligatures w14:val="standardContextual"/>
             </w:rPr>
           </w:pPr>
-          <w:hyperlink w:anchor="_Toc238458725" w:history="1">
+          <w:hyperlink w:anchor="_Toc238474728" w:history="1">
             <w:r>
               <w:rPr>
                 <w:rStyle w:val="Hyperlink"/>
@@ -1499,7 +1493,7 @@
                 <w:noProof/>
                 <w:webHidden/>
               </w:rPr>
-              <w:instrText xml:space="preserve"> PAGEREF _Toc238458725 \h </w:instrText>
+              <w:instrText xml:space="preserve"> PAGEREF _Toc238474728 \h </w:instrText>
             </w:r>
             <w:r>
               <w:rPr>
@@ -1545,7 +1539,7 @@
               <w14:ligatures w14:val="standardContextual"/>
             </w:rPr>
           </w:pPr>
-          <w:hyperlink w:anchor="_Toc238458726" w:history="1">
+          <w:hyperlink w:anchor="_Toc238474729" w:history="1">
             <w:r>
               <w:rPr>
                 <w:rStyle w:val="Hyperlink"/>
@@ -1572,7 +1566,7 @@
                 <w:noProof/>
                 <w:webHidden/>
               </w:rPr>
-              <w:instrText xml:space="preserve"> PAGEREF _Toc238458726 \h </w:instrText>
+              <w:instrText xml:space="preserve"> PAGEREF _Toc238474729 \h </w:instrText>
             </w:r>
             <w:r>
               <w:rPr>
@@ -1618,7 +1612,7 @@
               <w14:ligatures w14:val="standardContextual"/>
             </w:rPr>
           </w:pPr>
-          <w:hyperlink w:anchor="_Toc238458727" w:history="1">
+          <w:hyperlink w:anchor="_Toc238474730" w:history="1">
             <w:r>
               <w:rPr>
                 <w:rStyle w:val="Hyperlink"/>
@@ -1645,7 +1639,7 @@
                 <w:noProof/>
                 <w:webHidden/>
               </w:rPr>
-              <w:instrText xml:space="preserve"> PAGEREF _Toc238458727 \h </w:instrText>
+              <w:instrText xml:space="preserve"> PAGEREF _Toc238474730 \h </w:instrText>
             </w:r>
             <w:r>
               <w:rPr>
@@ -1691,7 +1685,7 @@
               <w14:ligatures w14:val="standardContextual"/>
             </w:rPr>
           </w:pPr>
-          <w:hyperlink w:anchor="_Toc238458728" w:history="1">
+          <w:hyperlink w:anchor="_Toc238474731" w:history="1">
             <w:r>
               <w:rPr>
                 <w:rStyle w:val="Hyperlink"/>
@@ -1718,7 +1712,7 @@
                 <w:noProof/>
                 <w:webHidden/>
               </w:rPr>
-              <w:instrText xml:space="preserve"> PAGEREF _Toc238458728 \h </w:instrText>
+              <w:instrText xml:space="preserve"> PAGEREF _Toc238474731 \h </w:instrText>
             </w:r>
             <w:r>
               <w:rPr>
@@ -1764,7 +1758,7 @@
               <w14:ligatures w14:val="standardContextual"/>
             </w:rPr>
           </w:pPr>
-          <w:hyperlink w:anchor="_Toc238458729" w:history="1">
+          <w:hyperlink w:anchor="_Toc238474732" w:history="1">
             <w:r>
               <w:rPr>
                 <w:rStyle w:val="Hyperlink"/>
@@ -1791,7 +1785,7 @@
                 <w:noProof/>
                 <w:webHidden/>
               </w:rPr>
-              <w:instrText xml:space="preserve"> PAGEREF _Toc238458729 \h </w:instrText>
+              <w:instrText xml:space="preserve"> PAGEREF _Toc238474732 \h </w:instrText>
             </w:r>
             <w:r>
               <w:rPr>
@@ -1837,7 +1831,7 @@
               <w14:ligatures w14:val="standardContextual"/>
             </w:rPr>
           </w:pPr>
-          <w:hyperlink w:anchor="_Toc238458730" w:history="1">
+          <w:hyperlink w:anchor="_Toc238474733" w:history="1">
             <w:r>
               <w:rPr>
                 <w:rStyle w:val="Hyperlink"/>
@@ -1864,7 +1858,7 @@
                 <w:noProof/>
                 <w:webHidden/>
               </w:rPr>
-              <w:instrText xml:space="preserve"> PAGEREF _Toc238458730 \h </w:instrText>
+              <w:instrText xml:space="preserve"> PAGEREF _Toc238474733 \h </w:instrText>
             </w:r>
             <w:r>
               <w:rPr>
@@ -1910,7 +1904,7 @@
               <w14:ligatures w14:val="standardContextual"/>
             </w:rPr>
           </w:pPr>
-          <w:hyperlink w:anchor="_Toc238458731" w:history="1">
+          <w:hyperlink w:anchor="_Toc238474734" w:history="1">
             <w:r>
               <w:rPr>
                 <w:rStyle w:val="Hyperlink"/>
@@ -1937,7 +1931,7 @@
                 <w:noProof/>
                 <w:webHidden/>
               </w:rPr>
-              <w:instrText xml:space="preserve"> PAGEREF _Toc238458731 \h </w:instrText>
+              <w:instrText xml:space="preserve"> PAGEREF _Toc238474734 \h </w:instrText>
             </w:r>
             <w:r>
               <w:rPr>
@@ -1983,7 +1977,7 @@
               <w14:ligatures w14:val="standardContextual"/>
             </w:rPr>
           </w:pPr>
-          <w:hyperlink w:anchor="_Toc238458732" w:history="1">
+          <w:hyperlink w:anchor="_Toc238474735" w:history="1">
             <w:r>
               <w:rPr>
                 <w:rStyle w:val="Hyperlink"/>
@@ -2010,7 +2004,7 @@
                 <w:noProof/>
                 <w:webHidden/>
               </w:rPr>
-              <w:instrText xml:space="preserve"> PAGEREF _Toc238458732 \h </w:instrText>
+              <w:instrText xml:space="preserve"> PAGEREF _Toc238474735 \h </w:instrText>
             </w:r>
             <w:r>
               <w:rPr>
@@ -2056,7 +2050,7 @@
               <w14:ligatures w14:val="standardContextual"/>
             </w:rPr>
           </w:pPr>
-          <w:hyperlink w:anchor="_Toc238458733" w:history="1">
+          <w:hyperlink w:anchor="_Toc238474736" w:history="1">
             <w:r>
               <w:rPr>
                 <w:rStyle w:val="Hyperlink"/>
@@ -2083,7 +2077,7 @@
                 <w:noProof/>
                 <w:webHidden/>
               </w:rPr>
-              <w:instrText xml:space="preserve"> PAGEREF _Toc238458733 \h </w:instrText>
+              <w:instrText xml:space="preserve"> PAGEREF _Toc238474736 \h </w:instrText>
             </w:r>
             <w:r>
               <w:rPr>
@@ -2103,7 +2097,7 @@
                 <w:noProof/>
                 <w:webHidden/>
               </w:rPr>
-              <w:t>17</w:t>
+              <w:t>16</w:t>
             </w:r>
             <w:r>
               <w:rPr>
@@ -2129,7 +2123,7 @@
               <w14:ligatures w14:val="standardContextual"/>
             </w:rPr>
           </w:pPr>
-          <w:hyperlink w:anchor="_Toc238458734" w:history="1">
+          <w:hyperlink w:anchor="_Toc238474737" w:history="1">
             <w:r>
               <w:rPr>
                 <w:rStyle w:val="Hyperlink"/>
@@ -2156,7 +2150,7 @@
                 <w:noProof/>
                 <w:webHidden/>
               </w:rPr>
-              <w:instrText xml:space="preserve"> PAGEREF _Toc238458734 \h </w:instrText>
+              <w:instrText xml:space="preserve"> PAGEREF _Toc238474737 \h </w:instrText>
             </w:r>
             <w:r>
               <w:rPr>
@@ -2199,7 +2193,7 @@
               <w14:ligatures w14:val="standardContextual"/>
             </w:rPr>
           </w:pPr>
-          <w:hyperlink w:anchor="_Toc238458735" w:history="1">
+          <w:hyperlink w:anchor="_Toc238474738" w:history="1">
             <w:r>
               <w:rPr>
                 <w:rStyle w:val="Hyperlink"/>
@@ -2226,7 +2220,7 @@
                 <w:noProof/>
                 <w:webHidden/>
               </w:rPr>
-              <w:instrText xml:space="preserve"> PAGEREF _Toc238458735 \h </w:instrText>
+              <w:instrText xml:space="preserve"> PAGEREF _Toc238474738 \h </w:instrText>
             </w:r>
             <w:r>
               <w:rPr>
@@ -2269,7 +2263,7 @@
               <w14:ligatures w14:val="standardContextual"/>
             </w:rPr>
           </w:pPr>
-          <w:hyperlink w:anchor="_Toc238458736" w:history="1">
+          <w:hyperlink w:anchor="_Toc238474739" w:history="1">
             <w:r>
               <w:rPr>
                 <w:rStyle w:val="Hyperlink"/>
@@ -2296,7 +2290,7 @@
                 <w:noProof/>
                 <w:webHidden/>
               </w:rPr>
-              <w:instrText xml:space="preserve"> PAGEREF _Toc238458736 \h </w:instrText>
+              <w:instrText xml:space="preserve"> PAGEREF _Toc238474739 \h </w:instrText>
             </w:r>
             <w:r>
               <w:rPr>
@@ -2342,7 +2336,7 @@
               <w14:ligatures w14:val="standardContextual"/>
             </w:rPr>
           </w:pPr>
-          <w:hyperlink w:anchor="_Toc238458737" w:history="1">
+          <w:hyperlink w:anchor="_Toc238474740" w:history="1">
             <w:r>
               <w:rPr>
                 <w:rStyle w:val="Hyperlink"/>
@@ -2369,7 +2363,7 @@
                 <w:noProof/>
                 <w:webHidden/>
               </w:rPr>
-              <w:instrText xml:space="preserve"> PAGEREF _Toc238458737 \h </w:instrText>
+              <w:instrText xml:space="preserve"> PAGEREF _Toc238474740 \h </w:instrText>
             </w:r>
             <w:r>
               <w:rPr>
@@ -2415,7 +2409,7 @@
               <w14:ligatures w14:val="standardContextual"/>
             </w:rPr>
           </w:pPr>
-          <w:hyperlink w:anchor="_Toc238458738" w:history="1">
+          <w:hyperlink w:anchor="_Toc238474741" w:history="1">
             <w:r>
               <w:rPr>
                 <w:rStyle w:val="Hyperlink"/>
@@ -2442,7 +2436,7 @@
                 <w:noProof/>
                 <w:webHidden/>
               </w:rPr>
-              <w:instrText xml:space="preserve"> PAGEREF _Toc238458738 \h </w:instrText>
+              <w:instrText xml:space="preserve"> PAGEREF _Toc238474741 \h </w:instrText>
             </w:r>
             <w:r>
               <w:rPr>
@@ -2488,7 +2482,7 @@
               <w14:ligatures w14:val="standardContextual"/>
             </w:rPr>
           </w:pPr>
-          <w:hyperlink w:anchor="_Toc238458739" w:history="1">
+          <w:hyperlink w:anchor="_Toc238474742" w:history="1">
             <w:r>
               <w:rPr>
                 <w:rStyle w:val="Hyperlink"/>
@@ -2515,7 +2509,7 @@
                 <w:noProof/>
                 <w:webHidden/>
               </w:rPr>
-              <w:instrText xml:space="preserve"> PAGEREF _Toc238458739 \h </w:instrText>
+              <w:instrText xml:space="preserve"> PAGEREF _Toc238474742 \h </w:instrText>
             </w:r>
             <w:r>
               <w:rPr>
@@ -2561,7 +2555,7 @@
               <w14:ligatures w14:val="standardContextual"/>
             </w:rPr>
           </w:pPr>
-          <w:hyperlink w:anchor="_Toc238458740" w:history="1">
+          <w:hyperlink w:anchor="_Toc238474743" w:history="1">
             <w:r>
               <w:rPr>
                 <w:rStyle w:val="Hyperlink"/>
@@ -2588,7 +2582,7 @@
                 <w:noProof/>
                 <w:webHidden/>
               </w:rPr>
-              <w:instrText xml:space="preserve"> PAGEREF _Toc238458740 \h </w:instrText>
+              <w:instrText xml:space="preserve"> PAGEREF _Toc238474743 \h </w:instrText>
             </w:r>
             <w:r>
               <w:rPr>
@@ -2634,7 +2628,7 @@
               <w14:ligatures w14:val="standardContextual"/>
             </w:rPr>
           </w:pPr>
-          <w:hyperlink w:anchor="_Toc238458741" w:history="1">
+          <w:hyperlink w:anchor="_Toc238474744" w:history="1">
             <w:r>
               <w:rPr>
                 <w:rStyle w:val="Hyperlink"/>
@@ -2661,7 +2655,7 @@
                 <w:noProof/>
                 <w:webHidden/>
               </w:rPr>
-              <w:instrText xml:space="preserve"> PAGEREF _Toc238458741 \h </w:instrText>
+              <w:instrText xml:space="preserve"> PAGEREF _Toc238474744 \h </w:instrText>
             </w:r>
             <w:r>
               <w:rPr>
@@ -2707,7 +2701,7 @@
               <w14:ligatures w14:val="standardContextual"/>
             </w:rPr>
           </w:pPr>
-          <w:hyperlink w:anchor="_Toc238458742" w:history="1">
+          <w:hyperlink w:anchor="_Toc238474745" w:history="1">
             <w:r>
               <w:rPr>
                 <w:rStyle w:val="Hyperlink"/>
@@ -2734,7 +2728,7 @@
                 <w:noProof/>
                 <w:webHidden/>
               </w:rPr>
-              <w:instrText xml:space="preserve"> PAGEREF _Toc238458742 \h </w:instrText>
+              <w:instrText xml:space="preserve"> PAGEREF _Toc238474745 \h </w:instrText>
             </w:r>
             <w:r>
               <w:rPr>
@@ -2777,7 +2771,7 @@
               <w14:ligatures w14:val="standardContextual"/>
             </w:rPr>
           </w:pPr>
-          <w:hyperlink w:anchor="_Toc238458743" w:history="1">
+          <w:hyperlink w:anchor="_Toc238474746" w:history="1">
             <w:r>
               <w:rPr>
                 <w:rStyle w:val="Hyperlink"/>
@@ -2804,7 +2798,7 @@
                 <w:noProof/>
                 <w:webHidden/>
               </w:rPr>
-              <w:instrText xml:space="preserve"> PAGEREF _Toc238458743 \h </w:instrText>
+              <w:instrText xml:space="preserve"> PAGEREF _Toc238474746 \h </w:instrText>
             </w:r>
             <w:r>
               <w:rPr>
@@ -2847,7 +2841,7 @@
               <w14:ligatures w14:val="standardContextual"/>
             </w:rPr>
           </w:pPr>
-          <w:hyperlink w:anchor="_Toc238458744" w:history="1">
+          <w:hyperlink w:anchor="_Toc238474747" w:history="1">
             <w:r>
               <w:rPr>
                 <w:rStyle w:val="Hyperlink"/>
@@ -2874,7 +2868,7 @@
                 <w:noProof/>
                 <w:webHidden/>
               </w:rPr>
-              <w:instrText xml:space="preserve"> PAGEREF _Toc238458744 \h </w:instrText>
+              <w:instrText xml:space="preserve"> PAGEREF _Toc238474747 \h </w:instrText>
             </w:r>
             <w:r>
               <w:rPr>
@@ -2917,7 +2911,7 @@
               <w14:ligatures w14:val="standardContextual"/>
             </w:rPr>
           </w:pPr>
-          <w:hyperlink w:anchor="_Toc238458745" w:history="1">
+          <w:hyperlink w:anchor="_Toc238474748" w:history="1">
             <w:r>
               <w:rPr>
                 <w:rStyle w:val="Hyperlink"/>
@@ -2944,7 +2938,7 @@
                 <w:noProof/>
                 <w:webHidden/>
               </w:rPr>
-              <w:instrText xml:space="preserve"> PAGEREF _Toc238458745 \h </w:instrText>
+              <w:instrText xml:space="preserve"> PAGEREF _Toc238474748 \h </w:instrText>
             </w:r>
             <w:r>
               <w:rPr>
@@ -2987,7 +2981,7 @@
               <w14:ligatures w14:val="standardContextual"/>
             </w:rPr>
           </w:pPr>
-          <w:hyperlink w:anchor="_Toc238458746" w:history="1">
+          <w:hyperlink w:anchor="_Toc238474749" w:history="1">
             <w:r>
               <w:rPr>
                 <w:rStyle w:val="Hyperlink"/>
@@ -3014,7 +3008,7 @@
                 <w:noProof/>
                 <w:webHidden/>
               </w:rPr>
-              <w:instrText xml:space="preserve"> PAGEREF _Toc238458746 \h </w:instrText>
+              <w:instrText xml:space="preserve"> PAGEREF _Toc238474749 \h </w:instrText>
             </w:r>
             <w:r>
               <w:rPr>
@@ -3035,6 +3029,152 @@
                 <w:webHidden/>
               </w:rPr>
               <w:t>28</w:t>
+            </w:r>
+            <w:r>
+              <w:rPr>
+                <w:noProof/>
+                <w:webHidden/>
+              </w:rPr>
+              <w:fldChar w:fldCharType="end"/>
+            </w:r>
+          </w:hyperlink>
+        </w:p>
+        <w:p>
+          <w:pPr>
+            <w:pStyle w:val="TOC2"/>
+            <w:tabs>
+              <w:tab w:val="right" w:leader="dot" w:pos="10070"/>
+            </w:tabs>
+            <w:rPr>
+              <w:rFonts w:asciiTheme="minorHAnsi" w:eastAsiaTheme="minorEastAsia" w:hAnsiTheme="minorHAnsi" w:cstheme="minorBidi"/>
+              <w:noProof/>
+              <w:kern w:val="2"/>
+              <w:sz w:val="24"/>
+              <w:szCs w:val="24"/>
+              <w14:ligatures w14:val="standardContextual"/>
+            </w:rPr>
+          </w:pPr>
+          <w:hyperlink w:anchor="_Toc238474750" w:history="1">
+            <w:r>
+              <w:rPr>
+                <w:rStyle w:val="Hyperlink"/>
+                <w:noProof/>
+              </w:rPr>
+              <w:t>UI and Navigation Design references (Zario)</w:t>
+            </w:r>
+            <w:r>
+              <w:rPr>
+                <w:noProof/>
+                <w:webHidden/>
+              </w:rPr>
+              <w:tab/>
+            </w:r>
+            <w:r>
+              <w:rPr>
+                <w:noProof/>
+                <w:webHidden/>
+              </w:rPr>
+              <w:fldChar w:fldCharType="begin"/>
+            </w:r>
+            <w:r>
+              <w:rPr>
+                <w:noProof/>
+                <w:webHidden/>
+              </w:rPr>
+              <w:instrText xml:space="preserve"> PAGEREF _Toc238474750 \h </w:instrText>
+            </w:r>
+            <w:r>
+              <w:rPr>
+                <w:noProof/>
+                <w:webHidden/>
+              </w:rPr>
+            </w:r>
+            <w:r>
+              <w:rPr>
+                <w:noProof/>
+                <w:webHidden/>
+              </w:rPr>
+              <w:fldChar w:fldCharType="separate"/>
+            </w:r>
+            <w:r>
+              <w:rPr>
+                <w:noProof/>
+                <w:webHidden/>
+              </w:rPr>
+              <w:t>28</w:t>
+            </w:r>
+            <w:r>
+              <w:rPr>
+                <w:noProof/>
+                <w:webHidden/>
+              </w:rPr>
+              <w:fldChar w:fldCharType="end"/>
+            </w:r>
+          </w:hyperlink>
+        </w:p>
+        <w:p>
+          <w:pPr>
+            <w:pStyle w:val="TOC2"/>
+            <w:tabs>
+              <w:tab w:val="right" w:leader="dot" w:pos="10070"/>
+            </w:tabs>
+            <w:rPr>
+              <w:rFonts w:asciiTheme="minorHAnsi" w:eastAsiaTheme="minorEastAsia" w:hAnsiTheme="minorHAnsi" w:cstheme="minorBidi"/>
+              <w:noProof/>
+              <w:kern w:val="2"/>
+              <w:sz w:val="24"/>
+              <w:szCs w:val="24"/>
+              <w14:ligatures w14:val="standardContextual"/>
+            </w:rPr>
+          </w:pPr>
+          <w:hyperlink w:anchor="_Toc238474751" w:history="1">
+            <w:r>
+              <w:rPr>
+                <w:rStyle w:val="Hyperlink"/>
+                <w:noProof/>
+              </w:rPr>
+              <w:t>API and Architecture references (Kaehil)</w:t>
+            </w:r>
+            <w:r>
+              <w:rPr>
+                <w:noProof/>
+                <w:webHidden/>
+              </w:rPr>
+              <w:tab/>
+            </w:r>
+            <w:r>
+              <w:rPr>
+                <w:noProof/>
+                <w:webHidden/>
+              </w:rPr>
+              <w:fldChar w:fldCharType="begin"/>
+            </w:r>
+            <w:r>
+              <w:rPr>
+                <w:noProof/>
+                <w:webHidden/>
+              </w:rPr>
+              <w:instrText xml:space="preserve"> PAGEREF _Toc238474751 \h </w:instrText>
+            </w:r>
+            <w:r>
+              <w:rPr>
+                <w:noProof/>
+                <w:webHidden/>
+              </w:rPr>
+            </w:r>
+            <w:r>
+              <w:rPr>
+                <w:noProof/>
+                <w:webHidden/>
+              </w:rPr>
+              <w:fldChar w:fldCharType="separate"/>
+            </w:r>
+            <w:r>
+              <w:rPr>
+                <w:noProof/>
+                <w:webHidden/>
+              </w:rPr>
+              <w:t>29</w:t>
             </w:r>
             <w:r>
               <w:rPr>
@@ -3060,6 +3200,7 @@
               <w:bCs/>
               <w:noProof/>
             </w:rPr>
+            <w:lastRenderedPageBreak/>
             <w:fldChar w:fldCharType="end"/>
           </w:r>
         </w:p>
@@ -3067,148 +3208,178 @@
     </w:sdt>
     <w:p>
       <w:pPr>
+        <w:pStyle w:val="Heading1"/>
+        <w:spacing w:before="340" w:after="140" w:line="276" w:lineRule="auto"/>
+      </w:pPr>
+      <w:bookmarkStart w:id="0" w:name="_Toc238474717"/>
+      <w:r>
+        <w:t>1. Introduction</w:t>
+      </w:r>
+      <w:bookmarkEnd w:id="0"/>
+    </w:p>
+    <w:p>
+      <w:pPr>
+        <w:spacing w:after="140" w:line="276" w:lineRule="auto"/>
+      </w:pPr>
+      <w:r>
+        <w:t>Small-scale and emerging farmers in South Africa consistently struggle to find reliable, consistent buyers for their produce. With an estimated 2.4 million smallholder farming households in the country, and only a small fraction of them regularly selling what they grow, most farm largely for survival rather than income</w:t>
+      </w:r>
+      <w:r>
+        <w:t>,</w:t>
+      </w:r>
+      <w:r>
+        <w:t xml:space="preserve"> not for lack of produce, but for lack of a practical way to reach buyers beyond their immediate community. Farmers who do sell typically rely on informal word-of-mouth, WhatsApp groups, or middlemen who take a significant cut of the final price, all of which are slow, unreliable, or reduce the farmer's own margin.</w:t>
+      </w:r>
+    </w:p>
+    <w:p>
+      <w:pPr>
+        <w:spacing w:after="140" w:line="276" w:lineRule="auto"/>
+      </w:pPr>
+      <w:r>
+        <w:t xml:space="preserve">From The Farm addresses this gap directly: it is a native Android application that connects small-scale farmers with local produce buyers </w:t>
+      </w:r>
+      <w:r>
+        <w:t>(</w:t>
+      </w:r>
+      <w:r>
+        <w:t>spaza shops, restaurants, and informal traders</w:t>
+      </w:r>
+      <w:r>
+        <w:t xml:space="preserve">) </w:t>
+      </w:r>
+      <w:r>
+        <w:t>through a location and attribute</w:t>
+      </w:r>
+      <w:r>
+        <w:t xml:space="preserve"> </w:t>
+      </w:r>
+      <w:r>
+        <w:t>based matching system. The app deliberately excludes payment processing and financing, keeping its scope to discovery and logistics coordination, which the group identified early on as the realistic boundary for a project of this size within a single semester.</w:t>
+      </w:r>
+    </w:p>
+    <w:p>
+      <w:pPr>
+        <w:spacing w:after="140" w:line="276" w:lineRule="auto"/>
+      </w:pPr>
+      <w:r>
+        <w:t xml:space="preserve">This document is the Planning and Design submission for Part 1 of the PROG7314 Portfolio of Evidence. It builds on the Research Report's comparison of three existing Android </w:t>
+      </w:r>
+      <w:proofErr w:type="gramStart"/>
+      <w:r>
+        <w:t>applications, and</w:t>
+      </w:r>
+      <w:proofErr w:type="gramEnd"/>
+      <w:r>
+        <w:t xml:space="preserve"> translates those findings into a complete technical blueprint the group can build against in Part 2. The sections that follow cover: the application overview and its core feature set (Section 2); a detailed requirements specification (Section 3); the UI screens, functional descriptions, and navigation </w:t>
+      </w:r>
+      <w:proofErr w:type="spellStart"/>
+      <w:r>
+        <w:t>wireflow</w:t>
+      </w:r>
+      <w:proofErr w:type="spellEnd"/>
+      <w:r>
+        <w:t xml:space="preserve"> (Section 4); the REST API's structure and endpoint specification (Section 5); the UML diagrams showing how the app, API, and database interact (Section 6); the full data model and schema definitions (Section 7); and the project's timeline and task breakdown (Section 8), before closing with a conclusion and reference list.</w:t>
+      </w:r>
+    </w:p>
+    <w:p>
+      <w:pPr>
+        <w:spacing w:after="140" w:line="276" w:lineRule="auto"/>
+      </w:pPr>
+    </w:p>
+    <w:p>
+      <w:pPr>
+        <w:spacing w:after="140" w:line="276" w:lineRule="auto"/>
+      </w:pPr>
+    </w:p>
+    <w:p>
+      <w:pPr>
+        <w:spacing w:after="140" w:line="276" w:lineRule="auto"/>
+      </w:pPr>
+    </w:p>
+    <w:p>
+      <w:pPr>
+        <w:spacing w:after="140" w:line="276" w:lineRule="auto"/>
+      </w:pPr>
+    </w:p>
+    <w:p>
+      <w:pPr>
+        <w:spacing w:after="140" w:line="276" w:lineRule="auto"/>
+      </w:pPr>
+    </w:p>
+    <w:p>
+      <w:pPr>
+        <w:spacing w:after="140" w:line="276" w:lineRule="auto"/>
+      </w:pPr>
+    </w:p>
+    <w:p>
+      <w:pPr>
+        <w:spacing w:after="140" w:line="276" w:lineRule="auto"/>
+      </w:pPr>
+    </w:p>
+    <w:p>
+      <w:pPr>
+        <w:spacing w:after="140" w:line="276" w:lineRule="auto"/>
+      </w:pPr>
+    </w:p>
+    <w:p>
+      <w:pPr>
+        <w:spacing w:after="140" w:line="276" w:lineRule="auto"/>
+      </w:pPr>
+    </w:p>
+    <w:p>
+      <w:pPr>
+        <w:spacing w:after="140" w:line="276" w:lineRule="auto"/>
+      </w:pPr>
+    </w:p>
+    <w:p>
+      <w:pPr>
+        <w:spacing w:after="140" w:line="276" w:lineRule="auto"/>
+      </w:pPr>
+    </w:p>
+    <w:p>
+      <w:pPr>
+        <w:spacing w:after="140" w:line="276" w:lineRule="auto"/>
+      </w:pPr>
+    </w:p>
+    <w:p>
+      <w:pPr>
+        <w:pStyle w:val="Heading1"/>
+        <w:spacing w:before="340" w:after="140" w:line="276" w:lineRule="auto"/>
+      </w:pPr>
+    </w:p>
+    <w:p>
+      <w:pPr>
+        <w:pStyle w:val="Heading1"/>
+        <w:spacing w:before="340" w:after="140" w:line="276" w:lineRule="auto"/>
+      </w:pPr>
+      <w:bookmarkStart w:id="1" w:name="_Toc238474718"/>
+      <w:r>
+        <w:t>2. Application Overview</w:t>
+      </w:r>
+      <w:bookmarkEnd w:id="1"/>
+    </w:p>
+    <w:p>
+      <w:pPr>
+        <w:spacing w:after="110" w:line="276" w:lineRule="auto"/>
+      </w:pPr>
+      <w:r>
         <w:rPr>
           <w:b/>
           <w:bCs/>
-          <w:noProof/>
-        </w:rPr>
-      </w:pPr>
-    </w:p>
-    <w:p>
-      <w:pPr>
-        <w:jc w:val="center"/>
-      </w:pPr>
-    </w:p>
-    <w:p>
-      <w:pPr>
-        <w:pStyle w:val="Heading1"/>
-        <w:spacing w:before="340" w:after="140" w:line="276" w:lineRule="auto"/>
-      </w:pPr>
-      <w:bookmarkStart w:id="0" w:name="_Toc238458714"/>
-      <w:r>
-        <w:lastRenderedPageBreak/>
-        <w:t>1. Introduction</w:t>
-      </w:r>
-      <w:bookmarkEnd w:id="0"/>
-    </w:p>
-    <w:p>
-      <w:pPr>
-        <w:spacing w:after="140" w:line="276" w:lineRule="auto"/>
-      </w:pPr>
-      <w:r>
-        <w:t>Small-scale and emerging farmers in South Africa consistently struggle to find reliable, consistent buyers for their produce. With an estimated 2.4 million smallholder farming households in the country, and only a small fraction of them regularly selling what they grow, most farm largely for survival rather than income</w:t>
-      </w:r>
-      <w:r>
-        <w:t>,</w:t>
-      </w:r>
-      <w:r>
-        <w:t xml:space="preserve"> not for lack of produce, but for lack of a practical way to reach buyers beyond their immediate community. Farmers who do sell typically rely on informal word-of-mouth, WhatsApp groups, or middlemen who take a significant cut of the final price, all of which are slow, unreliable, or reduce the farmer's own margin.</w:t>
-      </w:r>
-    </w:p>
-    <w:p>
-      <w:pPr>
-        <w:spacing w:after="140" w:line="276" w:lineRule="auto"/>
-      </w:pPr>
-      <w:r>
-        <w:t xml:space="preserve">From The Farm addresses this gap directly: it is a native Android application that connects small-scale farmers with local produce buyers </w:t>
-      </w:r>
-      <w:r>
-        <w:t>(</w:t>
-      </w:r>
-      <w:r>
-        <w:t>spaza shops, restaurants, and informal traders</w:t>
-      </w:r>
-      <w:r>
-        <w:t xml:space="preserve">) </w:t>
-      </w:r>
-      <w:r>
-        <w:t>through a location and attribute</w:t>
-      </w:r>
-      <w:r>
-        <w:t xml:space="preserve"> </w:t>
-      </w:r>
-      <w:r>
-        <w:t>based matching system. The app deliberately excludes payment processing and financing, keeping its scope to discovery and logistics coordination, which the group identified early on as the realistic boundary for a project of this size within a single semester.</w:t>
-      </w:r>
-    </w:p>
-    <w:p>
-      <w:pPr>
-        <w:spacing w:after="140" w:line="276" w:lineRule="auto"/>
-      </w:pPr>
-      <w:r>
-        <w:t>This document is the Planning and Design submission for Part 1 of the PROG7314 Portfolio of Evidence. It builds on the Research Report's comparison of three existing Android applications, and translates those findings into a complete technical blueprint the group can build against in Part 2. The sections that follow cover: the application overview and its core feature set (Section 2); a detailed requirements specification (Section 3); the UI screens, functional descriptions, and navigation wireflow (Section 4); the REST API's structure and endpoint specification (Section 5); the UML diagrams showing how the app, API, and database interact (Section 6); the full data model and schema definitions (Section 7); and the project's timeline and task breakdown (Section 8), before closing with a conclusion and reference list.</w:t>
-      </w:r>
-    </w:p>
-    <w:p>
-      <w:pPr>
-        <w:spacing w:after="140" w:line="276" w:lineRule="auto"/>
-      </w:pPr>
-    </w:p>
-    <w:p>
-      <w:pPr>
-        <w:spacing w:after="140" w:line="276" w:lineRule="auto"/>
-      </w:pPr>
-    </w:p>
-    <w:p>
-      <w:pPr>
-        <w:spacing w:after="140" w:line="276" w:lineRule="auto"/>
-      </w:pPr>
-    </w:p>
-    <w:p>
-      <w:pPr>
-        <w:spacing w:after="140" w:line="276" w:lineRule="auto"/>
-      </w:pPr>
-    </w:p>
-    <w:p>
-      <w:pPr>
-        <w:spacing w:after="140" w:line="276" w:lineRule="auto"/>
-      </w:pPr>
-    </w:p>
-    <w:p>
-      <w:pPr>
-        <w:spacing w:after="140" w:line="276" w:lineRule="auto"/>
-      </w:pPr>
-    </w:p>
-    <w:p>
-      <w:pPr>
-        <w:spacing w:after="140" w:line="276" w:lineRule="auto"/>
-      </w:pPr>
-    </w:p>
-    <w:p>
-      <w:pPr>
-        <w:spacing w:after="140" w:line="276" w:lineRule="auto"/>
-      </w:pPr>
-    </w:p>
-    <w:p>
-      <w:pPr>
-        <w:spacing w:after="140" w:line="276" w:lineRule="auto"/>
-      </w:pPr>
-    </w:p>
-    <w:p>
-      <w:pPr>
-        <w:spacing w:after="140" w:line="276" w:lineRule="auto"/>
-      </w:pPr>
-    </w:p>
-    <w:p>
-      <w:pPr>
-        <w:spacing w:after="140" w:line="276" w:lineRule="auto"/>
-      </w:pPr>
-    </w:p>
-    <w:p>
-      <w:pPr>
-        <w:spacing w:after="140" w:line="276" w:lineRule="auto"/>
-      </w:pPr>
-    </w:p>
-    <w:p>
-      <w:pPr>
-        <w:pStyle w:val="Heading1"/>
-        <w:spacing w:before="340" w:after="140" w:line="276" w:lineRule="auto"/>
-      </w:pPr>
-      <w:bookmarkStart w:id="1" w:name="_Toc238458715"/>
-      <w:r>
-        <w:t>2. Application Overview</w:t>
-      </w:r>
-      <w:bookmarkEnd w:id="1"/>
+        </w:rPr>
+        <w:t xml:space="preserve">App name: </w:t>
+      </w:r>
+      <w:r>
+        <w:t xml:space="preserve">From </w:t>
+      </w:r>
+      <w:proofErr w:type="gramStart"/>
+      <w:r>
+        <w:t>The</w:t>
+      </w:r>
+      <w:proofErr w:type="gramEnd"/>
+      <w:r>
+        <w:t xml:space="preserve"> Farm</w:t>
+      </w:r>
     </w:p>
     <w:p>
       <w:pPr>
@@ -3219,22 +3390,6 @@
           <w:b/>
           <w:bCs/>
         </w:rPr>
-        <w:t xml:space="preserve">App name: </w:t>
-      </w:r>
-      <w:r>
-        <w:t>From The Farm</w:t>
-      </w:r>
-    </w:p>
-    <w:p>
-      <w:pPr>
-        <w:spacing w:after="110" w:line="276" w:lineRule="auto"/>
-      </w:pPr>
-      <w:r>
-        <w:rPr>
-          <w:b/>
-          <w:bCs/>
-        </w:rPr>
-        <w:lastRenderedPageBreak/>
         <w:t xml:space="preserve">Icon concept: </w:t>
       </w:r>
       <w:r>
@@ -3387,7 +3542,15 @@
         <w:t>:</w:t>
       </w:r>
       <w:r>
-        <w:t xml:space="preserve"> a non-financial thumbs-up/thumbs-down left after a completed exchange.</w:t>
+        <w:t xml:space="preserve"> a </w:t>
+      </w:r>
+      <w:proofErr w:type="gramStart"/>
+      <w:r>
+        <w:t>non-financial thumbs</w:t>
+      </w:r>
+      <w:proofErr w:type="gramEnd"/>
+      <w:r>
+        <w:t>-up/thumbs-down left after a completed exchange.</w:t>
       </w:r>
     </w:p>
     <w:p>
@@ -3408,7 +3571,7 @@
         <w:pStyle w:val="Heading1"/>
         <w:spacing w:before="340" w:after="140" w:line="276" w:lineRule="auto"/>
       </w:pPr>
-      <w:bookmarkStart w:id="2" w:name="_Toc238458716"/>
+      <w:bookmarkStart w:id="2" w:name="_Toc238474719"/>
       <w:r>
         <w:lastRenderedPageBreak/>
         <w:t>3. Detailed Requirements Specification</w:t>
@@ -3420,7 +3583,7 @@
         <w:pStyle w:val="Heading2"/>
         <w:spacing w:before="240" w:after="110" w:line="276" w:lineRule="auto"/>
       </w:pPr>
-      <w:bookmarkStart w:id="3" w:name="_Toc238458717"/>
+      <w:bookmarkStart w:id="3" w:name="_Toc238474720"/>
       <w:r>
         <w:t>3.1. UI-related requirements</w:t>
       </w:r>
@@ -3465,7 +3628,15 @@
         <w:spacing w:after="70" w:line="276" w:lineRule="auto"/>
       </w:pPr>
       <w:r>
-        <w:t>Listing and demand creation forms must validate required fields (crop type, quantity, date) before allowing submission, and must save to local offline storage if there is no network connection at submit time.</w:t>
+        <w:t xml:space="preserve">Listing and demand creation forms must validate required fields (crop type, quantity, date) before allowing </w:t>
+      </w:r>
+      <w:proofErr w:type="gramStart"/>
+      <w:r>
+        <w:t>submission, and</w:t>
+      </w:r>
+      <w:proofErr w:type="gramEnd"/>
+      <w:r>
+        <w:t xml:space="preserve"> must save to local offline storage if there is no network connection at submit time.</w:t>
       </w:r>
     </w:p>
     <w:p>
@@ -3505,7 +3676,7 @@
         <w:pStyle w:val="Heading2"/>
         <w:spacing w:line="276" w:lineRule="auto"/>
       </w:pPr>
-      <w:bookmarkStart w:id="4" w:name="_Toc238458718"/>
+      <w:bookmarkStart w:id="4" w:name="_Toc238474721"/>
       <w:r>
         <w:t xml:space="preserve">3.2. </w:t>
       </w:r>
@@ -3578,7 +3749,15 @@
         <w:t>,</w:t>
       </w:r>
       <w:r>
-        <w:t xml:space="preserve"> no single device has visibility into anyone else's data. Matching is triggered whenever a new listing or demand request is created or updated, and results are persisted so the feed does not need to be recomputed on every read.</w:t>
+        <w:t xml:space="preserve"> no single device has visibility into anyone else's data. Matching is triggered whenever a new listing or demand request is created or updated, and results </w:t>
+      </w:r>
+      <w:proofErr w:type="gramStart"/>
+      <w:r>
+        <w:t>are persisted</w:t>
+      </w:r>
+      <w:proofErr w:type="gramEnd"/>
+      <w:r>
+        <w:t xml:space="preserve"> so the feed does not need to be recomputed on every read.</w:t>
       </w:r>
     </w:p>
     <w:p>
@@ -3750,7 +3929,15 @@
         <w:spacing w:line="276" w:lineRule="auto"/>
       </w:pPr>
       <w:r>
-        <w:t>The API must accept offline-created records for reconciliation. When a listing or demand request is created without network connectivity, the Android app stores it locally with a client-generated identifier; once reconnected, the app submits it to the API, which reconciles it against that identifier so a record is never duplicated if the sync retries.</w:t>
+        <w:t xml:space="preserve">The API must accept offline-created records for reconciliation. When a listing or demand request is created without network connectivity, the Android app stores it locally with a client-generated identifier; once reconnected, the app submits it to the API, which reconciles it against that </w:t>
+      </w:r>
+      <w:proofErr w:type="gramStart"/>
+      <w:r>
+        <w:t>identifier</w:t>
+      </w:r>
+      <w:proofErr w:type="gramEnd"/>
+      <w:r>
+        <w:t xml:space="preserve"> so a record is never duplicated if the sync retries.</w:t>
       </w:r>
     </w:p>
     <w:p>
@@ -3768,7 +3955,15 @@
         <w:spacing w:line="276" w:lineRule="auto"/>
       </w:pPr>
       <w:r>
-        <w:t>The API must support a one-time rating per completed match. A thumbs-up/thumbs-down submission is only accepted once a match's status is "Completed," and only once per match, preventing repeated or premature ratings from skewing a user's trust signal.</w:t>
+        <w:t xml:space="preserve">The API must support a one-time rating per completed match. A </w:t>
+      </w:r>
+      <w:proofErr w:type="gramStart"/>
+      <w:r>
+        <w:t>thumbs</w:t>
+      </w:r>
+      <w:proofErr w:type="gramEnd"/>
+      <w:r>
+        <w:t>-up/thumbs-down submission is only accepted once a match's status is "Completed," and only once per match, preventing repeated or premature ratings from skewing a user's trust signal.</w:t>
       </w:r>
     </w:p>
     <w:p>
@@ -3789,7 +3984,7 @@
         <w:pStyle w:val="Heading1"/>
         <w:spacing w:before="340" w:after="140" w:line="276" w:lineRule="auto"/>
       </w:pPr>
-      <w:bookmarkStart w:id="5" w:name="_Toc238458719"/>
+      <w:bookmarkStart w:id="5" w:name="_Toc238474722"/>
       <w:r>
         <w:lastRenderedPageBreak/>
         <w:t>4. User Interface (UI) and Navigation Design</w:t>
@@ -3804,7 +3999,7 @@
         <w:pStyle w:val="Heading2"/>
         <w:spacing w:before="240" w:after="110" w:line="276" w:lineRule="auto"/>
       </w:pPr>
-      <w:bookmarkStart w:id="6" w:name="_Toc238458720"/>
+      <w:bookmarkStart w:id="6" w:name="_Toc238474723"/>
       <w:r>
         <w:t>4.1. Screen list and functional descriptions</w:t>
       </w:r>
@@ -3933,7 +4128,15 @@
         <w:t xml:space="preserve">Harvest calendar: </w:t>
       </w:r>
       <w:r>
-        <w:t>Calendar view of upcoming listings by expected harvest date, letting buyers plan ahead. Tap a date to see what's expected.</w:t>
+        <w:t xml:space="preserve">Calendar view of upcoming listings by expected harvest date, letting buyers </w:t>
+      </w:r>
+      <w:proofErr w:type="gramStart"/>
+      <w:r>
+        <w:t>plan ahead</w:t>
+      </w:r>
+      <w:proofErr w:type="gramEnd"/>
+      <w:r>
+        <w:t>. Tap a date to see what's expected.</w:t>
       </w:r>
     </w:p>
     <w:p>
@@ -4025,7 +4228,7 @@
         <w:pStyle w:val="Heading2"/>
         <w:spacing w:before="240" w:after="110" w:line="276" w:lineRule="auto"/>
       </w:pPr>
-      <w:bookmarkStart w:id="7" w:name="_Toc238458721"/>
+      <w:bookmarkStart w:id="7" w:name="_Toc238474724"/>
       <w:r>
         <w:lastRenderedPageBreak/>
         <w:t>4.2. Screen mock</w:t>
@@ -4114,7 +4317,7 @@
               </wp:anchor>
             </w:drawing>
           </mc:Choice>
-          <mc:Fallback xmlns:w16cei="http://schemas.microsoft.com/office/word/2026/wordml/cei">
+          <mc:Fallback>
             <w:pict>
               <v:shapetype w14:anchorId="68C5B54F" id="_x0000_t202" coordsize="21600,21600" o:spt="202" path="m,l,21600r21600,l21600,xe">
                 <v:stroke joinstyle="miter"/>
@@ -4303,7 +4506,7 @@
               </wp:anchor>
             </w:drawing>
           </mc:Choice>
-          <mc:Fallback xmlns:w16cei="http://schemas.microsoft.com/office/word/2026/wordml/cei">
+          <mc:Fallback>
             <w:pict>
               <v:shape w14:anchorId="4E89FA69" id="_x0000_s1029" type="#_x0000_t202" style="position:absolute;margin-left:6pt;margin-top:430.9pt;width:188.25pt;height:.05pt;z-index:-251655168;visibility:visible;mso-wrap-style:square;mso-wrap-distance-left:9pt;mso-wrap-distance-top:0;mso-wrap-distance-right:9pt;mso-wrap-distance-bottom:0;mso-position-horizontal:absolute;mso-position-horizontal-relative:text;mso-position-vertical:absolute;mso-position-vertical-relative:text;v-text-anchor:top" o:gfxdata="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" filled="f" stroked="f">
                 <v:textbox style="mso-fit-shape-to-text:t" inset="0,0,0,0">
@@ -4500,7 +4703,7 @@
               </wp:anchor>
             </w:drawing>
           </mc:Choice>
-          <mc:Fallback xmlns:w16cei="http://schemas.microsoft.com/office/word/2026/wordml/cei">
+          <mc:Fallback>
             <w:pict>
               <v:shape w14:anchorId="1F7B14F6" id="_x0000_s1030" type="#_x0000_t202" style="position:absolute;margin-left:304.5pt;margin-top:430.35pt;width:188.25pt;height:.05pt;z-index:-251650048;visibility:visible;mso-wrap-style:square;mso-wrap-distance-left:9pt;mso-wrap-distance-top:0;mso-wrap-distance-right:9pt;mso-wrap-distance-bottom:0;mso-position-horizontal:absolute;mso-position-horizontal-relative:text;mso-position-vertical:absolute;mso-position-vertical-relative:text;v-text-anchor:top" o:gfxdata="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" filled="f" stroked="f">
                 <v:textbox style="mso-fit-shape-to-text:t" inset="0,0,0,0">
@@ -4685,7 +4888,7 @@
               </wp:anchor>
             </w:drawing>
           </mc:Choice>
-          <mc:Fallback xmlns:w16cei="http://schemas.microsoft.com/office/word/2026/wordml/cei">
+          <mc:Fallback>
             <w:pict>
               <v:shape w14:anchorId="372430DF" id="_x0000_s1031" type="#_x0000_t202" style="position:absolute;margin-left:6pt;margin-top:429.65pt;width:188.25pt;height:.05pt;z-index:-251651072;visibility:visible;mso-wrap-style:square;mso-wrap-distance-left:9pt;mso-wrap-distance-top:0;mso-wrap-distance-right:9pt;mso-wrap-distance-bottom:0;mso-position-horizontal:absolute;mso-position-horizontal-relative:text;mso-position-vertical:absolute;mso-position-vertical-relative:text;v-text-anchor:top" o:gfxdata="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" filled="f" stroked="f">
                 <v:textbox style="mso-fit-shape-to-text:t" inset="0,0,0,0">
@@ -4968,7 +5171,7 @@
               </wp:anchor>
             </w:drawing>
           </mc:Choice>
-          <mc:Fallback xmlns:w16cei="http://schemas.microsoft.com/office/word/2026/wordml/cei">
+          <mc:Fallback>
             <w:pict>
               <v:shape w14:anchorId="5FA84984" id="_x0000_s1032" type="#_x0000_t202" style="position:absolute;margin-left:6pt;margin-top:431.2pt;width:188.25pt;height:.05pt;z-index:-251646976;visibility:visible;mso-wrap-style:square;mso-wrap-distance-left:9pt;mso-wrap-distance-top:0;mso-wrap-distance-right:9pt;mso-wrap-distance-bottom:0;mso-position-horizontal:absolute;mso-position-horizontal-relative:text;mso-position-vertical:absolute;mso-position-vertical-relative:text;v-text-anchor:top" o:gfxdata="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" filled="f" stroked="f">
                 <v:textbox style="mso-fit-shape-to-text:t" inset="0,0,0,0">
@@ -5166,7 +5369,7 @@
               </wp:anchor>
             </w:drawing>
           </mc:Choice>
-          <mc:Fallback xmlns:w16cei="http://schemas.microsoft.com/office/word/2026/wordml/cei">
+          <mc:Fallback>
             <w:pict>
               <v:shape w14:anchorId="6A40D99E" id="_x0000_s1033" type="#_x0000_t202" style="position:absolute;margin-left:304.5pt;margin-top:431.65pt;width:188.25pt;height:.05pt;z-index:-251645952;visibility:visible;mso-wrap-style:square;mso-wrap-distance-left:9pt;mso-wrap-distance-top:0;mso-wrap-distance-right:9pt;mso-wrap-distance-bottom:0;mso-position-horizontal:absolute;mso-position-horizontal-relative:text;mso-position-vertical:absolute;mso-position-vertical-relative:text;v-text-anchor:top" o:gfxdata="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" filled="f" stroked="f">
                 <v:textbox style="mso-fit-shape-to-text:t" inset="0,0,0,0">
@@ -5183,24 +5386,14 @@
                       <w:r>
                         <w:t xml:space="preserve">Figure </w:t>
                       </w:r>
-                      <w:r>
-                        <w:fldChar w:fldCharType="begin"/>
-                      </w:r>
-                      <w:r>
-                        <w:instrText xml:space="preserve"> SEQ Figure \* ARABIC </w:instrText>
-                      </w:r>
-                      <w:r>
-                        <w:fldChar w:fldCharType="separate"/>
-                      </w:r>
-                      <w:r>
-                        <w:rPr>
-                          <w:noProof/>
-                        </w:rPr>
-                        <w:t>6</w:t>
-                      </w:r>
-                      <w:r>
-                        <w:fldChar w:fldCharType="end"/>
-                      </w:r>
+                      <w:fldSimple w:instr=" SEQ Figure \* ARABIC ">
+                        <w:r>
+                          <w:rPr>
+                            <w:noProof/>
+                          </w:rPr>
+                          <w:t>6</w:t>
+                        </w:r>
+                      </w:fldSimple>
                       <w:r>
                         <w:t>: Buyer Demand Board Screen</w:t>
                       </w:r>
@@ -5306,7 +5499,7 @@
               </wp:anchor>
             </w:drawing>
           </mc:Choice>
-          <mc:Fallback xmlns:w16cei="http://schemas.microsoft.com/office/word/2026/wordml/cei">
+          <mc:Fallback>
             <w:pict>
               <v:shape w14:anchorId="1C192D12" id="_x0000_s1034" type="#_x0000_t202" style="position:absolute;margin-left:306pt;margin-top:430.9pt;width:187.95pt;height:.05pt;z-index:-251641856;visibility:visible;mso-wrap-style:square;mso-wrap-distance-left:9pt;mso-wrap-distance-top:0;mso-wrap-distance-right:9pt;mso-wrap-distance-bottom:0;mso-position-horizontal:absolute;mso-position-horizontal-relative:text;mso-position-vertical:absolute;mso-position-vertical-relative:text;v-text-anchor:top" o:gfxdata="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" filled="f" stroked="f">
                 <v:textbox style="mso-fit-shape-to-text:t" inset="0,0,0,0">
@@ -5490,7 +5683,7 @@
               </wp:anchor>
             </w:drawing>
           </mc:Choice>
-          <mc:Fallback xmlns:w16cei="http://schemas.microsoft.com/office/word/2026/wordml/cei">
+          <mc:Fallback>
             <w:pict>
               <v:shape w14:anchorId="6A93C761" id="_x0000_s1035" type="#_x0000_t202" style="position:absolute;margin-left:6pt;margin-top:431.65pt;width:187.75pt;height:.05pt;z-index:-251642880;visibility:visible;mso-wrap-style:square;mso-wrap-distance-left:9pt;mso-wrap-distance-top:0;mso-wrap-distance-right:9pt;mso-wrap-distance-bottom:0;mso-position-horizontal:absolute;mso-position-horizontal-relative:text;mso-position-vertical:absolute;mso-position-vertical-relative:text;v-text-anchor:top" o:gfxdata="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" filled="f" stroked="f">
                 <v:textbox style="mso-fit-shape-to-text:t" inset="0,0,0,0">
@@ -5696,7 +5889,7 @@
               </wp:anchor>
             </w:drawing>
           </mc:Choice>
-          <mc:Fallback xmlns:w16cei="http://schemas.microsoft.com/office/word/2026/wordml/cei">
+          <mc:Fallback>
             <w:pict>
               <v:shape w14:anchorId="19224FCD" id="_x0000_s1036" type="#_x0000_t202" style="position:absolute;margin-left:306pt;margin-top:430.45pt;width:188.25pt;height:.05pt;z-index:-251637760;visibility:visible;mso-wrap-style:square;mso-wrap-distance-left:9pt;mso-wrap-distance-top:0;mso-wrap-distance-right:9pt;mso-wrap-distance-bottom:0;mso-position-horizontal:absolute;mso-position-horizontal-relative:text;mso-position-vertical:absolute;mso-position-vertical-relative:text;v-text-anchor:top" o:gfxdata="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" filled="f" stroked="f">
                 <v:textbox style="mso-fit-shape-to-text:t" inset="0,0,0,0">
@@ -5887,7 +6080,7 @@
               </wp:anchor>
             </w:drawing>
           </mc:Choice>
-          <mc:Fallback xmlns:w16cei="http://schemas.microsoft.com/office/word/2026/wordml/cei">
+          <mc:Fallback>
             <w:pict>
               <v:shape w14:anchorId="449AECBE" id="_x0000_s1037" type="#_x0000_t202" style="position:absolute;margin-left:6pt;margin-top:430.4pt;width:188.25pt;height:.05pt;z-index:-251638784;visibility:visible;mso-wrap-style:square;mso-wrap-distance-left:9pt;mso-wrap-distance-top:0;mso-wrap-distance-right:9pt;mso-wrap-distance-bottom:0;mso-position-horizontal:absolute;mso-position-horizontal-relative:text;mso-position-vertical:absolute;mso-position-vertical-relative:text;v-text-anchor:top" o:gfxdata="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" filled="f" stroked="f">
                 <v:textbox style="mso-fit-shape-to-text:t" inset="0,0,0,0">
@@ -5904,18 +6097,7 @@
                       <w:r>
                         <w:t>Figure 9</w:t>
                       </w:r>
-                      <w:r>
-                        <w:fldChar w:fldCharType="begin"/>
-                      </w:r>
-                      <w:r>
-                        <w:instrText xml:space="preserve"> SEQ Figure \* ARABIC </w:instrText>
-                      </w:r>
-                      <w:r>
-                        <w:fldChar w:fldCharType="separate"/>
-                      </w:r>
-                      <w:r>
-                        <w:fldChar w:fldCharType="end"/>
-                      </w:r>
+                      <w:fldSimple w:instr=" SEQ Figure \* ARABIC "/>
                       <w:r>
                         <w:t>: Match Detail &amp; Rating Screen</w:t>
                       </w:r>
@@ -6029,7 +6211,7 @@
         <w:pStyle w:val="Heading2"/>
         <w:spacing w:before="240" w:after="110" w:line="276" w:lineRule="auto"/>
       </w:pPr>
-      <w:bookmarkStart w:id="8" w:name="_Toc238458722"/>
+      <w:bookmarkStart w:id="8" w:name="_Toc238474725"/>
       <w:r>
         <w:lastRenderedPageBreak/>
         <w:t>4.3. Navigation wire flow diagrams</w:t>
@@ -6041,7 +6223,15 @@
         <w:spacing w:after="140" w:line="276" w:lineRule="auto"/>
       </w:pPr>
       <w:r>
-        <w:t>Top-level navigation: Login leads to Onboarding on first run only, then to the Home hub, which fans out to three tabs: Listings, Calendar, and Settings.</w:t>
+        <w:t xml:space="preserve">Top-level navigation: Login leads to Onboarding on first run only, then to the </w:t>
+      </w:r>
+      <w:proofErr w:type="gramStart"/>
+      <w:r>
+        <w:t>Home</w:t>
+      </w:r>
+      <w:proofErr w:type="gramEnd"/>
+      <w:r>
+        <w:t xml:space="preserve"> hub, which fans out to three tabs: Listings, Calendar, and Settings.</w:t>
       </w:r>
     </w:p>
     <w:p>
@@ -6228,7 +6418,7 @@
         <w:pStyle w:val="Heading1"/>
         <w:spacing w:before="340" w:after="140" w:line="276" w:lineRule="auto"/>
       </w:pPr>
-      <w:bookmarkStart w:id="9" w:name="_Toc238458723"/>
+      <w:bookmarkStart w:id="9" w:name="_Toc238474726"/>
       <w:r>
         <w:lastRenderedPageBreak/>
         <w:t>5. REST API and Back-End Architecture</w:t>
@@ -6240,7 +6430,7 @@
         <w:pStyle w:val="Heading2"/>
         <w:spacing w:line="276" w:lineRule="auto"/>
       </w:pPr>
-      <w:bookmarkStart w:id="10" w:name="_Toc238458724"/>
+      <w:bookmarkStart w:id="10" w:name="_Toc238474727"/>
       <w:r>
         <w:t>5.1. Structural plan</w:t>
       </w:r>
@@ -6264,7 +6454,7 @@
         <w:pStyle w:val="Heading2"/>
         <w:spacing w:line="276" w:lineRule="auto"/>
       </w:pPr>
-      <w:bookmarkStart w:id="11" w:name="_Toc238458725"/>
+      <w:bookmarkStart w:id="11" w:name="_Toc238474728"/>
       <w:r>
         <w:t>5.2. Development stack and hosting</w:t>
       </w:r>
@@ -6288,7 +6478,7 @@
         <w:pStyle w:val="Heading2"/>
         <w:spacing w:line="276" w:lineRule="auto"/>
       </w:pPr>
-      <w:bookmarkStart w:id="12" w:name="_Toc238458726"/>
+      <w:bookmarkStart w:id="12" w:name="_Toc238474729"/>
       <w:r>
         <w:t>5.3. Endpoint specification</w:t>
       </w:r>
@@ -6306,7 +6496,23 @@
           <w:b/>
           <w:bCs/>
         </w:rPr>
-        <w:t>/api/v1</w:t>
+        <w:t>/</w:t>
+      </w:r>
+      <w:proofErr w:type="spellStart"/>
+      <w:r>
+        <w:rPr>
+          <w:b/>
+          <w:bCs/>
+        </w:rPr>
+        <w:t>api</w:t>
+      </w:r>
+      <w:proofErr w:type="spellEnd"/>
+      <w:r>
+        <w:rPr>
+          <w:b/>
+          <w:bCs/>
+        </w:rPr>
+        <w:t>/v1</w:t>
       </w:r>
       <w:r>
         <w:t xml:space="preserve"> and exchange JSON. Every request (aside from the initial session exchange) requires a valid Firebase ID token in the Authorization header, from which the API derives the calling user's identity. No endpoint accepts another user's ID as a path parameter, to prevent one user querying another's private data.</w:t>
@@ -6322,7 +6528,7 @@
         <w:pStyle w:val="Heading3"/>
         <w:spacing w:line="276" w:lineRule="auto"/>
       </w:pPr>
-      <w:bookmarkStart w:id="13" w:name="_Toc238458727"/>
+      <w:bookmarkStart w:id="13" w:name="_Toc238474730"/>
       <w:r>
         <w:t xml:space="preserve">5.3.1. </w:t>
       </w:r>
@@ -6365,6 +6571,7 @@
       <w:r>
         <w:t xml:space="preserve">Request body: </w:t>
       </w:r>
+      <w:proofErr w:type="spellStart"/>
       <w:r>
         <w:rPr>
           <w:b/>
@@ -6372,9 +6579,11 @@
         </w:rPr>
         <w:t>firebaseIdToken</w:t>
       </w:r>
+      <w:proofErr w:type="spellEnd"/>
       <w:r>
         <w:t xml:space="preserve"> (String, required), </w:t>
       </w:r>
+      <w:proofErr w:type="spellStart"/>
       <w:r>
         <w:rPr>
           <w:b/>
@@ -6382,6 +6591,7 @@
         </w:rPr>
         <w:t>deviceLanguage</w:t>
       </w:r>
+      <w:proofErr w:type="spellEnd"/>
       <w:r>
         <w:t xml:space="preserve"> (String, optional</w:t>
       </w:r>
@@ -6404,6 +6614,7 @@
       <w:r>
         <w:t xml:space="preserve">Response (200 OK): </w:t>
       </w:r>
+      <w:proofErr w:type="spellStart"/>
       <w:r>
         <w:rPr>
           <w:b/>
@@ -6411,9 +6622,11 @@
         </w:rPr>
         <w:t>userId</w:t>
       </w:r>
+      <w:proofErr w:type="spellEnd"/>
       <w:r>
         <w:t xml:space="preserve"> (Guid), </w:t>
       </w:r>
+      <w:proofErr w:type="spellStart"/>
       <w:r>
         <w:rPr>
           <w:b/>
@@ -6421,6 +6634,7 @@
         </w:rPr>
         <w:t>isNewUser</w:t>
       </w:r>
+      <w:proofErr w:type="spellEnd"/>
       <w:r>
         <w:t xml:space="preserve"> (Boolean), </w:t>
       </w:r>
@@ -6434,6 +6648,7 @@
       <w:r>
         <w:t xml:space="preserve"> (String or null), </w:t>
       </w:r>
+      <w:proofErr w:type="spellStart"/>
       <w:r>
         <w:rPr>
           <w:b/>
@@ -6441,9 +6656,11 @@
         </w:rPr>
         <w:t>onboardingComplete</w:t>
       </w:r>
+      <w:proofErr w:type="spellEnd"/>
       <w:r>
         <w:t xml:space="preserve"> (Boolean), profile object containing </w:t>
       </w:r>
+      <w:proofErr w:type="spellStart"/>
       <w:r>
         <w:rPr>
           <w:b/>
@@ -6451,6 +6668,7 @@
         </w:rPr>
         <w:t>displayName</w:t>
       </w:r>
+      <w:proofErr w:type="spellEnd"/>
       <w:r>
         <w:t xml:space="preserve"> (String), </w:t>
       </w:r>
@@ -6464,6 +6682,7 @@
       <w:r>
         <w:t xml:space="preserve"> (String), </w:t>
       </w:r>
+      <w:proofErr w:type="spellStart"/>
       <w:r>
         <w:rPr>
           <w:b/>
@@ -6471,6 +6690,7 @@
         </w:rPr>
         <w:t>searchRadiusKm</w:t>
       </w:r>
+      <w:proofErr w:type="spellEnd"/>
       <w:r>
         <w:t xml:space="preserve"> (Integer).</w:t>
       </w:r>
@@ -6487,7 +6707,7 @@
         <w:pStyle w:val="Heading3"/>
         <w:spacing w:line="276" w:lineRule="auto"/>
       </w:pPr>
-      <w:bookmarkStart w:id="14" w:name="_Toc238458728"/>
+      <w:bookmarkStart w:id="14" w:name="_Toc238474731"/>
       <w:r>
         <w:t xml:space="preserve">5.3.2. </w:t>
       </w:r>
@@ -6530,6 +6750,7 @@
       <w:r>
         <w:t xml:space="preserve">Response (200 OK): </w:t>
       </w:r>
+      <w:proofErr w:type="spellStart"/>
       <w:r>
         <w:rPr>
           <w:b/>
@@ -6537,9 +6758,11 @@
         </w:rPr>
         <w:t>userId</w:t>
       </w:r>
+      <w:proofErr w:type="spellEnd"/>
       <w:r>
         <w:t xml:space="preserve"> (Guid), </w:t>
       </w:r>
+      <w:proofErr w:type="spellStart"/>
       <w:r>
         <w:rPr>
           <w:b/>
@@ -6547,6 +6770,7 @@
         </w:rPr>
         <w:t>displayName</w:t>
       </w:r>
+      <w:proofErr w:type="spellEnd"/>
       <w:r>
         <w:t xml:space="preserve"> (String), </w:t>
       </w:r>
@@ -6570,6 +6794,7 @@
       <w:r>
         <w:t xml:space="preserve"> (String, ISO 639-1), </w:t>
       </w:r>
+      <w:proofErr w:type="spellStart"/>
       <w:r>
         <w:rPr>
           <w:b/>
@@ -6577,9 +6802,11 @@
         </w:rPr>
         <w:t>searchRadiusKm</w:t>
       </w:r>
+      <w:proofErr w:type="spellEnd"/>
       <w:r>
         <w:t xml:space="preserve"> (Integer), </w:t>
       </w:r>
+      <w:proofErr w:type="spellStart"/>
       <w:r>
         <w:rPr>
           <w:b/>
@@ -6587,9 +6814,11 @@
         </w:rPr>
         <w:t>notificationsEnabled</w:t>
       </w:r>
+      <w:proofErr w:type="spellEnd"/>
       <w:r>
         <w:t xml:space="preserve"> (Boolean), </w:t>
       </w:r>
+      <w:proofErr w:type="spellStart"/>
       <w:r>
         <w:rPr>
           <w:b/>
@@ -6597,9 +6826,11 @@
         </w:rPr>
         <w:t>biometricLockEnabled</w:t>
       </w:r>
+      <w:proofErr w:type="spellEnd"/>
       <w:r>
         <w:t xml:space="preserve"> (Boolean), </w:t>
       </w:r>
+      <w:proofErr w:type="spellStart"/>
       <w:r>
         <w:rPr>
           <w:b/>
@@ -6607,8 +6838,17 @@
         </w:rPr>
         <w:t>createdAt</w:t>
       </w:r>
-      <w:r>
-        <w:t xml:space="preserve"> (DateTime).</w:t>
+      <w:proofErr w:type="spellEnd"/>
+      <w:r>
+        <w:t xml:space="preserve"> (</w:t>
+      </w:r>
+      <w:proofErr w:type="spellStart"/>
+      <w:r>
+        <w:t>DateTime</w:t>
+      </w:r>
+      <w:proofErr w:type="spellEnd"/>
+      <w:r>
+        <w:t>).</w:t>
       </w:r>
     </w:p>
     <w:p>
@@ -6666,6 +6906,7 @@
       <w:r>
         <w:t xml:space="preserve"> (String), </w:t>
       </w:r>
+      <w:proofErr w:type="spellStart"/>
       <w:r>
         <w:rPr>
           <w:b/>
@@ -6673,9 +6914,11 @@
         </w:rPr>
         <w:t>searchRadiusKm</w:t>
       </w:r>
+      <w:proofErr w:type="spellEnd"/>
       <w:r>
         <w:t xml:space="preserve"> (Integer, 1–50), </w:t>
       </w:r>
+      <w:proofErr w:type="spellStart"/>
       <w:r>
         <w:rPr>
           <w:b/>
@@ -6683,9 +6926,11 @@
         </w:rPr>
         <w:t>notificationsEnabled</w:t>
       </w:r>
+      <w:proofErr w:type="spellEnd"/>
       <w:r>
         <w:t xml:space="preserve"> (Boolean), </w:t>
       </w:r>
+      <w:proofErr w:type="spellStart"/>
       <w:r>
         <w:rPr>
           <w:b/>
@@ -6693,6 +6938,7 @@
         </w:rPr>
         <w:t>biometricLockEnabled</w:t>
       </w:r>
+      <w:proofErr w:type="spellEnd"/>
       <w:r>
         <w:t xml:space="preserve"> (Boolean) </w:t>
       </w:r>
@@ -6729,7 +6975,7 @@
         <w:pStyle w:val="Heading3"/>
         <w:spacing w:line="276" w:lineRule="auto"/>
       </w:pPr>
-      <w:bookmarkStart w:id="15" w:name="_Toc238458729"/>
+      <w:bookmarkStart w:id="15" w:name="_Toc238474732"/>
       <w:r>
         <w:t xml:space="preserve">5.3.3. </w:t>
       </w:r>
@@ -6788,6 +7034,7 @@
       <w:r>
         <w:t xml:space="preserve"> (Boolean), </w:t>
       </w:r>
+      <w:proofErr w:type="spellStart"/>
       <w:r>
         <w:rPr>
           <w:b/>
@@ -6795,9 +7042,11 @@
         </w:rPr>
         <w:t>cropType</w:t>
       </w:r>
+      <w:proofErr w:type="spellEnd"/>
       <w:r>
         <w:t xml:space="preserve"> (String, optional), </w:t>
       </w:r>
+      <w:proofErr w:type="spellStart"/>
       <w:r>
         <w:rPr>
           <w:b/>
@@ -6805,6 +7054,7 @@
         </w:rPr>
         <w:t>maxDistanceKm</w:t>
       </w:r>
+      <w:proofErr w:type="spellEnd"/>
       <w:r>
         <w:t xml:space="preserve"> (Integer, optional, defaults to the user's profile radius). Example: </w:t>
       </w:r>
@@ -6812,7 +7062,49 @@
         <w:rPr>
           <w:rFonts w:ascii="Consolas" w:hAnsi="Consolas"/>
         </w:rPr>
-        <w:t>GET /listings?mine=true&amp;cropType=Tomatoes&amp;maxDistanceKm=15</w:t>
+        <w:t>GET /</w:t>
+      </w:r>
+      <w:proofErr w:type="spellStart"/>
+      <w:r>
+        <w:rPr>
+          <w:rFonts w:ascii="Consolas" w:hAnsi="Consolas"/>
+        </w:rPr>
+        <w:t>listings?mine</w:t>
+      </w:r>
+      <w:proofErr w:type="spellEnd"/>
+      <w:r>
+        <w:rPr>
+          <w:rFonts w:ascii="Consolas" w:hAnsi="Consolas"/>
+        </w:rPr>
+        <w:t>=</w:t>
+      </w:r>
+      <w:proofErr w:type="spellStart"/>
+      <w:r>
+        <w:rPr>
+          <w:rFonts w:ascii="Consolas" w:hAnsi="Consolas"/>
+        </w:rPr>
+        <w:t>true&amp;cropType</w:t>
+      </w:r>
+      <w:proofErr w:type="spellEnd"/>
+      <w:r>
+        <w:rPr>
+          <w:rFonts w:ascii="Consolas" w:hAnsi="Consolas"/>
+        </w:rPr>
+        <w:t>=</w:t>
+      </w:r>
+      <w:proofErr w:type="spellStart"/>
+      <w:r>
+        <w:rPr>
+          <w:rFonts w:ascii="Consolas" w:hAnsi="Consolas"/>
+        </w:rPr>
+        <w:t>Tomatoes&amp;maxDistanceKm</w:t>
+      </w:r>
+      <w:proofErr w:type="spellEnd"/>
+      <w:r>
+        <w:rPr>
+          <w:rFonts w:ascii="Consolas" w:hAnsi="Consolas"/>
+        </w:rPr>
+        <w:t>=15</w:t>
       </w:r>
       <w:r>
         <w:t xml:space="preserve"> </w:t>
@@ -6830,6 +7122,7 @@
       <w:r>
         <w:t xml:space="preserve">Response (200 OK): array of listing objects, each containing </w:t>
       </w:r>
+      <w:proofErr w:type="spellStart"/>
       <w:r>
         <w:rPr>
           <w:b/>
@@ -6837,9 +7130,11 @@
         </w:rPr>
         <w:t>listingId</w:t>
       </w:r>
+      <w:proofErr w:type="spellEnd"/>
       <w:r>
         <w:t xml:space="preserve"> (Guid), </w:t>
       </w:r>
+      <w:proofErr w:type="spellStart"/>
       <w:r>
         <w:rPr>
           <w:b/>
@@ -6847,6 +7142,7 @@
         </w:rPr>
         <w:t>cropType</w:t>
       </w:r>
+      <w:proofErr w:type="spellEnd"/>
       <w:r>
         <w:t xml:space="preserve"> (String), </w:t>
       </w:r>
@@ -6870,6 +7166,7 @@
       <w:r>
         <w:t xml:space="preserve"> (String), </w:t>
       </w:r>
+      <w:proofErr w:type="spellStart"/>
       <w:r>
         <w:rPr>
           <w:b/>
@@ -6877,6 +7174,7 @@
         </w:rPr>
         <w:t>harvestDate</w:t>
       </w:r>
+      <w:proofErr w:type="spellEnd"/>
       <w:r>
         <w:t xml:space="preserve"> (Date), </w:t>
       </w:r>
@@ -6890,6 +7188,7 @@
       <w:r>
         <w:t xml:space="preserve"> (latitude and longitude as Double), </w:t>
       </w:r>
+      <w:proofErr w:type="spellStart"/>
       <w:r>
         <w:rPr>
           <w:b/>
@@ -6897,6 +7196,7 @@
         </w:rPr>
         <w:t>farmName</w:t>
       </w:r>
+      <w:proofErr w:type="spellEnd"/>
       <w:r>
         <w:t xml:space="preserve"> (String</w:t>
       </w:r>
@@ -6906,6 +7206,7 @@
       <w:r>
         <w:t xml:space="preserve"> the owning farmer's public farm/business label; always returned regardless of match status, unlike personal contact details), </w:t>
       </w:r>
+      <w:proofErr w:type="spellStart"/>
       <w:r>
         <w:rPr>
           <w:b/>
@@ -6913,6 +7214,7 @@
         </w:rPr>
         <w:t>photoUrl</w:t>
       </w:r>
+      <w:proofErr w:type="spellEnd"/>
       <w:r>
         <w:t xml:space="preserve"> (String or null), </w:t>
       </w:r>
@@ -6926,6 +7228,7 @@
       <w:r>
         <w:t xml:space="preserve"> (String: "Active", "Matched", "Expired"), </w:t>
       </w:r>
+      <w:proofErr w:type="spellStart"/>
       <w:r>
         <w:rPr>
           <w:b/>
@@ -6933,8 +7236,17 @@
         </w:rPr>
         <w:t>createdAt</w:t>
       </w:r>
-      <w:r>
-        <w:t xml:space="preserve"> (DateTime)</w:t>
+      <w:proofErr w:type="spellEnd"/>
+      <w:r>
+        <w:t xml:space="preserve"> (</w:t>
+      </w:r>
+      <w:proofErr w:type="spellStart"/>
+      <w:r>
+        <w:t>DateTime</w:t>
+      </w:r>
+      <w:proofErr w:type="spellEnd"/>
+      <w:r>
+        <w:t>)</w:t>
       </w:r>
     </w:p>
     <w:p>
@@ -6971,6 +7283,7 @@
       <w:r>
         <w:t xml:space="preserve">Request body: </w:t>
       </w:r>
+      <w:proofErr w:type="spellStart"/>
       <w:r>
         <w:rPr>
           <w:b/>
@@ -6978,9 +7291,11 @@
         </w:rPr>
         <w:t>clientGeneratedId</w:t>
       </w:r>
+      <w:proofErr w:type="spellEnd"/>
       <w:r>
         <w:t xml:space="preserve"> (Guid, optional), </w:t>
       </w:r>
+      <w:proofErr w:type="spellStart"/>
       <w:r>
         <w:rPr>
           <w:b/>
@@ -6988,6 +7303,7 @@
         </w:rPr>
         <w:t>cropType</w:t>
       </w:r>
+      <w:proofErr w:type="spellEnd"/>
       <w:r>
         <w:t xml:space="preserve"> (String, required), </w:t>
       </w:r>
@@ -7011,6 +7327,7 @@
       <w:r>
         <w:t xml:space="preserve"> (String, required), </w:t>
       </w:r>
+      <w:proofErr w:type="spellStart"/>
       <w:r>
         <w:rPr>
           <w:b/>
@@ -7018,6 +7335,7 @@
         </w:rPr>
         <w:t>harvestDate</w:t>
       </w:r>
+      <w:proofErr w:type="spellEnd"/>
       <w:r>
         <w:t xml:space="preserve"> (Date, required), </w:t>
       </w:r>
@@ -7061,7 +7379,15 @@
         <w:spacing w:line="276" w:lineRule="auto"/>
       </w:pPr>
       <w:r>
-        <w:t>PUT /listings/{listingId}</w:t>
+        <w:t>PUT /listings/{</w:t>
+      </w:r>
+      <w:proofErr w:type="spellStart"/>
+      <w:r>
+        <w:t>listingId</w:t>
+      </w:r>
+      <w:proofErr w:type="spellEnd"/>
+      <w:r>
+        <w:t>}</w:t>
       </w:r>
     </w:p>
     <w:p>
@@ -7076,6 +7402,7 @@
       <w:r>
         <w:t xml:space="preserve">Purpose: Updates an existing listing. Same request body as POST, excluding </w:t>
       </w:r>
+      <w:proofErr w:type="spellStart"/>
       <w:r>
         <w:rPr>
           <w:b/>
@@ -7083,6 +7410,7 @@
         </w:rPr>
         <w:t>clientGeneratedId</w:t>
       </w:r>
+      <w:proofErr w:type="spellEnd"/>
       <w:r>
         <w:t>.</w:t>
       </w:r>
@@ -7093,7 +7421,15 @@
         <w:spacing w:line="276" w:lineRule="auto"/>
       </w:pPr>
       <w:r>
-        <w:t>DELETE /listings/{listingId}</w:t>
+        <w:t>DELETE /listings/{</w:t>
+      </w:r>
+      <w:proofErr w:type="spellStart"/>
+      <w:r>
+        <w:t>listingId</w:t>
+      </w:r>
+      <w:proofErr w:type="spellEnd"/>
+      <w:r>
+        <w:t>}</w:t>
       </w:r>
     </w:p>
     <w:p>
@@ -7106,7 +7442,15 @@
         <w:spacing w:line="276" w:lineRule="auto"/>
       </w:pPr>
       <w:r>
-        <w:t>Purpose: Soft-deletes a listing, setting its status to a terminal state while preserving history for any matches already generated against it.</w:t>
+        <w:t xml:space="preserve">Purpose: </w:t>
+      </w:r>
+      <w:proofErr w:type="gramStart"/>
+      <w:r>
+        <w:t>Soft-deletes</w:t>
+      </w:r>
+      <w:proofErr w:type="gramEnd"/>
+      <w:r>
+        <w:t xml:space="preserve"> a listing, setting its status to a terminal state while preserving history for any matches already generated against it.</w:t>
       </w:r>
     </w:p>
     <w:p>
@@ -7121,7 +7465,7 @@
         <w:pStyle w:val="Heading3"/>
         <w:spacing w:line="276" w:lineRule="auto"/>
       </w:pPr>
-      <w:bookmarkStart w:id="16" w:name="_Toc238458730"/>
+      <w:bookmarkStart w:id="16" w:name="_Toc238474733"/>
       <w:r>
         <w:t xml:space="preserve">5.3.4. </w:t>
       </w:r>
@@ -7180,6 +7524,7 @@
       <w:r>
         <w:t xml:space="preserve"> (Boolean), </w:t>
       </w:r>
+      <w:proofErr w:type="spellStart"/>
       <w:r>
         <w:rPr>
           <w:b/>
@@ -7187,9 +7532,11 @@
         </w:rPr>
         <w:t>cropType</w:t>
       </w:r>
+      <w:proofErr w:type="spellEnd"/>
       <w:r>
         <w:t xml:space="preserve"> (String, optional), </w:t>
       </w:r>
+      <w:proofErr w:type="spellStart"/>
       <w:r>
         <w:rPr>
           <w:b/>
@@ -7197,6 +7544,7 @@
         </w:rPr>
         <w:t>maxDistanceKm</w:t>
       </w:r>
+      <w:proofErr w:type="spellEnd"/>
       <w:r>
         <w:t xml:space="preserve"> (Integer, optional). Example: </w:t>
       </w:r>
@@ -7204,7 +7552,35 @@
         <w:rPr>
           <w:rFonts w:ascii="Consolas" w:hAnsi="Consolas"/>
         </w:rPr>
-        <w:t>GET /demands?mine=false&amp;cropType=Spinach</w:t>
+        <w:t>GET /</w:t>
+      </w:r>
+      <w:proofErr w:type="spellStart"/>
+      <w:r>
+        <w:rPr>
+          <w:rFonts w:ascii="Consolas" w:hAnsi="Consolas"/>
+        </w:rPr>
+        <w:t>demands?mine</w:t>
+      </w:r>
+      <w:proofErr w:type="spellEnd"/>
+      <w:r>
+        <w:rPr>
+          <w:rFonts w:ascii="Consolas" w:hAnsi="Consolas"/>
+        </w:rPr>
+        <w:t>=</w:t>
+      </w:r>
+      <w:proofErr w:type="spellStart"/>
+      <w:r>
+        <w:rPr>
+          <w:rFonts w:ascii="Consolas" w:hAnsi="Consolas"/>
+        </w:rPr>
+        <w:t>false&amp;cropType</w:t>
+      </w:r>
+      <w:proofErr w:type="spellEnd"/>
+      <w:r>
+        <w:rPr>
+          <w:rFonts w:ascii="Consolas" w:hAnsi="Consolas"/>
+        </w:rPr>
+        <w:t>=Spinach</w:t>
       </w:r>
       <w:r>
         <w:t xml:space="preserve"> </w:t>
@@ -7222,6 +7598,7 @@
       <w:r>
         <w:t xml:space="preserve">Response (200 OK): array of demand objects, each containing </w:t>
       </w:r>
+      <w:proofErr w:type="spellStart"/>
       <w:r>
         <w:rPr>
           <w:b/>
@@ -7229,9 +7606,11 @@
         </w:rPr>
         <w:t>demandRequestId</w:t>
       </w:r>
+      <w:proofErr w:type="spellEnd"/>
       <w:r>
         <w:t xml:space="preserve"> (Guid), </w:t>
       </w:r>
+      <w:proofErr w:type="spellStart"/>
       <w:r>
         <w:rPr>
           <w:b/>
@@ -7239,9 +7618,11 @@
         </w:rPr>
         <w:t>cropType</w:t>
       </w:r>
+      <w:proofErr w:type="spellEnd"/>
       <w:r>
         <w:t xml:space="preserve"> (String), </w:t>
       </w:r>
+      <w:proofErr w:type="spellStart"/>
       <w:r>
         <w:rPr>
           <w:b/>
@@ -7249,6 +7630,7 @@
         </w:rPr>
         <w:t>quantityNeeded</w:t>
       </w:r>
+      <w:proofErr w:type="spellEnd"/>
       <w:r>
         <w:t xml:space="preserve"> (Decimal), </w:t>
       </w:r>
@@ -7282,6 +7664,7 @@
       <w:r>
         <w:t xml:space="preserve"> (Double latitude/longitude), </w:t>
       </w:r>
+      <w:proofErr w:type="spellStart"/>
       <w:r>
         <w:rPr>
           <w:b/>
@@ -7289,6 +7672,7 @@
         </w:rPr>
         <w:t>buyerName</w:t>
       </w:r>
+      <w:proofErr w:type="spellEnd"/>
       <w:r>
         <w:t xml:space="preserve"> (String</w:t>
       </w:r>
@@ -7296,7 +7680,15 @@
         <w:t>:</w:t>
       </w:r>
       <w:r>
-        <w:t xml:space="preserve"> public label only, same treatment as listings' farmName), </w:t>
+        <w:t xml:space="preserve"> public label only, same treatment as listings' </w:t>
+      </w:r>
+      <w:proofErr w:type="spellStart"/>
+      <w:r>
+        <w:t>farmName</w:t>
+      </w:r>
+      <w:proofErr w:type="spellEnd"/>
+      <w:r>
+        <w:t xml:space="preserve">), </w:t>
       </w:r>
       <w:r>
         <w:rPr>
@@ -7308,6 +7700,7 @@
       <w:r>
         <w:t xml:space="preserve"> (String: "Open", "Matched", "Expired"), </w:t>
       </w:r>
+      <w:proofErr w:type="spellStart"/>
       <w:r>
         <w:rPr>
           <w:b/>
@@ -7315,8 +7708,17 @@
         </w:rPr>
         <w:t>createdAt</w:t>
       </w:r>
-      <w:r>
-        <w:t xml:space="preserve"> (DateTime).</w:t>
+      <w:proofErr w:type="spellEnd"/>
+      <w:r>
+        <w:t xml:space="preserve"> (</w:t>
+      </w:r>
+      <w:proofErr w:type="spellStart"/>
+      <w:r>
+        <w:t>DateTime</w:t>
+      </w:r>
+      <w:proofErr w:type="spellEnd"/>
+      <w:r>
+        <w:t>).</w:t>
       </w:r>
     </w:p>
     <w:p>
@@ -7354,6 +7756,7 @@
         <w:lastRenderedPageBreak/>
         <w:t xml:space="preserve">Request body: </w:t>
       </w:r>
+      <w:proofErr w:type="spellStart"/>
       <w:r>
         <w:rPr>
           <w:b/>
@@ -7361,9 +7764,11 @@
         </w:rPr>
         <w:t>clientGeneratedId</w:t>
       </w:r>
+      <w:proofErr w:type="spellEnd"/>
       <w:r>
         <w:t xml:space="preserve"> (Guid, optional), </w:t>
       </w:r>
+      <w:proofErr w:type="spellStart"/>
       <w:r>
         <w:rPr>
           <w:b/>
@@ -7371,9 +7776,11 @@
         </w:rPr>
         <w:t>cropType</w:t>
       </w:r>
+      <w:proofErr w:type="spellEnd"/>
       <w:r>
         <w:t xml:space="preserve"> (String, required), </w:t>
       </w:r>
+      <w:proofErr w:type="spellStart"/>
       <w:r>
         <w:rPr>
           <w:b/>
@@ -7381,6 +7788,7 @@
         </w:rPr>
         <w:t>quantityNeeded</w:t>
       </w:r>
+      <w:proofErr w:type="spellEnd"/>
       <w:r>
         <w:t xml:space="preserve"> (Decimal, required), </w:t>
       </w:r>
@@ -7465,7 +7873,7 @@
         <w:pStyle w:val="Heading3"/>
         <w:spacing w:line="276" w:lineRule="auto"/>
       </w:pPr>
-      <w:bookmarkStart w:id="17" w:name="_Toc238458731"/>
+      <w:bookmarkStart w:id="17" w:name="_Toc238474734"/>
       <w:r>
         <w:t xml:space="preserve">5.3.5. </w:t>
       </w:r>
@@ -7493,7 +7901,23 @@
         <w:spacing w:line="276" w:lineRule="auto"/>
       </w:pPr>
       <w:r>
-        <w:t xml:space="preserve">Purpose: Returns the ranked match feed for the authenticated user. A farmer sees demand matches for their listings, a buyer sees listing matches for their demand requests. The user is identified from the authentication token rather than a path parameter, a deliberate refinement over a userId-in-URL approach, since accepting another user's ID in the path would allow one user to view another's private match feed. </w:t>
+        <w:t xml:space="preserve">Purpose: Returns the ranked match feed for the authenticated user. A farmer sees demand matches for their </w:t>
+      </w:r>
+      <w:proofErr w:type="gramStart"/>
+      <w:r>
+        <w:t>listings,</w:t>
+      </w:r>
+      <w:proofErr w:type="gramEnd"/>
+      <w:r>
+        <w:t xml:space="preserve"> a buyer sees listing matches for their demand requests. The user is identified from the authentication token rather than a path parameter, a deliberate refinement over a </w:t>
+      </w:r>
+      <w:proofErr w:type="spellStart"/>
+      <w:r>
+        <w:t>userId</w:t>
+      </w:r>
+      <w:proofErr w:type="spellEnd"/>
+      <w:r>
+        <w:t xml:space="preserve">-in-URL approach, since accepting another user's ID in the path would allow one user to view another's private match feed. </w:t>
       </w:r>
     </w:p>
     <w:p>
@@ -7508,6 +7932,7 @@
       <w:r>
         <w:t xml:space="preserve">Response (200 OK): array of match objects, each containing </w:t>
       </w:r>
+      <w:proofErr w:type="spellStart"/>
       <w:r>
         <w:rPr>
           <w:b/>
@@ -7515,6 +7940,7 @@
         </w:rPr>
         <w:t>matchId</w:t>
       </w:r>
+      <w:proofErr w:type="spellEnd"/>
       <w:r>
         <w:t xml:space="preserve"> (Guid), </w:t>
       </w:r>
@@ -7528,6 +7954,7 @@
       <w:r>
         <w:t xml:space="preserve"> (Decimal, 0.0–1.0), a counterpart object with </w:t>
       </w:r>
+      <w:proofErr w:type="spellStart"/>
       <w:r>
         <w:rPr>
           <w:b/>
@@ -7535,6 +7962,7 @@
         </w:rPr>
         <w:t>cropType</w:t>
       </w:r>
+      <w:proofErr w:type="spellEnd"/>
       <w:r>
         <w:t xml:space="preserve"> (String), </w:t>
       </w:r>
@@ -7558,6 +7986,7 @@
       <w:r>
         <w:t xml:space="preserve"> (String), </w:t>
       </w:r>
+      <w:proofErr w:type="spellStart"/>
       <w:r>
         <w:rPr>
           <w:b/>
@@ -7565,9 +7994,11 @@
         </w:rPr>
         <w:t>distanceKm</w:t>
       </w:r>
+      <w:proofErr w:type="spellEnd"/>
       <w:r>
         <w:t xml:space="preserve"> (Decimal), </w:t>
       </w:r>
+      <w:proofErr w:type="spellStart"/>
       <w:r>
         <w:rPr>
           <w:b/>
@@ -7575,6 +8006,7 @@
         </w:rPr>
         <w:t>relevantDate</w:t>
       </w:r>
+      <w:proofErr w:type="spellEnd"/>
       <w:r>
         <w:t xml:space="preserve"> (Date), and </w:t>
       </w:r>
@@ -7595,7 +8027,15 @@
         <w:spacing w:line="276" w:lineRule="auto"/>
       </w:pPr>
       <w:r>
-        <w:t>GET /matches/{matchId}</w:t>
+        <w:t>GET /matches/{</w:t>
+      </w:r>
+      <w:proofErr w:type="spellStart"/>
+      <w:r>
+        <w:t>matchId</w:t>
+      </w:r>
+      <w:proofErr w:type="spellEnd"/>
+      <w:r>
+        <w:t>}</w:t>
       </w:r>
     </w:p>
     <w:p>
@@ -7623,6 +8063,7 @@
       <w:r>
         <w:t xml:space="preserve">Response (200 OK): </w:t>
       </w:r>
+      <w:proofErr w:type="spellStart"/>
       <w:r>
         <w:rPr>
           <w:b/>
@@ -7630,6 +8071,7 @@
         </w:rPr>
         <w:t>matchId</w:t>
       </w:r>
+      <w:proofErr w:type="spellEnd"/>
       <w:r>
         <w:t xml:space="preserve"> (Guid), </w:t>
       </w:r>
@@ -7653,6 +8095,7 @@
       <w:r>
         <w:t xml:space="preserve"> (String), </w:t>
       </w:r>
+      <w:proofErr w:type="spellStart"/>
       <w:r>
         <w:rPr>
           <w:b/>
@@ -7660,9 +8103,11 @@
         </w:rPr>
         <w:t>counterpartContact</w:t>
       </w:r>
+      <w:proofErr w:type="spellEnd"/>
       <w:r>
         <w:t xml:space="preserve"> object with </w:t>
       </w:r>
+      <w:proofErr w:type="spellStart"/>
       <w:r>
         <w:rPr>
           <w:b/>
@@ -7670,6 +8115,7 @@
         </w:rPr>
         <w:t>displayName</w:t>
       </w:r>
+      <w:proofErr w:type="spellEnd"/>
       <w:r>
         <w:t xml:space="preserve"> and </w:t>
       </w:r>
@@ -7690,7 +8136,15 @@
         <w:spacing w:line="276" w:lineRule="auto"/>
       </w:pPr>
       <w:r>
-        <w:t>POST /matches/{matchId}/confirm</w:t>
+        <w:t>POST /matches/{</w:t>
+      </w:r>
+      <w:proofErr w:type="spellStart"/>
+      <w:r>
+        <w:t>matchId</w:t>
+      </w:r>
+      <w:proofErr w:type="spellEnd"/>
+      <w:r>
+        <w:t>}/confirm</w:t>
       </w:r>
     </w:p>
     <w:p>
@@ -7718,7 +8172,7 @@
         <w:pStyle w:val="Heading3"/>
         <w:spacing w:line="276" w:lineRule="auto"/>
       </w:pPr>
-      <w:bookmarkStart w:id="18" w:name="_Toc238458732"/>
+      <w:bookmarkStart w:id="18" w:name="_Toc238474735"/>
       <w:r>
         <w:t xml:space="preserve">5.3.6. </w:t>
       </w:r>
@@ -7733,7 +8187,15 @@
         <w:spacing w:line="276" w:lineRule="auto"/>
       </w:pPr>
       <w:r>
-        <w:t>POST /matches/{matchId}/ratings</w:t>
+        <w:t>POST /matches/{</w:t>
+      </w:r>
+      <w:proofErr w:type="spellStart"/>
+      <w:r>
+        <w:t>matchId</w:t>
+      </w:r>
+      <w:proofErr w:type="spellEnd"/>
+      <w:r>
+        <w:t>}/ratings</w:t>
       </w:r>
     </w:p>
     <w:p>
@@ -7759,7 +8221,15 @@
         <w:spacing w:line="276" w:lineRule="auto"/>
       </w:pPr>
       <w:r>
-        <w:t>Request body: thumbsUp (Boolean)</w:t>
+        <w:t xml:space="preserve">Request body: </w:t>
+      </w:r>
+      <w:proofErr w:type="spellStart"/>
+      <w:r>
+        <w:t>thumbsUp</w:t>
+      </w:r>
+      <w:proofErr w:type="spellEnd"/>
+      <w:r>
+        <w:t xml:space="preserve"> (Boolean)</w:t>
       </w:r>
     </w:p>
     <w:p>
@@ -7772,7 +8242,55 @@
         <w:spacing w:line="276" w:lineRule="auto"/>
       </w:pPr>
       <w:r>
-        <w:t>Response (201 Created): ratingId (Guid), matchId (Guid), raisedByUserId (Guid), thumbsUp (Boolean), createdAt (DateTime)</w:t>
+        <w:t xml:space="preserve">Response (201 Created): </w:t>
+      </w:r>
+      <w:proofErr w:type="spellStart"/>
+      <w:r>
+        <w:t>ratingId</w:t>
+      </w:r>
+      <w:proofErr w:type="spellEnd"/>
+      <w:r>
+        <w:t xml:space="preserve"> (Guid), </w:t>
+      </w:r>
+      <w:proofErr w:type="spellStart"/>
+      <w:r>
+        <w:t>matchId</w:t>
+      </w:r>
+      <w:proofErr w:type="spellEnd"/>
+      <w:r>
+        <w:t xml:space="preserve"> (Guid), </w:t>
+      </w:r>
+      <w:proofErr w:type="spellStart"/>
+      <w:r>
+        <w:t>raisedByUserId</w:t>
+      </w:r>
+      <w:proofErr w:type="spellEnd"/>
+      <w:r>
+        <w:t xml:space="preserve"> (Guid), </w:t>
+      </w:r>
+      <w:proofErr w:type="spellStart"/>
+      <w:r>
+        <w:t>thumbsUp</w:t>
+      </w:r>
+      <w:proofErr w:type="spellEnd"/>
+      <w:r>
+        <w:t xml:space="preserve"> (Boolean), </w:t>
+      </w:r>
+      <w:proofErr w:type="spellStart"/>
+      <w:r>
+        <w:t>createdAt</w:t>
+      </w:r>
+      <w:proofErr w:type="spellEnd"/>
+      <w:r>
+        <w:t xml:space="preserve"> (</w:t>
+      </w:r>
+      <w:proofErr w:type="spellStart"/>
+      <w:r>
+        <w:t>DateTime</w:t>
+      </w:r>
+      <w:proofErr w:type="spellEnd"/>
+      <w:r>
+        <w:t>)</w:t>
       </w:r>
     </w:p>
     <w:p>
@@ -7801,7 +8319,15 @@
         <w:spacing w:line="276" w:lineRule="auto"/>
       </w:pPr>
       <w:r>
-        <w:t>GET /matches/{matchId}/ratings</w:t>
+        <w:t>GET /matches/{</w:t>
+      </w:r>
+      <w:proofErr w:type="spellStart"/>
+      <w:r>
+        <w:t>matchId</w:t>
+      </w:r>
+      <w:proofErr w:type="spellEnd"/>
+      <w:r>
+        <w:t>}/ratings</w:t>
       </w:r>
     </w:p>
     <w:p>
@@ -7827,7 +8353,31 @@
         <w:spacing w:line="276" w:lineRule="auto"/>
       </w:pPr>
       <w:r>
-        <w:t>Response (200 OK): submitted (Boolean), thumbsUp (Boolean or null), createdAt (DateTime or null) — the last two are null when the caller hasn't rated this match yet.</w:t>
+        <w:t xml:space="preserve">Response (200 OK): submitted (Boolean), </w:t>
+      </w:r>
+      <w:proofErr w:type="spellStart"/>
+      <w:r>
+        <w:t>thumbsUp</w:t>
+      </w:r>
+      <w:proofErr w:type="spellEnd"/>
+      <w:r>
+        <w:t xml:space="preserve"> (Boolean or null), </w:t>
+      </w:r>
+      <w:proofErr w:type="spellStart"/>
+      <w:r>
+        <w:t>createdAt</w:t>
+      </w:r>
+      <w:proofErr w:type="spellEnd"/>
+      <w:r>
+        <w:t xml:space="preserve"> (</w:t>
+      </w:r>
+      <w:proofErr w:type="spellStart"/>
+      <w:r>
+        <w:t>DateTime</w:t>
+      </w:r>
+      <w:proofErr w:type="spellEnd"/>
+      <w:r>
+        <w:t xml:space="preserve"> or null) — the last two are null when the caller hasn't rated this match yet.</w:t>
       </w:r>
     </w:p>
     <w:p>
@@ -7842,7 +8392,7 @@
         <w:pStyle w:val="Heading3"/>
         <w:spacing w:line="276" w:lineRule="auto"/>
       </w:pPr>
-      <w:bookmarkStart w:id="19" w:name="_Toc238458733"/>
+      <w:bookmarkStart w:id="19" w:name="_Toc238474736"/>
       <w:r>
         <w:t xml:space="preserve">5.3.7. </w:t>
       </w:r>
@@ -7929,7 +8479,21 @@
         <w:rPr>
           <w:rFonts w:ascii="Consolas" w:hAnsi="Consolas"/>
         </w:rPr>
-        <w:t>GET /calendar?month=9&amp;year=2026</w:t>
+        <w:t>GET /</w:t>
+      </w:r>
+      <w:proofErr w:type="spellStart"/>
+      <w:r>
+        <w:rPr>
+          <w:rFonts w:ascii="Consolas" w:hAnsi="Consolas"/>
+        </w:rPr>
+        <w:t>calendar?month</w:t>
+      </w:r>
+      <w:proofErr w:type="spellEnd"/>
+      <w:r>
+        <w:rPr>
+          <w:rFonts w:ascii="Consolas" w:hAnsi="Consolas"/>
+        </w:rPr>
+        <w:t>=9&amp;year=2026</w:t>
       </w:r>
       <w:r>
         <w:t xml:space="preserve"> </w:t>
@@ -7957,6 +8521,7 @@
       <w:r>
         <w:t xml:space="preserve"> (Date), </w:t>
       </w:r>
+      <w:proofErr w:type="spellStart"/>
       <w:r>
         <w:rPr>
           <w:b/>
@@ -7964,9 +8529,11 @@
         </w:rPr>
         <w:t>listingCount</w:t>
       </w:r>
+      <w:proofErr w:type="spellEnd"/>
       <w:r>
         <w:t xml:space="preserve"> (Integer), </w:t>
       </w:r>
+      <w:proofErr w:type="spellStart"/>
       <w:r>
         <w:rPr>
           <w:b/>
@@ -7974,6 +8541,7 @@
         </w:rPr>
         <w:t>listingIds</w:t>
       </w:r>
+      <w:proofErr w:type="spellEnd"/>
       <w:r>
         <w:t xml:space="preserve"> (array of Guid).</w:t>
       </w:r>
@@ -7988,7 +8556,7 @@
         <w:pStyle w:val="Heading2"/>
         <w:spacing w:line="276" w:lineRule="auto"/>
       </w:pPr>
-      <w:bookmarkStart w:id="20" w:name="_Toc238458734"/>
+      <w:bookmarkStart w:id="20" w:name="_Toc238474737"/>
       <w:r>
         <w:t>5.4 Matching algorithm summary</w:t>
       </w:r>
@@ -8072,7 +8640,7 @@
         <w:pStyle w:val="Heading1"/>
         <w:spacing w:before="340" w:after="140" w:line="276" w:lineRule="auto"/>
       </w:pPr>
-      <w:bookmarkStart w:id="21" w:name="_Toc238458735"/>
+      <w:bookmarkStart w:id="21" w:name="_Toc238474738"/>
       <w:r>
         <w:lastRenderedPageBreak/>
         <w:t>6. UML System Architecture Diagrams</w:t>
@@ -8088,7 +8656,7 @@
           <w:noProof/>
         </w:rPr>
         <w:drawing>
-          <wp:inline distT="0" distB="0" distL="0" distR="0" wp14:anchorId="626264AA" wp14:editId="13E8BD3B">
+          <wp:inline distT="0" distB="0" distL="0" distR="0" wp14:anchorId="626264AA" wp14:editId="4F655BAD">
             <wp:extent cx="5990326" cy="4105275"/>
             <wp:effectExtent l="76200" t="76200" r="125095" b="123825"/>
             <wp:docPr id="1254646097" name="Picture 1"/>
@@ -8183,7 +8751,7 @@
         </w:rPr>
         <w:lastRenderedPageBreak/>
         <w:drawing>
-          <wp:inline distT="0" distB="0" distL="0" distR="0" wp14:anchorId="7FAE58DD" wp14:editId="4786A806">
+          <wp:inline distT="0" distB="0" distL="0" distR="0" wp14:anchorId="7FAE58DD" wp14:editId="5B43B436">
             <wp:extent cx="5924550" cy="3397800"/>
             <wp:effectExtent l="76200" t="76200" r="133350" b="127000"/>
             <wp:docPr id="1698985220" name="Picture 2"/>
@@ -8278,7 +8846,7 @@
         <w:pStyle w:val="Heading1"/>
         <w:spacing w:before="340" w:after="140" w:line="276" w:lineRule="auto"/>
       </w:pPr>
-      <w:bookmarkStart w:id="22" w:name="_Toc238458736"/>
+      <w:bookmarkStart w:id="22" w:name="_Toc238474739"/>
       <w:r>
         <w:lastRenderedPageBreak/>
         <w:t>7. Data Models and Schema Definitions</w:t>
@@ -8304,7 +8872,7 @@
         <w:pStyle w:val="Heading2"/>
         <w:spacing w:before="240" w:after="110" w:line="276" w:lineRule="auto"/>
       </w:pPr>
-      <w:bookmarkStart w:id="23" w:name="_Toc238458737"/>
+      <w:bookmarkStart w:id="23" w:name="_Toc238474740"/>
       <w:r>
         <w:t>7.1 Users</w:t>
       </w:r>
@@ -8322,7 +8890,29 @@
           <w:sz w:val="20"/>
           <w:szCs w:val="20"/>
         </w:rPr>
-        <w:t>Partition key: userId.</w:t>
+        <w:t xml:space="preserve">Partition key: </w:t>
+      </w:r>
+      <w:proofErr w:type="spellStart"/>
+      <w:r>
+        <w:rPr>
+          <w:i/>
+          <w:iCs/>
+          <w:color w:val="595959"/>
+          <w:sz w:val="20"/>
+          <w:szCs w:val="20"/>
+        </w:rPr>
+        <w:t>userId</w:t>
+      </w:r>
+      <w:proofErr w:type="spellEnd"/>
+      <w:r>
+        <w:rPr>
+          <w:i/>
+          <w:iCs/>
+          <w:color w:val="595959"/>
+          <w:sz w:val="20"/>
+          <w:szCs w:val="20"/>
+        </w:rPr>
+        <w:t>.</w:t>
       </w:r>
     </w:p>
     <w:tbl>
@@ -8412,6 +9002,7 @@
             <w:pPr>
               <w:spacing w:line="276" w:lineRule="auto"/>
             </w:pPr>
+            <w:proofErr w:type="spellStart"/>
             <w:r>
               <w:rPr>
                 <w:b/>
@@ -8419,6 +9010,7 @@
               </w:rPr>
               <w:t>userId</w:t>
             </w:r>
+            <w:proofErr w:type="spellEnd"/>
           </w:p>
         </w:tc>
         <w:tc>
@@ -8457,6 +9049,7 @@
             <w:pPr>
               <w:spacing w:line="276" w:lineRule="auto"/>
             </w:pPr>
+            <w:proofErr w:type="spellStart"/>
             <w:r>
               <w:rPr>
                 <w:b/>
@@ -8464,6 +9057,7 @@
               </w:rPr>
               <w:t>displayName</w:t>
             </w:r>
+            <w:proofErr w:type="spellEnd"/>
           </w:p>
         </w:tc>
         <w:tc>
@@ -8547,6 +9141,7 @@
             <w:pPr>
               <w:spacing w:line="276" w:lineRule="auto"/>
             </w:pPr>
+            <w:proofErr w:type="spellStart"/>
             <w:r>
               <w:rPr>
                 <w:b/>
@@ -8554,6 +9149,7 @@
               </w:rPr>
               <w:t>farmName</w:t>
             </w:r>
+            <w:proofErr w:type="spellEnd"/>
           </w:p>
         </w:tc>
         <w:tc>
@@ -8578,7 +9174,23 @@
               <w:spacing w:line="276" w:lineRule="auto"/>
             </w:pPr>
             <w:r>
-              <w:t>Public label shown on the user's listings or demand requests before a match is confirmed. Editable in Settings; defaults to "{displayName}'s farm" (or "'s requests" for buyers) if never set. Unlike displayName and phone, this field is intentionally not gated behind match confirmation</w:t>
+              <w:t>Public label shown on the user's listings or demand requests before a match is confirmed. Editable in Settings; defaults to "{</w:t>
+            </w:r>
+            <w:proofErr w:type="spellStart"/>
+            <w:r>
+              <w:t>displayName</w:t>
+            </w:r>
+            <w:proofErr w:type="spellEnd"/>
+            <w:r>
+              <w:t xml:space="preserve">}'s farm" (or "'s requests" for buyers) if never set. Unlike </w:t>
+            </w:r>
+            <w:proofErr w:type="spellStart"/>
+            <w:r>
+              <w:t>displayName</w:t>
+            </w:r>
+            <w:proofErr w:type="spellEnd"/>
+            <w:r>
+              <w:t xml:space="preserve"> and phone, this field is intentionally not gated behind match confirmation</w:t>
             </w:r>
             <w:r>
               <w:t>:</w:t>
@@ -8616,7 +9228,31 @@
               <w:spacing w:line="276" w:lineRule="auto"/>
             </w:pPr>
             <w:r>
-              <w:t>String (ISO 639-1, e.g. "en", "zu", "af")</w:t>
+              <w:t>String (ISO 639-1, e.g. "</w:t>
+            </w:r>
+            <w:proofErr w:type="spellStart"/>
+            <w:r>
+              <w:t>en</w:t>
+            </w:r>
+            <w:proofErr w:type="spellEnd"/>
+            <w:r>
+              <w:t>", "</w:t>
+            </w:r>
+            <w:proofErr w:type="spellStart"/>
+            <w:r>
+              <w:t>zu</w:t>
+            </w:r>
+            <w:proofErr w:type="spellEnd"/>
+            <w:r>
+              <w:t>", "</w:t>
+            </w:r>
+            <w:proofErr w:type="spellStart"/>
+            <w:r>
+              <w:t>af</w:t>
+            </w:r>
+            <w:proofErr w:type="spellEnd"/>
+            <w:r>
+              <w:t>")</w:t>
             </w:r>
           </w:p>
         </w:tc>
@@ -8643,6 +9279,7 @@
             <w:pPr>
               <w:spacing w:line="276" w:lineRule="auto"/>
             </w:pPr>
+            <w:proofErr w:type="spellStart"/>
             <w:r>
               <w:rPr>
                 <w:b/>
@@ -8650,6 +9287,7 @@
               </w:rPr>
               <w:t>searchRadiusKm</w:t>
             </w:r>
+            <w:proofErr w:type="spellEnd"/>
           </w:p>
         </w:tc>
         <w:tc>
@@ -8694,6 +9332,7 @@
             <w:pPr>
               <w:spacing w:line="276" w:lineRule="auto"/>
             </w:pPr>
+            <w:proofErr w:type="spellStart"/>
             <w:r>
               <w:rPr>
                 <w:b/>
@@ -8701,6 +9340,7 @@
               </w:rPr>
               <w:t>notificationsEnabled</w:t>
             </w:r>
+            <w:proofErr w:type="spellEnd"/>
           </w:p>
         </w:tc>
         <w:tc>
@@ -8736,6 +9376,7 @@
             <w:pPr>
               <w:spacing w:line="276" w:lineRule="auto"/>
             </w:pPr>
+            <w:proofErr w:type="spellStart"/>
             <w:r>
               <w:rPr>
                 <w:b/>
@@ -8743,6 +9384,7 @@
               </w:rPr>
               <w:t>biometricLockEnabled</w:t>
             </w:r>
+            <w:proofErr w:type="spellEnd"/>
           </w:p>
         </w:tc>
         <w:tc>
@@ -8778,6 +9420,7 @@
             <w:pPr>
               <w:spacing w:line="276" w:lineRule="auto"/>
             </w:pPr>
+            <w:proofErr w:type="spellStart"/>
             <w:r>
               <w:rPr>
                 <w:b/>
@@ -8785,6 +9428,7 @@
               </w:rPr>
               <w:t>createdAt</w:t>
             </w:r>
+            <w:proofErr w:type="spellEnd"/>
           </w:p>
         </w:tc>
         <w:tc>
@@ -8795,9 +9439,11 @@
             <w:pPr>
               <w:spacing w:line="276" w:lineRule="auto"/>
             </w:pPr>
+            <w:proofErr w:type="spellStart"/>
             <w:r>
               <w:t>DateTime</w:t>
             </w:r>
+            <w:proofErr w:type="spellEnd"/>
           </w:p>
         </w:tc>
         <w:tc>
@@ -8825,7 +9471,7 @@
         <w:pStyle w:val="Heading2"/>
         <w:spacing w:before="240" w:after="110" w:line="276" w:lineRule="auto"/>
       </w:pPr>
-      <w:bookmarkStart w:id="24" w:name="_Toc238458738"/>
+      <w:bookmarkStart w:id="24" w:name="_Toc238474741"/>
       <w:r>
         <w:t>7.2 Listings</w:t>
       </w:r>
@@ -8843,7 +9489,29 @@
           <w:sz w:val="20"/>
           <w:szCs w:val="20"/>
         </w:rPr>
-        <w:t>Partition key: farmerId.</w:t>
+        <w:t xml:space="preserve">Partition key: </w:t>
+      </w:r>
+      <w:proofErr w:type="spellStart"/>
+      <w:r>
+        <w:rPr>
+          <w:i/>
+          <w:iCs/>
+          <w:color w:val="595959"/>
+          <w:sz w:val="20"/>
+          <w:szCs w:val="20"/>
+        </w:rPr>
+        <w:t>farmerId</w:t>
+      </w:r>
+      <w:proofErr w:type="spellEnd"/>
+      <w:r>
+        <w:rPr>
+          <w:i/>
+          <w:iCs/>
+          <w:color w:val="595959"/>
+          <w:sz w:val="20"/>
+          <w:szCs w:val="20"/>
+        </w:rPr>
+        <w:t>.</w:t>
       </w:r>
     </w:p>
     <w:tbl>
@@ -8933,6 +9601,7 @@
             <w:pPr>
               <w:spacing w:line="276" w:lineRule="auto"/>
             </w:pPr>
+            <w:proofErr w:type="spellStart"/>
             <w:r>
               <w:rPr>
                 <w:b/>
@@ -8940,6 +9609,7 @@
               </w:rPr>
               <w:t>listingId</w:t>
             </w:r>
+            <w:proofErr w:type="spellEnd"/>
           </w:p>
         </w:tc>
         <w:tc>
@@ -8970,7 +9640,15 @@
               <w:t>:</w:t>
             </w:r>
             <w:r>
-              <w:t xml:space="preserve"> this is the Cosmos document's own id field. For listings created offline, it's set to the client-generated identifier sent with POST /listings. That way, if a sync from RoomDB gets retried, it lands on the same document instead of duplicating it.</w:t>
+              <w:t xml:space="preserve"> this is the Cosmos document's own id field. For listings created offline, it's set to the client-generated identifier sent with POST /listings. That way, if a sync from </w:t>
+            </w:r>
+            <w:proofErr w:type="spellStart"/>
+            <w:r>
+              <w:t>RoomDB</w:t>
+            </w:r>
+            <w:proofErr w:type="spellEnd"/>
+            <w:r>
+              <w:t xml:space="preserve"> gets retried, it lands on the same document instead of duplicating it.</w:t>
             </w:r>
           </w:p>
         </w:tc>
@@ -8984,6 +9662,7 @@
             <w:pPr>
               <w:spacing w:line="276" w:lineRule="auto"/>
             </w:pPr>
+            <w:proofErr w:type="spellStart"/>
             <w:r>
               <w:rPr>
                 <w:b/>
@@ -8992,6 +9671,7 @@
               <w:lastRenderedPageBreak/>
               <w:t>farmerId</w:t>
             </w:r>
+            <w:proofErr w:type="spellEnd"/>
           </w:p>
         </w:tc>
         <w:tc>
@@ -9036,6 +9716,7 @@
             <w:pPr>
               <w:spacing w:line="276" w:lineRule="auto"/>
             </w:pPr>
+            <w:proofErr w:type="spellStart"/>
             <w:r>
               <w:rPr>
                 <w:b/>
@@ -9043,6 +9724,7 @@
               </w:rPr>
               <w:t>cropType</w:t>
             </w:r>
+            <w:proofErr w:type="spellEnd"/>
           </w:p>
         </w:tc>
         <w:tc>
@@ -9171,6 +9853,7 @@
             <w:pPr>
               <w:spacing w:line="276" w:lineRule="auto"/>
             </w:pPr>
+            <w:proofErr w:type="spellStart"/>
             <w:r>
               <w:rPr>
                 <w:b/>
@@ -9178,6 +9861,7 @@
               </w:rPr>
               <w:t>harvestDate</w:t>
             </w:r>
+            <w:proofErr w:type="spellEnd"/>
           </w:p>
         </w:tc>
         <w:tc>
@@ -9267,6 +9951,7 @@
             <w:pPr>
               <w:spacing w:line="276" w:lineRule="auto"/>
             </w:pPr>
+            <w:proofErr w:type="spellStart"/>
             <w:r>
               <w:rPr>
                 <w:b/>
@@ -9274,6 +9959,7 @@
               </w:rPr>
               <w:t>farmName</w:t>
             </w:r>
+            <w:proofErr w:type="spellEnd"/>
           </w:p>
         </w:tc>
         <w:tc>
@@ -9298,7 +9984,23 @@
               <w:spacing w:line="276" w:lineRule="auto"/>
             </w:pPr>
             <w:r>
-              <w:t>Copied from the owning farmer's Users.farmName at write time (the same denormalisation pattern used elsewhere in this document). Returned by GET /listings regardless of match status</w:t>
+              <w:t xml:space="preserve">Copied from the owning farmer's </w:t>
+            </w:r>
+            <w:proofErr w:type="spellStart"/>
+            <w:r>
+              <w:t>Users.farmName</w:t>
+            </w:r>
+            <w:proofErr w:type="spellEnd"/>
+            <w:r>
+              <w:t xml:space="preserve"> at write time (the same </w:t>
+            </w:r>
+            <w:proofErr w:type="spellStart"/>
+            <w:r>
+              <w:t>denormalisation</w:t>
+            </w:r>
+            <w:proofErr w:type="spellEnd"/>
+            <w:r>
+              <w:t xml:space="preserve"> pattern used elsewhere in this document). Returned by GET /listings regardless of match status</w:t>
             </w:r>
             <w:r>
               <w:t>:</w:t>
@@ -9318,6 +10020,7 @@
             <w:pPr>
               <w:spacing w:line="276" w:lineRule="auto"/>
             </w:pPr>
+            <w:proofErr w:type="spellStart"/>
             <w:r>
               <w:rPr>
                 <w:b/>
@@ -9325,6 +10028,7 @@
               </w:rPr>
               <w:t>photoUrl</w:t>
             </w:r>
+            <w:proofErr w:type="spellEnd"/>
           </w:p>
         </w:tc>
         <w:tc>
@@ -9349,7 +10053,15 @@
               <w:spacing w:line="276" w:lineRule="auto"/>
             </w:pPr>
             <w:r>
-              <w:t>Optional on creation (photoBase64 is submitted; the API returns a photoUrl once it's stored).</w:t>
+              <w:t xml:space="preserve">Optional on creation (photoBase64 is submitted; the API returns a </w:t>
+            </w:r>
+            <w:proofErr w:type="spellStart"/>
+            <w:r>
+              <w:t>photoUrl</w:t>
+            </w:r>
+            <w:proofErr w:type="spellEnd"/>
+            <w:r>
+              <w:t xml:space="preserve"> once it's stored).</w:t>
             </w:r>
           </w:p>
         </w:tc>
@@ -9394,7 +10106,15 @@
               <w:spacing w:line="276" w:lineRule="auto"/>
             </w:pPr>
             <w:r>
-              <w:t>A DELETE call doesn't actually remove the document</w:t>
+              <w:t xml:space="preserve">A DELETE call doesn't </w:t>
+            </w:r>
+            <w:proofErr w:type="gramStart"/>
+            <w:r>
+              <w:t>actually remove</w:t>
+            </w:r>
+            <w:proofErr w:type="gramEnd"/>
+            <w:r>
+              <w:t xml:space="preserve"> the document</w:t>
             </w:r>
             <w:r>
               <w:t>:</w:t>
@@ -9414,6 +10134,7 @@
             <w:pPr>
               <w:spacing w:line="276" w:lineRule="auto"/>
             </w:pPr>
+            <w:proofErr w:type="spellStart"/>
             <w:r>
               <w:rPr>
                 <w:b/>
@@ -9421,6 +10142,7 @@
               </w:rPr>
               <w:t>createdAt</w:t>
             </w:r>
+            <w:proofErr w:type="spellEnd"/>
           </w:p>
         </w:tc>
         <w:tc>
@@ -9431,9 +10153,11 @@
             <w:pPr>
               <w:spacing w:line="276" w:lineRule="auto"/>
             </w:pPr>
+            <w:proofErr w:type="spellStart"/>
             <w:r>
               <w:t>DateTime</w:t>
             </w:r>
+            <w:proofErr w:type="spellEnd"/>
           </w:p>
         </w:tc>
         <w:tc>
@@ -9458,7 +10182,7 @@
         <w:pStyle w:val="Heading2"/>
         <w:spacing w:before="240" w:after="110" w:line="276" w:lineRule="auto"/>
       </w:pPr>
-      <w:bookmarkStart w:id="25" w:name="_Toc238458739"/>
+      <w:bookmarkStart w:id="25" w:name="_Toc238474742"/>
       <w:r>
         <w:t>7.3 Demands</w:t>
       </w:r>
@@ -9476,7 +10200,29 @@
           <w:sz w:val="20"/>
           <w:szCs w:val="20"/>
         </w:rPr>
-        <w:t>Partition key: buyerId.</w:t>
+        <w:t xml:space="preserve">Partition key: </w:t>
+      </w:r>
+      <w:proofErr w:type="spellStart"/>
+      <w:r>
+        <w:rPr>
+          <w:i/>
+          <w:iCs/>
+          <w:color w:val="595959"/>
+          <w:sz w:val="20"/>
+          <w:szCs w:val="20"/>
+        </w:rPr>
+        <w:t>buyerId</w:t>
+      </w:r>
+      <w:proofErr w:type="spellEnd"/>
+      <w:r>
+        <w:rPr>
+          <w:i/>
+          <w:iCs/>
+          <w:color w:val="595959"/>
+          <w:sz w:val="20"/>
+          <w:szCs w:val="20"/>
+        </w:rPr>
+        <w:t>.</w:t>
       </w:r>
     </w:p>
     <w:tbl>
@@ -9566,6 +10312,7 @@
             <w:pPr>
               <w:spacing w:line="276" w:lineRule="auto"/>
             </w:pPr>
+            <w:proofErr w:type="spellStart"/>
             <w:r>
               <w:rPr>
                 <w:b/>
@@ -9573,6 +10320,7 @@
               </w:rPr>
               <w:t>demandRequestId</w:t>
             </w:r>
+            <w:proofErr w:type="spellEnd"/>
           </w:p>
         </w:tc>
         <w:tc>
@@ -9597,8 +10345,13 @@
               <w:spacing w:line="276" w:lineRule="auto"/>
             </w:pPr>
             <w:r>
-              <w:t>Primary key, same as listingId</w:t>
-            </w:r>
+              <w:t xml:space="preserve">Primary key, same as </w:t>
+            </w:r>
+            <w:proofErr w:type="spellStart"/>
+            <w:r>
+              <w:t>listingId</w:t>
+            </w:r>
+            <w:proofErr w:type="spellEnd"/>
             <w:r>
               <w:t>:</w:t>
             </w:r>
@@ -9617,6 +10370,7 @@
             <w:pPr>
               <w:spacing w:line="276" w:lineRule="auto"/>
             </w:pPr>
+            <w:proofErr w:type="spellStart"/>
             <w:r>
               <w:rPr>
                 <w:b/>
@@ -9624,6 +10378,7 @@
               </w:rPr>
               <w:t>buyerId</w:t>
             </w:r>
+            <w:proofErr w:type="spellEnd"/>
           </w:p>
         </w:tc>
         <w:tc>
@@ -9662,6 +10417,7 @@
             <w:pPr>
               <w:spacing w:line="276" w:lineRule="auto"/>
             </w:pPr>
+            <w:proofErr w:type="spellStart"/>
             <w:r>
               <w:rPr>
                 <w:b/>
@@ -9669,6 +10425,7 @@
               </w:rPr>
               <w:t>cropType</w:t>
             </w:r>
+            <w:proofErr w:type="spellEnd"/>
           </w:p>
         </w:tc>
         <w:tc>
@@ -9707,6 +10464,7 @@
             <w:pPr>
               <w:spacing w:line="276" w:lineRule="auto"/>
             </w:pPr>
+            <w:proofErr w:type="spellStart"/>
             <w:r>
               <w:rPr>
                 <w:b/>
@@ -9714,6 +10472,7 @@
               </w:rPr>
               <w:t>quantityNeeded</w:t>
             </w:r>
+            <w:proofErr w:type="spellEnd"/>
           </w:p>
         </w:tc>
         <w:tc>
@@ -9783,7 +10542,15 @@
               <w:spacing w:line="276" w:lineRule="auto"/>
             </w:pPr>
             <w:r>
-              <w:t>Required. Kept as its own field rather than folded into quantityNeeded.</w:t>
+              <w:t xml:space="preserve">Required. Kept as its own field rather than folded into </w:t>
+            </w:r>
+            <w:proofErr w:type="spellStart"/>
+            <w:r>
+              <w:t>quantityNeeded</w:t>
+            </w:r>
+            <w:proofErr w:type="spellEnd"/>
+            <w:r>
+              <w:t>.</w:t>
             </w:r>
           </w:p>
         </w:tc>
@@ -9887,6 +10654,7 @@
             <w:pPr>
               <w:spacing w:line="276" w:lineRule="auto"/>
             </w:pPr>
+            <w:proofErr w:type="spellStart"/>
             <w:r>
               <w:rPr>
                 <w:b/>
@@ -9894,6 +10662,7 @@
               </w:rPr>
               <w:t>buyerName</w:t>
             </w:r>
+            <w:proofErr w:type="spellEnd"/>
           </w:p>
         </w:tc>
         <w:tc>
@@ -9918,7 +10687,23 @@
               <w:spacing w:line="276" w:lineRule="auto"/>
             </w:pPr>
             <w:r>
-              <w:t>Copied from the buyer's Users.farmName at write time, same pattern as Listings.farmName in 7.2.</w:t>
+              <w:t xml:space="preserve">Copied from the buyer's </w:t>
+            </w:r>
+            <w:proofErr w:type="spellStart"/>
+            <w:r>
+              <w:t>Users.farmName</w:t>
+            </w:r>
+            <w:proofErr w:type="spellEnd"/>
+            <w:r>
+              <w:t xml:space="preserve"> at write time, same pattern as </w:t>
+            </w:r>
+            <w:proofErr w:type="spellStart"/>
+            <w:r>
+              <w:t>Listings.farmName</w:t>
+            </w:r>
+            <w:proofErr w:type="spellEnd"/>
+            <w:r>
+              <w:t xml:space="preserve"> in 7.2.</w:t>
             </w:r>
           </w:p>
         </w:tc>
@@ -9974,6 +10759,7 @@
             <w:pPr>
               <w:spacing w:line="276" w:lineRule="auto"/>
             </w:pPr>
+            <w:proofErr w:type="spellStart"/>
             <w:r>
               <w:rPr>
                 <w:b/>
@@ -9981,6 +10767,7 @@
               </w:rPr>
               <w:t>createdAt</w:t>
             </w:r>
+            <w:proofErr w:type="spellEnd"/>
           </w:p>
         </w:tc>
         <w:tc>
@@ -9991,9 +10778,11 @@
             <w:pPr>
               <w:spacing w:line="276" w:lineRule="auto"/>
             </w:pPr>
+            <w:proofErr w:type="spellStart"/>
             <w:r>
               <w:t>DateTime</w:t>
             </w:r>
+            <w:proofErr w:type="spellEnd"/>
           </w:p>
         </w:tc>
         <w:tc>
@@ -10018,7 +10807,7 @@
         <w:pStyle w:val="Heading2"/>
         <w:spacing w:before="240" w:after="110" w:line="276" w:lineRule="auto"/>
       </w:pPr>
-      <w:bookmarkStart w:id="26" w:name="_Toc238458740"/>
+      <w:bookmarkStart w:id="26" w:name="_Toc238474743"/>
       <w:r>
         <w:lastRenderedPageBreak/>
         <w:t>7.4 Matches</w:t>
@@ -10037,7 +10826,29 @@
           <w:sz w:val="20"/>
           <w:szCs w:val="20"/>
         </w:rPr>
-        <w:t>Partition key: userId of whichever party is querying.</w:t>
+        <w:t xml:space="preserve">Partition key: </w:t>
+      </w:r>
+      <w:proofErr w:type="spellStart"/>
+      <w:r>
+        <w:rPr>
+          <w:i/>
+          <w:iCs/>
+          <w:color w:val="595959"/>
+          <w:sz w:val="20"/>
+          <w:szCs w:val="20"/>
+        </w:rPr>
+        <w:t>userId</w:t>
+      </w:r>
+      <w:proofErr w:type="spellEnd"/>
+      <w:r>
+        <w:rPr>
+          <w:i/>
+          <w:iCs/>
+          <w:color w:val="595959"/>
+          <w:sz w:val="20"/>
+          <w:szCs w:val="20"/>
+        </w:rPr>
+        <w:t xml:space="preserve"> of whichever party is querying.</w:t>
       </w:r>
     </w:p>
     <w:tbl>
@@ -10127,6 +10938,7 @@
             <w:pPr>
               <w:spacing w:line="276" w:lineRule="auto"/>
             </w:pPr>
+            <w:proofErr w:type="spellStart"/>
             <w:r>
               <w:rPr>
                 <w:b/>
@@ -10134,6 +10946,7 @@
               </w:rPr>
               <w:t>matchId</w:t>
             </w:r>
+            <w:proofErr w:type="spellEnd"/>
           </w:p>
         </w:tc>
         <w:tc>
@@ -10172,6 +10985,7 @@
             <w:pPr>
               <w:spacing w:line="276" w:lineRule="auto"/>
             </w:pPr>
+            <w:proofErr w:type="spellStart"/>
             <w:r>
               <w:rPr>
                 <w:b/>
@@ -10179,6 +10993,7 @@
               </w:rPr>
               <w:t>listingId</w:t>
             </w:r>
+            <w:proofErr w:type="spellEnd"/>
           </w:p>
         </w:tc>
         <w:tc>
@@ -10217,6 +11032,7 @@
             <w:pPr>
               <w:spacing w:line="276" w:lineRule="auto"/>
             </w:pPr>
+            <w:proofErr w:type="spellStart"/>
             <w:r>
               <w:rPr>
                 <w:b/>
@@ -10224,6 +11040,7 @@
               </w:rPr>
               <w:t>demandRequestId</w:t>
             </w:r>
+            <w:proofErr w:type="spellEnd"/>
           </w:p>
         </w:tc>
         <w:tc>
@@ -10344,7 +11161,15 @@
               <w:spacing w:line="276" w:lineRule="auto"/>
             </w:pPr>
             <w:r>
-              <w:t>POST /matches/{matchId}/confirm moves a match from Suggested to Confirmed.</w:t>
+              <w:t>POST /matches/{</w:t>
+            </w:r>
+            <w:proofErr w:type="spellStart"/>
+            <w:r>
+              <w:t>matchId</w:t>
+            </w:r>
+            <w:proofErr w:type="spellEnd"/>
+            <w:r>
+              <w:t>}/confirm moves a match from Suggested to Confirmed.</w:t>
             </w:r>
           </w:p>
         </w:tc>
@@ -10358,6 +11183,7 @@
             <w:pPr>
               <w:spacing w:line="276" w:lineRule="auto"/>
             </w:pPr>
+            <w:proofErr w:type="spellStart"/>
             <w:r>
               <w:rPr>
                 <w:b/>
@@ -10365,6 +11191,7 @@
               </w:rPr>
               <w:t>counterpartSnapshot</w:t>
             </w:r>
+            <w:proofErr w:type="spellEnd"/>
           </w:p>
         </w:tc>
         <w:tc>
@@ -10376,7 +11203,31 @@
               <w:spacing w:line="276" w:lineRule="auto"/>
             </w:pPr>
             <w:r>
-              <w:t>Object: cropType (String), quantity (Decimal), unit (String), distanceKm (Decimal), relevantDate (Date)</w:t>
+              <w:t xml:space="preserve">Object: </w:t>
+            </w:r>
+            <w:proofErr w:type="spellStart"/>
+            <w:r>
+              <w:t>cropType</w:t>
+            </w:r>
+            <w:proofErr w:type="spellEnd"/>
+            <w:r>
+              <w:t xml:space="preserve"> (String), quantity (Decimal), unit (String), </w:t>
+            </w:r>
+            <w:proofErr w:type="spellStart"/>
+            <w:r>
+              <w:t>distanceKm</w:t>
+            </w:r>
+            <w:proofErr w:type="spellEnd"/>
+            <w:r>
+              <w:t xml:space="preserve"> (Decimal), </w:t>
+            </w:r>
+            <w:proofErr w:type="spellStart"/>
+            <w:r>
+              <w:t>relevantDate</w:t>
+            </w:r>
+            <w:proofErr w:type="spellEnd"/>
+            <w:r>
+              <w:t xml:space="preserve"> (Date)</w:t>
             </w:r>
           </w:p>
         </w:tc>
@@ -10403,6 +11254,7 @@
             <w:pPr>
               <w:spacing w:line="276" w:lineRule="auto"/>
             </w:pPr>
+            <w:proofErr w:type="spellStart"/>
             <w:r>
               <w:rPr>
                 <w:b/>
@@ -10410,6 +11262,7 @@
               </w:rPr>
               <w:t>confirmedAt</w:t>
             </w:r>
+            <w:proofErr w:type="spellEnd"/>
           </w:p>
         </w:tc>
         <w:tc>
@@ -10420,8 +11273,13 @@
             <w:pPr>
               <w:spacing w:line="276" w:lineRule="auto"/>
             </w:pPr>
-            <w:r>
-              <w:t>DateTime (nullable)</w:t>
+            <w:proofErr w:type="spellStart"/>
+            <w:r>
+              <w:t>DateTime</w:t>
+            </w:r>
+            <w:proofErr w:type="spellEnd"/>
+            <w:r>
+              <w:t xml:space="preserve"> (nullable)</w:t>
             </w:r>
           </w:p>
         </w:tc>
@@ -10448,6 +11306,7 @@
             <w:pPr>
               <w:spacing w:line="276" w:lineRule="auto"/>
             </w:pPr>
+            <w:proofErr w:type="spellStart"/>
             <w:r>
               <w:rPr>
                 <w:b/>
@@ -10455,6 +11314,7 @@
               </w:rPr>
               <w:t>createdAt</w:t>
             </w:r>
+            <w:proofErr w:type="spellEnd"/>
           </w:p>
         </w:tc>
         <w:tc>
@@ -10465,9 +11325,11 @@
             <w:pPr>
               <w:spacing w:line="276" w:lineRule="auto"/>
             </w:pPr>
+            <w:proofErr w:type="spellStart"/>
             <w:r>
               <w:t>DateTime</w:t>
             </w:r>
+            <w:proofErr w:type="spellEnd"/>
           </w:p>
         </w:tc>
         <w:tc>
@@ -10499,7 +11361,39 @@
         <w:t xml:space="preserve">) </w:t>
       </w:r>
       <w:r>
-        <w:t>aren't stored on the Match at all. Once a match is Confirmed, the API pulls the counterpart's farmerId or buyerId from the linked Listing or Demand, then does a point-read against Users (partitioned on userId, so it's a single fast lookup, not a scan across partitions). That's how GET /matches/{matchId} can hand back contact info without keeping a second copy of it sitting in the Matches container.</w:t>
+        <w:t xml:space="preserve">aren't stored on the Match at all. Once a match is Confirmed, the API pulls the counterpart's </w:t>
+      </w:r>
+      <w:proofErr w:type="spellStart"/>
+      <w:r>
+        <w:t>farmerId</w:t>
+      </w:r>
+      <w:proofErr w:type="spellEnd"/>
+      <w:r>
+        <w:t xml:space="preserve"> or </w:t>
+      </w:r>
+      <w:proofErr w:type="spellStart"/>
+      <w:r>
+        <w:t>buyerId</w:t>
+      </w:r>
+      <w:proofErr w:type="spellEnd"/>
+      <w:r>
+        <w:t xml:space="preserve"> from the linked Listing or Demand, then does a point-read against Users (partitioned on </w:t>
+      </w:r>
+      <w:proofErr w:type="spellStart"/>
+      <w:r>
+        <w:t>userId</w:t>
+      </w:r>
+      <w:proofErr w:type="spellEnd"/>
+      <w:r>
+        <w:t>, so it's a single fast lookup, not a scan across partitions). That's how GET /matches/{</w:t>
+      </w:r>
+      <w:proofErr w:type="spellStart"/>
+      <w:r>
+        <w:t>matchId</w:t>
+      </w:r>
+      <w:proofErr w:type="spellEnd"/>
+      <w:r>
+        <w:t>} can hand back contact info without keeping a second copy of it sitting in the Matches container.</w:t>
       </w:r>
     </w:p>
     <w:p>
@@ -10512,7 +11406,7 @@
         <w:pStyle w:val="Heading2"/>
         <w:spacing w:before="240" w:after="110" w:line="276" w:lineRule="auto"/>
       </w:pPr>
-      <w:bookmarkStart w:id="27" w:name="_Toc238458741"/>
+      <w:bookmarkStart w:id="27" w:name="_Toc238474744"/>
       <w:r>
         <w:t>7.5 Ratings</w:t>
       </w:r>
@@ -10530,7 +11424,29 @@
           <w:sz w:val="20"/>
           <w:szCs w:val="20"/>
         </w:rPr>
-        <w:t>Partition key: matchId.</w:t>
+        <w:t xml:space="preserve">Partition key: </w:t>
+      </w:r>
+      <w:proofErr w:type="spellStart"/>
+      <w:r>
+        <w:rPr>
+          <w:i/>
+          <w:iCs/>
+          <w:color w:val="595959"/>
+          <w:sz w:val="20"/>
+          <w:szCs w:val="20"/>
+        </w:rPr>
+        <w:t>matchId</w:t>
+      </w:r>
+      <w:proofErr w:type="spellEnd"/>
+      <w:r>
+        <w:rPr>
+          <w:i/>
+          <w:iCs/>
+          <w:color w:val="595959"/>
+          <w:sz w:val="20"/>
+          <w:szCs w:val="20"/>
+        </w:rPr>
+        <w:t>.</w:t>
       </w:r>
     </w:p>
     <w:tbl>
@@ -10620,6 +11536,7 @@
             <w:pPr>
               <w:spacing w:line="276" w:lineRule="auto"/>
             </w:pPr>
+            <w:proofErr w:type="spellStart"/>
             <w:r>
               <w:rPr>
                 <w:b/>
@@ -10627,6 +11544,7 @@
               </w:rPr>
               <w:t>ratingId</w:t>
             </w:r>
+            <w:proofErr w:type="spellEnd"/>
           </w:p>
         </w:tc>
         <w:tc>
@@ -10665,6 +11583,7 @@
             <w:pPr>
               <w:spacing w:line="276" w:lineRule="auto"/>
             </w:pPr>
+            <w:proofErr w:type="spellStart"/>
             <w:r>
               <w:rPr>
                 <w:b/>
@@ -10672,6 +11591,7 @@
               </w:rPr>
               <w:t>matchId</w:t>
             </w:r>
+            <w:proofErr w:type="spellEnd"/>
           </w:p>
         </w:tc>
         <w:tc>
@@ -10710,6 +11630,7 @@
             <w:pPr>
               <w:spacing w:line="276" w:lineRule="auto"/>
             </w:pPr>
+            <w:proofErr w:type="spellStart"/>
             <w:r>
               <w:rPr>
                 <w:b/>
@@ -10717,6 +11638,7 @@
               </w:rPr>
               <w:t>raisedByUserId</w:t>
             </w:r>
+            <w:proofErr w:type="spellEnd"/>
           </w:p>
         </w:tc>
         <w:tc>
@@ -10755,6 +11677,7 @@
             <w:pPr>
               <w:spacing w:line="276" w:lineRule="auto"/>
             </w:pPr>
+            <w:proofErr w:type="spellStart"/>
             <w:r>
               <w:rPr>
                 <w:b/>
@@ -10762,6 +11685,7 @@
               </w:rPr>
               <w:t>thumbsUp</w:t>
             </w:r>
+            <w:proofErr w:type="spellEnd"/>
           </w:p>
         </w:tc>
         <w:tc>
@@ -10797,6 +11721,7 @@
             <w:pPr>
               <w:spacing w:line="276" w:lineRule="auto"/>
             </w:pPr>
+            <w:proofErr w:type="spellStart"/>
             <w:r>
               <w:rPr>
                 <w:b/>
@@ -10804,6 +11729,7 @@
               </w:rPr>
               <w:t>createdAt</w:t>
             </w:r>
+            <w:proofErr w:type="spellEnd"/>
           </w:p>
         </w:tc>
         <w:tc>
@@ -10814,9 +11740,11 @@
             <w:pPr>
               <w:spacing w:line="276" w:lineRule="auto"/>
             </w:pPr>
+            <w:proofErr w:type="spellStart"/>
             <w:r>
               <w:t>DateTime</w:t>
             </w:r>
+            <w:proofErr w:type="spellEnd"/>
           </w:p>
         </w:tc>
         <w:tc>
@@ -10836,7 +11764,31 @@
         <w:spacing w:line="276" w:lineRule="auto"/>
       </w:pPr>
       <w:r>
-        <w:t xml:space="preserve">POST /matches/{matchId}/ratings won't accept anything until the match's status is Completed, and each user only gets one shot at it — both violations return a 403. Both the farmer and the buyer can rate each other, so a single completed match might end up with two Ratings documents (one per raisedByUserId) but never two from the same person. GET /matches/{matchId}/ratings returns only the caller's own rating for the match (or null if </w:t>
+        <w:t>POST /matches/{</w:t>
+      </w:r>
+      <w:proofErr w:type="spellStart"/>
+      <w:r>
+        <w:t>matchId</w:t>
+      </w:r>
+      <w:proofErr w:type="spellEnd"/>
+      <w:r>
+        <w:t xml:space="preserve">}/ratings won't accept anything until the match's status is Completed, and each user only gets one shot at it — both violations return a 403. Both the farmer and the buyer can rate each other, so a single completed match might end up with two Ratings documents (one per </w:t>
+      </w:r>
+      <w:proofErr w:type="spellStart"/>
+      <w:r>
+        <w:t>raisedByUserId</w:t>
+      </w:r>
+      <w:proofErr w:type="spellEnd"/>
+      <w:r>
+        <w:t>) but never two from the same person. GET /matches/{</w:t>
+      </w:r>
+      <w:proofErr w:type="spellStart"/>
+      <w:r>
+        <w:t>matchId</w:t>
+      </w:r>
+      <w:proofErr w:type="spellEnd"/>
+      <w:r>
+        <w:t xml:space="preserve">}/ratings returns only the caller's own rating for the match (or null if </w:t>
       </w:r>
       <w:r>
         <w:lastRenderedPageBreak/>
@@ -10853,7 +11805,7 @@
         <w:pStyle w:val="Heading2"/>
         <w:spacing w:before="240" w:after="110" w:line="276" w:lineRule="auto"/>
       </w:pPr>
-      <w:bookmarkStart w:id="28" w:name="_Toc238458742"/>
+      <w:bookmarkStart w:id="28" w:name="_Toc238474745"/>
       <w:r>
         <w:t>7.6 Harvest calendar — not a persisted entity</w:t>
       </w:r>
@@ -10864,7 +11816,31 @@
         <w:spacing w:line="276" w:lineRule="auto"/>
       </w:pPr>
       <w:r>
-        <w:t>There's no separate container for the harvest calendar. GET /calendar just groups existing Listings by harvestDate on the fly and returns date (Date), listingCount (Integer), and listingIds (array of Guid). Since it's built straight from data already captured in 7.2, there's no second write path to keep in sync</w:t>
+        <w:t xml:space="preserve">There's no separate container for the harvest calendar. GET /calendar just groups existing Listings by </w:t>
+      </w:r>
+      <w:proofErr w:type="spellStart"/>
+      <w:r>
+        <w:t>harvestDate</w:t>
+      </w:r>
+      <w:proofErr w:type="spellEnd"/>
+      <w:r>
+        <w:t xml:space="preserve"> on the fly and returns date (Date), </w:t>
+      </w:r>
+      <w:proofErr w:type="spellStart"/>
+      <w:r>
+        <w:t>listingCount</w:t>
+      </w:r>
+      <w:proofErr w:type="spellEnd"/>
+      <w:r>
+        <w:t xml:space="preserve"> (Integer), and </w:t>
+      </w:r>
+      <w:proofErr w:type="spellStart"/>
+      <w:r>
+        <w:t>listingIds</w:t>
+      </w:r>
+      <w:proofErr w:type="spellEnd"/>
+      <w:r>
+        <w:t xml:space="preserve"> (array of Guid). Since it's built straight from data already captured in 7.2, there's no second write path to keep in sync</w:t>
       </w:r>
       <w:r>
         <w:t>:</w:t>
@@ -10930,7 +11906,7 @@
         <w:pStyle w:val="Heading1"/>
         <w:spacing w:before="340" w:after="140" w:line="276" w:lineRule="auto"/>
       </w:pPr>
-      <w:bookmarkStart w:id="29" w:name="_Toc238458743"/>
+      <w:bookmarkStart w:id="29" w:name="_Toc238474746"/>
       <w:r>
         <w:lastRenderedPageBreak/>
         <w:t>8. Project Management Plan (Gantt Chart)</w:t>
@@ -11013,37 +11989,7 @@
           <w:sz w:val="18"/>
           <w:szCs w:val="18"/>
         </w:rPr>
-        <w:t>Figure 1</w:t>
-      </w:r>
-      <w:r>
-        <w:rPr>
-          <w:i/>
-          <w:iCs/>
-          <w:color w:val="666666"/>
-          <w:sz w:val="18"/>
-          <w:szCs w:val="18"/>
-        </w:rPr>
-        <w:t>5</w:t>
-      </w:r>
-      <w:r>
-        <w:rPr>
-          <w:i/>
-          <w:iCs/>
-          <w:color w:val="666666"/>
-          <w:sz w:val="18"/>
-          <w:szCs w:val="18"/>
-        </w:rPr>
-        <w:t xml:space="preserve">:  </w:t>
-      </w:r>
-      <w:r>
-        <w:rPr>
-          <w:i/>
-          <w:iCs/>
-          <w:color w:val="666666"/>
-          <w:sz w:val="18"/>
-          <w:szCs w:val="18"/>
-        </w:rPr>
-        <w:t>FromTheFarm Project Management Plan</w:t>
+        <w:t>Figure 15:  FromTheFarm Project Management Plan</w:t>
       </w:r>
     </w:p>
     <w:p>
@@ -11062,7 +12008,27 @@
           <w:iCs w:val="0"/>
           <w:color w:val="000000" w:themeColor="text1"/>
         </w:rPr>
-        <w:t>Above is an overview of the deliverables and development plan for FromTheFarm, colour coded bars align with individual activities, spread out across the team’s allotted timeline. An in-depth Gantt chart has been documented in our development repository, and may be viewed for further details.</w:t>
+        <w:t xml:space="preserve">Above is an overview of the deliverables and development plan for FromTheFarm, colour coded bars align with individual activities, spread out across the team’s allotted timeline. An in-depth Gantt chart has been documented in our development </w:t>
+      </w:r>
+      <w:proofErr w:type="gramStart"/>
+      <w:r>
+        <w:rPr>
+          <w:rStyle w:val="SubtleEmphasis"/>
+          <w:i w:val="0"/>
+          <w:iCs w:val="0"/>
+          <w:color w:val="000000" w:themeColor="text1"/>
+        </w:rPr>
+        <w:t>repository, and</w:t>
+      </w:r>
+      <w:proofErr w:type="gramEnd"/>
+      <w:r>
+        <w:rPr>
+          <w:rStyle w:val="SubtleEmphasis"/>
+          <w:i w:val="0"/>
+          <w:iCs w:val="0"/>
+          <w:color w:val="000000" w:themeColor="text1"/>
+        </w:rPr>
+        <w:t xml:space="preserve"> may be viewed for further details.</w:t>
       </w:r>
     </w:p>
     <w:p>
@@ -11083,7 +12049,7 @@
         <w:pStyle w:val="Heading1"/>
         <w:spacing w:before="340" w:after="140" w:line="276" w:lineRule="auto"/>
       </w:pPr>
-      <w:bookmarkStart w:id="30" w:name="_Toc238458744"/>
+      <w:bookmarkStart w:id="30" w:name="_Toc238474747"/>
       <w:r>
         <w:lastRenderedPageBreak/>
         <w:t xml:space="preserve">9. </w:t>
@@ -11120,7 +12086,39 @@
         <w:spacing w:line="276" w:lineRule="auto"/>
       </w:pPr>
       <w:r>
-        <w:t>The table below scores Khula! Inputs &amp; Trader, Farmer's Market, and Farmsell against From The Farm across the same criteria used throughout the Competitive Analysis. Where direct testing was blocked (Farmer's Market's paywall) or a feature was simply never observed (Khula!'s testing, Farmsell's confirmed gaps), this is marked explicitly rather than assumed.</w:t>
+        <w:t xml:space="preserve">The table below scores Khula! Inputs &amp; Trader, Farmer's Market, and </w:t>
+      </w:r>
+      <w:proofErr w:type="spellStart"/>
+      <w:r>
+        <w:t>Farmsell</w:t>
+      </w:r>
+      <w:proofErr w:type="spellEnd"/>
+      <w:r>
+        <w:t xml:space="preserve"> against From </w:t>
+      </w:r>
+      <w:proofErr w:type="gramStart"/>
+      <w:r>
+        <w:t>The</w:t>
+      </w:r>
+      <w:proofErr w:type="gramEnd"/>
+      <w:r>
+        <w:t xml:space="preserve"> Farm across the same criteria used throughout the Competitive Analysis. Where direct testing was blocked (Farmer's Market's paywall) or a feature was simply never observed (</w:t>
+      </w:r>
+      <w:proofErr w:type="spellStart"/>
+      <w:r>
+        <w:t>Khula!'s</w:t>
+      </w:r>
+      <w:proofErr w:type="spellEnd"/>
+      <w:r>
+        <w:t xml:space="preserve"> testing, </w:t>
+      </w:r>
+      <w:proofErr w:type="spellStart"/>
+      <w:r>
+        <w:t>Farmsell's</w:t>
+      </w:r>
+      <w:proofErr w:type="spellEnd"/>
+      <w:r>
+        <w:t xml:space="preserve"> confirmed gaps), this is marked explicitly rather than assumed.</w:t>
       </w:r>
     </w:p>
     <w:tbl>
@@ -11211,6 +12209,7 @@
             <w:pPr>
               <w:spacing w:line="276" w:lineRule="auto"/>
             </w:pPr>
+            <w:proofErr w:type="spellStart"/>
             <w:r>
               <w:rPr>
                 <w:b/>
@@ -11218,6 +12217,7 @@
               </w:rPr>
               <w:t>Farmsell</w:t>
             </w:r>
+            <w:proofErr w:type="spellEnd"/>
           </w:p>
         </w:tc>
         <w:tc>
@@ -11400,7 +12400,15 @@
               <w:spacing w:line="276" w:lineRule="auto"/>
             </w:pPr>
             <w:r>
-              <w:t>Narrow, single purpose: proximity based farmer-to-buyer matching only</w:t>
+              <w:t xml:space="preserve">Narrow, single purpose: </w:t>
+            </w:r>
+            <w:proofErr w:type="gramStart"/>
+            <w:r>
+              <w:t>proximity based</w:t>
+            </w:r>
+            <w:proofErr w:type="gramEnd"/>
+            <w:r>
+              <w:t xml:space="preserve"> farmer-to-buyer matching only</w:t>
             </w:r>
           </w:p>
         </w:tc>
@@ -11919,7 +12927,15 @@
               <w:spacing w:line="276" w:lineRule="auto"/>
             </w:pPr>
             <w:r>
-              <w:t>MVVM; mature RecyclerView with partial Compose migration</w:t>
+              <w:t xml:space="preserve">MVVM; mature </w:t>
+            </w:r>
+            <w:proofErr w:type="spellStart"/>
+            <w:r>
+              <w:t>RecyclerView</w:t>
+            </w:r>
+            <w:proofErr w:type="spellEnd"/>
+            <w:r>
+              <w:t xml:space="preserve"> with partial Compose migration</w:t>
             </w:r>
           </w:p>
         </w:tc>
@@ -11932,8 +12948,21 @@
               <w:spacing w:line="276" w:lineRule="auto"/>
             </w:pPr>
             <w:r>
-              <w:t>MVVM (probable); XML layouts with ViewModel/LiveData</w:t>
-            </w:r>
+              <w:t xml:space="preserve">MVVM (probable); XML layouts with </w:t>
+            </w:r>
+            <w:proofErr w:type="spellStart"/>
+            <w:r>
+              <w:t>ViewModel</w:t>
+            </w:r>
+            <w:proofErr w:type="spellEnd"/>
+            <w:r>
+              <w:t>/</w:t>
+            </w:r>
+            <w:proofErr w:type="spellStart"/>
+            <w:r>
+              <w:t>LiveData</w:t>
+            </w:r>
+            <w:proofErr w:type="spellEnd"/>
           </w:p>
         </w:tc>
         <w:tc>
@@ -11945,8 +12974,13 @@
               <w:spacing w:line="276" w:lineRule="auto"/>
             </w:pPr>
             <w:r>
-              <w:t>MVVM (probable); Compose or advanced RecyclerView</w:t>
-            </w:r>
+              <w:t xml:space="preserve">MVVM (probable); Compose or advanced </w:t>
+            </w:r>
+            <w:proofErr w:type="spellStart"/>
+            <w:r>
+              <w:t>RecyclerView</w:t>
+            </w:r>
+            <w:proofErr w:type="spellEnd"/>
           </w:p>
         </w:tc>
         <w:tc>
@@ -11993,7 +13027,7 @@
         <w:pStyle w:val="Heading1"/>
         <w:spacing w:before="340" w:after="140" w:line="276" w:lineRule="auto"/>
       </w:pPr>
-      <w:bookmarkStart w:id="31" w:name="_Toc238458745"/>
+      <w:bookmarkStart w:id="31" w:name="_Toc238474748"/>
       <w:r>
         <w:lastRenderedPageBreak/>
         <w:t>10. Conclusion</w:t>
@@ -12005,7 +13039,15 @@
         <w:spacing w:line="276" w:lineRule="auto"/>
       </w:pPr>
       <w:r>
-        <w:t>This Planning and Design Document has translated the From The Farm concept into a complete technical blueprint ready for implementation in Part 2. The application's scope has been deliberately bounded throughout</w:t>
+        <w:t xml:space="preserve">This Planning and Design Document has translated the From </w:t>
+      </w:r>
+      <w:proofErr w:type="gramStart"/>
+      <w:r>
+        <w:t>The</w:t>
+      </w:r>
+      <w:proofErr w:type="gramEnd"/>
+      <w:r>
+        <w:t xml:space="preserve"> Farm concept into a complete technical blueprint ready for implementation in Part 2. The application's scope has been deliberately bounded throughout</w:t>
       </w:r>
       <w:r>
         <w:t>,</w:t>
@@ -12086,7 +13128,7 @@
         <w:pStyle w:val="Heading1"/>
         <w:spacing w:before="340" w:after="140" w:line="276" w:lineRule="auto"/>
       </w:pPr>
-      <w:bookmarkStart w:id="32" w:name="_Toc238458746"/>
+      <w:bookmarkStart w:id="32" w:name="_Toc238474749"/>
       <w:r>
         <w:lastRenderedPageBreak/>
         <w:t>1</w:t>
@@ -12101,15 +13143,21 @@
     </w:p>
     <w:p>
       <w:pPr>
-        <w:spacing w:after="120" w:line="276" w:lineRule="auto"/>
-      </w:pPr>
-      <w:r>
-        <w:rPr>
-          <w:b/>
-          <w:bCs/>
-        </w:rPr>
-        <w:t>UI and Navigation Design references (Zario)</w:t>
-      </w:r>
+        <w:pStyle w:val="Heading2"/>
+      </w:pPr>
+      <w:bookmarkStart w:id="33" w:name="_Toc238474750"/>
+      <w:r>
+        <w:t>UI and Navigation Design references (</w:t>
+      </w:r>
+      <w:proofErr w:type="spellStart"/>
+      <w:r>
+        <w:t>Zario</w:t>
+      </w:r>
+      <w:proofErr w:type="spellEnd"/>
+      <w:r>
+        <w:t>)</w:t>
+      </w:r>
+      <w:bookmarkEnd w:id="33"/>
     </w:p>
     <w:p>
       <w:pPr>
@@ -12291,13 +13339,47 @@
       <w:r>
         <w:t xml:space="preserve">Google Play, 2026. </w:t>
       </w:r>
+      <w:proofErr w:type="spellStart"/>
       <w:r>
         <w:rPr>
           <w:i/>
           <w:iCs/>
         </w:rPr>
-        <w:t>Farmsell: Buy&amp;Sell Agroproduce</w:t>
-      </w:r>
+        <w:t>Farmsell</w:t>
+      </w:r>
+      <w:proofErr w:type="spellEnd"/>
+      <w:r>
+        <w:rPr>
+          <w:i/>
+          <w:iCs/>
+        </w:rPr>
+        <w:t xml:space="preserve">: </w:t>
+      </w:r>
+      <w:proofErr w:type="spellStart"/>
+      <w:r>
+        <w:rPr>
+          <w:i/>
+          <w:iCs/>
+        </w:rPr>
+        <w:t>Buy&amp;Sell</w:t>
+      </w:r>
+      <w:proofErr w:type="spellEnd"/>
+      <w:r>
+        <w:rPr>
+          <w:i/>
+          <w:iCs/>
+        </w:rPr>
+        <w:t xml:space="preserve"> </w:t>
+      </w:r>
+      <w:proofErr w:type="spellStart"/>
+      <w:r>
+        <w:rPr>
+          <w:i/>
+          <w:iCs/>
+        </w:rPr>
+        <w:t>Agroproduce</w:t>
+      </w:r>
+      <w:proofErr w:type="spellEnd"/>
       <w:r>
         <w:t xml:space="preserve">. [App] Available at: </w:t>
       </w:r>
@@ -12467,11 +13549,159 @@
     </w:p>
     <w:p>
       <w:pPr>
-        <w:spacing w:line="276" w:lineRule="auto"/>
-      </w:pPr>
-    </w:p>
+        <w:pStyle w:val="Heading2"/>
+      </w:pPr>
+      <w:bookmarkStart w:id="34" w:name="_Toc238474751"/>
+      <w:r>
+        <w:lastRenderedPageBreak/>
+        <w:t>API and Architecture references (Kaehil)</w:t>
+      </w:r>
+      <w:bookmarkEnd w:id="34"/>
+    </w:p>
+    <w:p>
+      <w:r>
+        <w:t xml:space="preserve">AS Oasis, 2026. </w:t>
+      </w:r>
+      <w:r>
+        <w:rPr>
+          <w:i/>
+          <w:iCs/>
+        </w:rPr>
+        <w:t>Flutter Offline-First Architecture: A Practical Guide to Reliable, Fast</w:t>
+      </w:r>
+      <w:r>
+        <w:t xml:space="preserve">. [online] AS Oasis Tech. Available at: </w:t>
+      </w:r>
+      <w:hyperlink r:id="rId32" w:tgtFrame="_blank" w:history="1">
+        <w:r>
+          <w:rPr>
+            <w:rStyle w:val="Hyperlink"/>
+          </w:rPr>
+          <w:t>https://asoasis.tech/articles/2026-06-04-0838-flutter-offline-first-architecture-guide/</w:t>
+        </w:r>
+      </w:hyperlink>
+      <w:r>
+        <w:t xml:space="preserve"> [Accessed 2</w:t>
+      </w:r>
+      <w:r>
+        <w:t>2</w:t>
+      </w:r>
+      <w:r>
+        <w:t xml:space="preserve"> August 2026].</w:t>
+      </w:r>
+    </w:p>
+    <w:p>
+      <w:r>
+        <w:t xml:space="preserve">Earn4Insights, 2026. </w:t>
+      </w:r>
+      <w:r>
+        <w:rPr>
+          <w:i/>
+          <w:iCs/>
+        </w:rPr>
+        <w:t>How We Personalize Your Experience | Transparency</w:t>
+      </w:r>
+      <w:r>
+        <w:t xml:space="preserve">. [online] Earn4Insights. Available at: </w:t>
+      </w:r>
+      <w:hyperlink r:id="rId33" w:tgtFrame="_blank" w:history="1">
+        <w:r>
+          <w:rPr>
+            <w:rStyle w:val="Hyperlink"/>
+          </w:rPr>
+          <w:t>https://www.earn4insights.com/transparency</w:t>
+        </w:r>
+      </w:hyperlink>
+      <w:r>
+        <w:t xml:space="preserve"> [Accessed 2</w:t>
+      </w:r>
+      <w:r>
+        <w:t>2</w:t>
+      </w:r>
+      <w:r>
+        <w:t xml:space="preserve"> August 2026].</w:t>
+      </w:r>
+    </w:p>
+    <w:p>
+      <w:proofErr w:type="spellStart"/>
+      <w:r>
+        <w:t>Gravitee</w:t>
+      </w:r>
+      <w:proofErr w:type="spellEnd"/>
+      <w:r>
+        <w:t xml:space="preserve">, 2026. </w:t>
+      </w:r>
+      <w:r>
+        <w:rPr>
+          <w:i/>
+          <w:iCs/>
+        </w:rPr>
+        <w:t>OWASP API Security Top 10 Threats Solutions</w:t>
+      </w:r>
+      <w:r>
+        <w:t xml:space="preserve">. [online] </w:t>
+      </w:r>
+      <w:proofErr w:type="spellStart"/>
+      <w:r>
+        <w:t>Gravitee</w:t>
+      </w:r>
+      <w:proofErr w:type="spellEnd"/>
+      <w:r>
+        <w:t xml:space="preserve">. Available at: </w:t>
+      </w:r>
+      <w:hyperlink r:id="rId34" w:tgtFrame="_blank" w:history="1">
+        <w:r>
+          <w:rPr>
+            <w:rStyle w:val="Hyperlink"/>
+          </w:rPr>
+          <w:t>https://www.gravitee.io/owasp-top-10-api-security-threats</w:t>
+        </w:r>
+      </w:hyperlink>
+      <w:r>
+        <w:t xml:space="preserve"> [Accessed 2</w:t>
+      </w:r>
+      <w:r>
+        <w:t xml:space="preserve">2 </w:t>
+      </w:r>
+      <w:r>
+        <w:t>August 2026].</w:t>
+      </w:r>
+    </w:p>
+    <w:p>
+      <w:r>
+        <w:t xml:space="preserve">Mockingly, 2026. </w:t>
+      </w:r>
+      <w:r>
+        <w:rPr>
+          <w:i/>
+          <w:iCs/>
+        </w:rPr>
+        <w:t>Android Notes App System Design</w:t>
+      </w:r>
+      <w:r>
+        <w:t xml:space="preserve">. [online] Mockingly.ai. Available at: </w:t>
+      </w:r>
+      <w:hyperlink r:id="rId35" w:tgtFrame="_blank" w:history="1">
+        <w:r>
+          <w:rPr>
+            <w:rStyle w:val="Hyperlink"/>
+          </w:rPr>
+          <w:t>https://www.mockingly.ai/questions/android-notes-app-system-design</w:t>
+        </w:r>
+      </w:hyperlink>
+      <w:r>
+        <w:t xml:space="preserve"> [Accessed 2</w:t>
+      </w:r>
+      <w:r>
+        <w:t>2</w:t>
+      </w:r>
+      <w:r>
+        <w:t xml:space="preserve"> August 2026].</w:t>
+      </w:r>
+    </w:p>
+    <w:p/>
     <w:sectPr>
-      <w:footerReference w:type="default" r:id="rId32"/>
+      <w:footerReference w:type="default" r:id="rId36"/>
       <w:pgSz w:w="12240" w:h="15840"/>
       <w:pgMar w:top="1080" w:right="1080" w:bottom="1080" w:left="1080" w:header="708" w:footer="708" w:gutter="0"/>
       <w:pgNumType w:start="0"/>
@@ -14823,7 +16053,6 @@
   <w:style w:type="character" w:default="1" w:styleId="DefaultParagraphFont">
     <w:name w:val="Default Paragraph Font"/>
     <w:uiPriority w:val="1"/>
-    <w:semiHidden/>
     <w:unhideWhenUsed/>
   </w:style>
   <w:style w:type="table" w:default="1" w:styleId="TableNormal">
@@ -15134,6 +16363,18 @@
     <w:link w:val="Footer"/>
     <w:uiPriority w:val="99"/>
     <w:rsid w:val="0060528B"/>
+  </w:style>
+  <w:style w:type="character" w:styleId="UnresolvedMention">
+    <w:name w:val="Unresolved Mention"/>
+    <w:basedOn w:val="DefaultParagraphFont"/>
+    <w:uiPriority w:val="99"/>
+    <w:semiHidden/>
+    <w:unhideWhenUsed/>
+    <w:rsid w:val="00FF6DED"/>
+    <w:rPr>
+      <w:color w:val="605E5C"/>
+      <w:shd w:val="clear" w:color="auto" w:fill="E1DFDD"/>
+    </w:rPr>
   </w:style>
 </w:styles>
 </file>

</xml_diff>